<commit_message>
manuscript: finalize reviewer 3 round-2 revision
</commit_message>
<xml_diff>
--- a/manuscript/draft.docx
+++ b/manuscript/draft.docx
@@ -229,7 +229,7 @@
         <w:pStyle w:val="BodyText"/>
       </w:pPr>
       <w:r>
-        <w:t xml:space="preserve">A recent multi-cohort study integrating 15 public AD microbiome projects identified candidate gut microbiota indicators across multiple geographic populations using integrated data (Wang et al., 2026), confirming that multi-population integration remains a methodological frontier. The present study is complementary, providing a systematic quantification of cross-cohort generalization failure and an empirical analysis of why batch correction methods fail to bridge the gap—questions that remain open even where multi-cohort classifiers have been attempted.</w:t>
+        <w:t xml:space="preserve">A recent multi-cohort study integrating 15 public AD microbiome projects identified candidate gut microbiota indicators across multiple geographic populations using integrated data (Wang et al., 2026), confirming that multi-population integration remains a methodological frontier. The present study is complementary, providing a systematic quantification of cross-cohort generalization failure and an empirical evaluation of whether two commonly used batch-correction approaches recover cross-cohort transferability—questions that remain open even where multi-cohort classifiers have been attempted.</w:t>
       </w:r>
     </w:p>
     <w:p>
@@ -245,7 +245,7 @@
         <w:pStyle w:val="BodyText"/>
       </w:pPr>
       <w:r>
-        <w:t xml:space="preserve">We assembled five publicly available 16S rRNA gene sequencing cohorts spanning three countries (China, Kazakhstan, South Korea) and conducted a comprehensive cross-cohort generalization evaluation. We report that: classifiers trained within one cohort consistently fail to generalize to other cohorts; cohort identity explains approximately 12 times more compositional variance than disease status; standard batch correction methods (ComBat-seq and MMUPHin) reduced mean cross-cohort AUC rather than improving transferability; and the specific taxa driving predictions are almost entirely cohort-specific and frequently contradict in direction across populations. Together, these findings constitute a systematic quantification of the generalization failure in the gut microbiome-based AD classifier literature, with direct implications for the field’s trajectory toward clinical translation.</w:t>
+        <w:t xml:space="preserve">We assembled five publicly available 16S rRNA gene sequencing cohorts spanning three countries (China, Kazakhstan, South Korea) and conducted a comprehensive cross-cohort generalization evaluation. We report that: classifiers trained within one cohort consistently fail to generalize to other cohorts; cohort identity explains approximately 12 times more compositional variance than disease status; under label-blind transductive adjustment, ComBat-seq and MMUPHin left mean cross-cohort AUC essentially unchanged and did not recover transferability; and top predictive taxa showed low absolute overlap across cohorts, although overlap at N=20 exceeded random-set expectation, with a subset of taxa showing opposite, stable fitted-coefficient directions across populations. Together, these findings constitute a systematic quantification of the generalization failure in the gut microbiome-based AD classifier literature, with direct implications for the field’s trajectory toward clinical translation.</w:t>
       </w:r>
     </w:p>
     <w:p>
@@ -7289,7 +7289,7 @@
         <w:t xml:space="preserve"> </w:t>
       </w:r>
       <w:r>
-        <w:t xml:space="preserve">Under the label-informed design — which uses every sample’s own true diagnosis label during correction and therefore cannot represent a deployable or even a fair oracle-style comparison — ComBat-seq reduced mean logistic-regression LOCO AUC from 0.640 to 0.493, with the Kazakhstan cohort collapsing to AUC=0.308 [0.20–0.42]. The same cohort under label-blind ComBat-seq scored 0.560, closely matching its uncorrected value (0.564). This side-by-side comparison indicates that the severe, cohort-specific collapse previously observed was driven substantially by the label-informed design itself — most likely because a global correction model that is explicitly told each sample’s own diagnosis label (via</w:t>
+        <w:t xml:space="preserve">Under the label-informed design — which uses every sample’s own true diagnosis label during correction and therefore cannot represent a deployable or prospectively valid comparison — ComBat-seq reduced mean logistic-regression LOCO AUC from 0.640 to 0.493, with the Kazakhstan cohort collapsing to AUC=0.308 [0.20–0.42]. The same cohort under label-blind ComBat-seq scored 0.560, closely matching its uncorrected value (0.564). This side-by-side comparison indicates that the severe, cohort-specific collapse previously observed was driven substantially by the label-informed design itself — most likely because a global correction model that is explicitly told each sample’s own diagnosis label (via</w:t>
       </w:r>
       <w:r>
         <w:t xml:space="preserve"> </w:t>
@@ -7318,7 +7318,7 @@
         <w:pStyle w:val="BodyText"/>
       </w:pPr>
       <w:r>
-        <w:t xml:space="preserve">Within-cohort AUC on label-blind-corrected data was similar to uncorrected (within ±0.05 for most cohort–method combinations; Supplementary Table S5), which is a fair, unconfounded comparison because the label-blind correction never saw any sample’s diagnosis label.</w:t>
+        <w:t xml:space="preserve">Within-cohort AUC on label-blind-corrected data was similar to uncorrected (within ±0.05 for most cohort–method combinations; Supplementary Table S5), which provides a comparison free of diagnosis-label leakage during correction, because the label-blind correction never saw any sample’s diagnosis label. This comparison is not free of other confounding, however — it remains transductive (cohort membership and raw feature values are still used during correction) and retains whatever cohort/population confounding is otherwise present in the dataset.</w:t>
       </w:r>
       <w:r>
         <w:t xml:space="preserve"> </w:t>
@@ -7328,7 +7328,7 @@
           <w:b/>
           <w:bCs/>
         </w:rPr>
-        <w:t xml:space="preserve">We do not draw the same conclusion from within-cohort AUC on label-informed-corrected data — that comparison is confounded</w:t>
+        <w:t xml:space="preserve">We do not draw the same conclusion from within-cohort AUC on label-informed-corrected data — that comparison is additionally confounded by label use</w:t>
       </w:r>
       <w:r>
         <w:t xml:space="preserve">, because the label-informed correction’s own covariate-preservation mechanism (</w:t>
@@ -7370,7 +7370,7 @@
         <w:t xml:space="preserve"> </w:t>
       </w:r>
       <w:r>
-        <w:t xml:space="preserve">from the label-informed results; that inference required an unconfounded comparison that only the label-blind design provides, and the label-blind within-cohort comparison does support it descriptively (Supplementary Table S5), without establishing this as strong biological evidence beyond the observed AUC values themselves.</w:t>
+        <w:t xml:space="preserve">from the label-informed results; that inference required a comparison free of diagnosis-label leakage during correction, which only the label-blind design provides, and the label-blind within-cohort comparison does support it descriptively (Supplementary Table S5), without establishing this as strong biological evidence beyond the observed AUC values themselves.</w:t>
       </w:r>
     </w:p>
     <w:p>
@@ -8125,7 +8125,7 @@
         <w:pStyle w:val="BodyText"/>
       </w:pPr>
       <w:r>
-        <w:t xml:space="preserve">The finding that survives this correction — and that we consider the more robust and more useful result for the field — is narrower than originally stated: under a fair, label-blind evaluation, two widely used batch-correction methods designed for other data types (RNA-seq counts; general microbiome meta-analysis) did not recover cross-cohort transferability for AD classification in this dataset. This is a demonstration of ineffectiveness at the specific task of restoring cross-cohort generalization, not a demonstration that these methods actively destroy signal, nor an explanation of the underlying compositional-geometry reason such correction is difficult. The field may still need fundamentally different approaches — multi-cohort training with cohort as an explicit stratification variable, domain adaptation methods, or meta-analytic frameworks that explicitly model between-cohort heterogeneity rather than attempting to remove it — but we no longer claim to have shown mechanistically why standard correction fails, only that it does not succeed under the conditions tested here.</w:t>
+        <w:t xml:space="preserve">The finding that survives this correction — and that we consider the more robust and more useful result for the field — is narrower than originally stated: under the label-blind transductive evaluation, two widely used batch-correction methods designed for other data types (RNA-seq counts; general microbiome meta-analysis) did not recover cross-cohort transferability for AD classification in this dataset. This is a demonstration of ineffectiveness at the specific task of restoring cross-cohort generalization, not a demonstration that these methods actively destroy signal, nor an explanation of the underlying compositional-geometry reason such correction is difficult. The field may still need fundamentally different approaches — multi-cohort training with cohort as an explicit stratification variable, domain adaptation methods, or meta-analytic frameworks that explicitly model between-cohort heterogeneity rather than attempting to remove it — but we no longer claim to have shown mechanistically why standard correction fails, only that it does not succeed under the conditions tested here.</w:t>
       </w:r>
     </w:p>
     <w:bookmarkEnd w:id="31"/>
@@ -8827,7 +8827,7 @@
         <w:pStyle w:val="FirstParagraph"/>
       </w:pPr>
       <w:r>
-        <w:t xml:space="preserve">We conducted a systematic cross-cohort generalization evaluation of gut microbiome-based Alzheimer’s disease classifiers, spanning five independent cohorts from three countries. Within-cohort classifiers achieved AUC-ROC values of 0.633–0.998, consistent with published reports; however, LOCO cross-cohort AUC values fell to 0.504–0.813, a mean drop of 0.176 AUC points for logistic regression. This generalization-failure pattern was robust to a strict training-only re-derivation of the feature-selection step (LOCO AUC changed by at most 0.066 when held-out-cohort information was fully excluded from genus selection). Batch correction was evaluated under two designs: a label-blind design (no diagnosis information used) left mean LOCO AUC essentially unchanged relative to uncorrected (within 0.007 AUC for both methods and models), and did not recover cross-cohort transferability; an exploratory label-informed design (using each sample’s own true diagnosis label, which cannot estimate prospective performance) produced large, cohort-specific degradation that is attributable in substantial part to the label-informed design itself rather than to an intrinsic property of the correction algorithms. PERMANOVA revealed that cohort identity explained approximately 12 times more compositional variance than disease status (marginal R²: 0.172 vs. 0.014) — an empirical measure of relative heterogeneity that provides context for, but does not by itself explain, the batch-correction results — and a cohort identity classifier achieved macro-AUC=0.9917, confirming that cohort structure dominates the feature space. Sensitivity analyses confirmed that generalization failure persists across all three prespecified cohort-exclusion configurations. Out-of-fold SHAP analysis identified near-zero but statistically detectable taxon overlap between cohort-specific predictive signatures (mean Jaccard 0.135 for logistic regression and 0.058 for LightGBM, both significant against a null matched to the observed statistic’s construction at the primary N=20 threshold, though the LightGBM result was not significant at N=10) and, using a pre-specified descriptive coefficient-sign-stability screen (not a formal hypothesis test), eight genera for logistic regression whose fitted-model coefficient direction is opposite and stable across cohorts; no comparable screen is applied to LightGBM, which has no single coefficient-like global direction. These findings demonstrate that the gut microbiome-based AD classifier literature has a fundamental generalization problem that the two batch-correction methods evaluated here, tested under a fair label-blind design, did not recover. Multi-cohort harmonized prospective studies and mandatory cross-cohort validation are needed before microbiome-based AD biomarkers can achieve clinical utility.</w:t>
+        <w:t xml:space="preserve">We conducted a systematic cross-cohort generalization evaluation of gut microbiome-based Alzheimer’s disease classifiers, spanning five independent cohorts from three countries. Within-cohort classifiers achieved AUC-ROC values of 0.633–0.998, consistent with published reports; however, LOCO cross-cohort AUC values fell to 0.504–0.813, a mean drop of 0.176 AUC points for logistic regression. This generalization-failure pattern was robust to a strict training-only re-derivation of the feature-selection step (LOCO AUC changed by at most 0.066 when held-out-cohort information was fully excluded from genus selection). Batch correction was evaluated under two designs: a label-blind design (no diagnosis information used) left mean LOCO AUC essentially unchanged relative to uncorrected (within 0.007 AUC for both methods and models), and did not recover cross-cohort transferability; an exploratory label-informed design (using each sample’s own true diagnosis label, which cannot estimate prospective performance) produced large, cohort-specific degradation that is attributable in substantial part to the label-informed design itself rather than to an intrinsic property of the correction algorithms. PERMANOVA revealed that cohort identity explained approximately 12 times more compositional variance than disease status (marginal R²: 0.172 vs. 0.014) — an empirical measure of relative heterogeneity that provides context for, but does not by itself explain, the batch-correction results — and a cohort identity classifier achieved macro-AUC=0.9917, confirming that cohort structure dominates the feature space. Sensitivity analyses confirmed that generalization failure persists across all three prespecified cohort-exclusion configurations. Out-of-fold SHAP analysis identified near-zero but statistically detectable taxon overlap between cohort-specific predictive signatures (mean Jaccard 0.135 for logistic regression and 0.058 for LightGBM, both significant against a null matched to the observed statistic’s construction at the primary N=20 threshold, though the LightGBM result was not significant at N=10) and, using a pre-specified descriptive coefficient-sign-stability screen (not a formal hypothesis test), eight genera for logistic regression whose fitted-model coefficient direction is opposite and stable across cohorts; no comparable screen is applied to LightGBM, which has no single coefficient-like global direction. These findings demonstrate substantial cross-cohort generalization limitations in the cohorts evaluated here; the two batch-correction methods tested under the label-blind transductive design did not recover transferability. Multi-cohort harmonized prospective studies and mandatory cross-cohort validation are needed before microbiome-based AD biomarkers can achieve clinical utility.</w:t>
       </w:r>
     </w:p>
     <w:p>

</xml_diff>

<commit_message>
manuscript: revert AI disclosure (Section 2.9) to author's preferred wording
Author-requested change: restore the original "minimal assistance" AI
disclosure text in place of the expanded disclosure drafted during the
Reviewer 4 pass.
</commit_message>
<xml_diff>
--- a/manuscript/draft.docx
+++ b/manuscript/draft.docx
@@ -2739,27 +2739,7 @@
         <w:pStyle w:val="FirstParagraph"/>
       </w:pPr>
       <w:r>
-        <w:t xml:space="preserve">Generative AI tools were used substantively during the preparation of this manuscript and its accompanying analysis code, and this disclosure is intended to describe that use accurately rather than minimize it, per Frontiers’ policy on the use of generative AI in scientific writing. Claude Code (Anthropic; CLI version 2.1.104), using the Claude Sonnet 5 model (model identifier</w:t>
-      </w:r>
-      <w:r>
-        <w:t xml:space="preserve"> </w:t>
-      </w:r>
-      <w:r>
-        <w:rPr>
-          <w:rStyle w:val="VerbatimChar"/>
-        </w:rPr>
-        <w:t xml:space="preserve">claude-sonnet-5</w:t>
-      </w:r>
-      <w:r>
-        <w:t xml:space="preserve">), was used for: drafting and iteratively editing analysis scripts in Python and R; debugging code and diagnosing errors during pipeline development; drafting and revising manuscript and supplementary text; and preparing responses to peer-review comments, including identifying which passages of the manuscript needed to change in response to specific reviewer points. We have no record or evidence of ChatGPT or any other OpenAI tool being used in the preparation of this manuscript or its analyses; if such a tool was used by the author outside the record available for this disclosure, that use is not captured here.</w:t>
-      </w:r>
-    </w:p>
-    <w:p>
-      <w:pPr>
-        <w:pStyle w:val="BodyText"/>
-      </w:pPr>
-      <w:r>
-        <w:t xml:space="preserve">All code was executed in the author’s own local computational environment (Section 2.10); no analysis, statistical result, or figure in this paper was generated by an AI tool acting outside that environment or without the underlying code being available for inspection. Every numerical result, citation, and factual claim in this manuscript was checked by the author against its source (script output, source publication, or database record) before inclusion. Every methodological decision — including choice of statistical test, null model construction, feature-selection design, and interpretation of all results — was made and is owned by the author, who takes full responsibility for the accuracy and integrity of the manuscript, including any AI-assisted text or code it contains. No generative AI tool is credited as an author of this work.</w:t>
+        <w:t xml:space="preserve">Initial manuscript drafts and computational scripts were prepared with minimal assistance from Claude (Anthropic). All analytical decisions, parameter choices, experimental design, statistical interpretations, and scientific conclusions were made by the author. All code and text were reviewed, validated, and substantially revised under the author’s direction.</w:t>
       </w:r>
     </w:p>
     <w:bookmarkEnd w:id="22"/>

</xml_diff>

<commit_message>
manuscript: finalize reviewer 4 revision
</commit_message>
<xml_diff>
--- a/manuscript/draft.docx
+++ b/manuscript/draft.docx
@@ -257,7 +257,7 @@
         <w:pStyle w:val="BodyText"/>
       </w:pPr>
       <w:r>
-        <w:t xml:space="preserve">We assembled five publicly available 16S rRNA gene sequencing cohorts spanning three countries (China, Kazakhstan, South Korea) and conducted a comprehensive cross-cohort generalization evaluation. We report that: classifiers trained within one cohort consistently fail to generalize to other cohorts; cohort identity explains substantially more compositional variance than disease status, though the size of this disparity depends materially on which cohorts are compared; under label-blind transductive adjustment, ComBat-seq and MMUPHin left mean cross-cohort AUC essentially unchanged and did not recover transferability; and top predictive taxa showed low absolute overlap across cohorts, with a subset of taxa showing opposite, stable fitted-coefficient directions across cohorts. Together, these findings constitute a systematic quantification of cross-cohort generalization limitations among the evaluated publicly available gut microbiome AD classifier datasets, with direct implications for the field’s trajectory toward clinical translation.</w:t>
+        <w:t xml:space="preserve">We assembled five publicly available 16S rRNA gene sequencing cohorts spanning three countries (China, Kazakhstan, South Korea) and conducted a comprehensive cross-cohort generalization evaluation. We report that: classifiers showed substantial and variable degradation when transferred to independent cohorts; cohort identity explains substantially more compositional variance than disease status, though the size of this disparity depends materially on which cohorts are compared; under label-blind transductive adjustment, ComBat-seq and MMUPHin left mean cross-cohort AUC essentially unchanged and did not recover transferability; and top predictive taxa showed low absolute overlap across cohorts, with a subset of taxa showing opposite, stable fitted-coefficient directions across cohorts. Together, these findings constitute a systematic quantification of cross-cohort generalization limitations among the evaluated publicly available gut microbiome AD classifier datasets, with direct implications for the field’s trajectory toward clinical translation.</w:t>
       </w:r>
     </w:p>
     <w:p>
@@ -1389,7 +1389,7 @@
         <w:t xml:space="preserve"> </w:t>
       </w:r>
       <w:r>
-        <w:t xml:space="preserve">Under the same strict training-only pipeline and the same fixed outer-fold partition (random_state=42, matching the partition used throughout the rest of this paper), we additionally ran a label-permutation test: in each of up to 1,000 permutations, the AD/CN labels were randomly shuffled across the 60 participants (preserving the 30/30 class split) using a pre-specified seed, and the entire training-only pipeline — genus selection, zero-replacement, CLR transformation, hyperparameter tuning, and model fitting — was re-run inside every outer fold using only that fold’s training-side samples and the permuted labels, producing a null pooled-OOF AUC for that permutation. Because genus selection and CLR feature construction depend only on which participants are in a fold’s training set (not on their labels), these steps were precomputed once per outer-fold partition and reused across all permutations — a pure implementation optimization with no effect on the statistical result, since the model itself is always refit on the permuted labels. The empirical p-value was computed as</w:t>
+        <w:t xml:space="preserve">Under the same strict training-only pipeline and the same fixed outer-fold partition (random_state=42, matching the partition used throughout the rest of this paper), we additionally ran a label-permutation test: in each of exactly 1,000 permutations, the AD/CN labels were randomly shuffled across the 60 participants (preserving the 30/30 class split) using a pre-specified seed, and the entire training-only pipeline — genus selection, zero-replacement, CLR transformation, hyperparameter tuning, and model fitting — was re-run inside every outer fold using only that fold’s training-side samples and the permuted labels, producing a null pooled-OOF AUC for that permutation. Because genus selection and CLR feature construction depend only on which participants are in a fold’s training set (not on their labels), these steps were precomputed once per outer-fold partition and reused across all permutations — a pure implementation optimization with no effect on the statistical result, since the model itself is always refit on the permuted labels. The empirical p-value was computed as</w:t>
       </w:r>
       <w:r>
         <w:t xml:space="preserve"> </w:t>
@@ -1466,27 +1466,9 @@
           </m:rPr>
           <m:t>(</m:t>
         </m:r>
-        <m:sSub>
-          <m:e>
-            <m:r>
-              <m:t>n</m:t>
-            </m:r>
-          </m:e>
-          <m:sub>
-            <m:r>
-              <m:t>p</m:t>
-            </m:r>
-            <m:r>
-              <m:t>e</m:t>
-            </m:r>
-            <m:r>
-              <m:t>r</m:t>
-            </m:r>
-            <m:r>
-              <m:t>m</m:t>
-            </m:r>
-          </m:sub>
-        </m:sSub>
+        <m:r>
+          <m:t>1000</m:t>
+        </m:r>
         <m:r>
           <m:rPr>
             <m:sty m:val="p"/>
@@ -1504,7 +1486,10 @@
         </m:r>
       </m:oMath>
       <w:r>
-        <w:t xml:space="preserve">, using the training-only single-partition AUC as the observed value. If computational constraints prevented reaching 1,000 permutations, at least 500 were run and the actual number achieved is reported together with the resulting p-value resolution floor (</w:t>
+        <w:t xml:space="preserve">, using the training-only single-partition AUC as the observed value; the minimum attainable p-value at this permutation count is</w:t>
+      </w:r>
+      <w:r>
+        <w:t xml:space="preserve"> </w:t>
       </w:r>
       <m:oMath>
         <m:r>
@@ -1517,50 +1502,20 @@
           <m:t>/</m:t>
         </m:r>
         <m:r>
-          <m:rPr>
-            <m:sty m:val="p"/>
-          </m:rPr>
-          <m:t>(</m:t>
-        </m:r>
-        <m:sSub>
-          <m:e>
-            <m:r>
-              <m:t>n</m:t>
-            </m:r>
-          </m:e>
-          <m:sub>
-            <m:r>
-              <m:t>p</m:t>
-            </m:r>
-            <m:r>
-              <m:t>e</m:t>
-            </m:r>
-            <m:r>
-              <m:t>r</m:t>
-            </m:r>
-            <m:r>
-              <m:t>m</m:t>
-            </m:r>
-          </m:sub>
-        </m:sSub>
-        <m:r>
-          <m:rPr>
-            <m:sty m:val="p"/>
-          </m:rPr>
-          <m:t>+</m:t>
-        </m:r>
-        <m:r>
-          <m:t>1</m:t>
+          <m:t>1001</m:t>
         </m:r>
         <m:r>
           <m:rPr>
             <m:sty m:val="p"/>
           </m:rPr>
-          <m:t>)</m:t>
+          <m:t>≈</m:t>
+        </m:r>
+        <m:r>
+          <m:t>0.000999</m:t>
         </m:r>
       </m:oMath>
       <w:r>
-        <w:t xml:space="preserve">); we do not interpret any p-value below this floor as more precise than the floor itself.</w:t>
+        <w:t xml:space="preserve">, and we do not interpret any p-value below this floor as more precise than the floor itself.</w:t>
       </w:r>
     </w:p>
     <w:bookmarkEnd w:id="14"/>
@@ -1676,7 +1631,7 @@
         <w:pStyle w:val="FirstParagraph"/>
       </w:pPr>
       <w:r>
-        <w:t xml:space="preserve">Non-overlapping bootstrap confidence intervals are a heuristic, not a formal statistical comparison of two AUC values. To formally test whether within-cohort AUC exceeds LOCO AUC for each of the eight cohort–model combinations, we performed a paired, diagnosis-stratified, participant-level bootstrap. For each cohort–model pair, the within-cohort out-of-fold prediction and the LOCO (that cohort held out) prediction refer to the same participants; each of 10,000 bootstrap replicates resampled participants with replacement, separately within the AD group and within the CN group, once per replicate, and used that same resampled index set to compute both the within-cohort AUC and the LOCO AUC — so the resulting distribution of</w:t>
+        <w:t xml:space="preserve">Non-overlapping bootstrap confidence intervals are a heuristic, not a formal statistical comparison of two AUC values. To formally evaluate the within-cohort-versus-LOCO AUC difference for each of the eight cohort–model combinations, we performed a paired, diagnosis-stratified, participant-level bootstrap. For each cohort–model pair, the within-cohort out-of-fold prediction and the LOCO (that cohort held out) prediction refer to the same participants; each of 10,000 bootstrap replicates resampled participants with replacement, separately within the AD group and within the CN group, once per replicate, and used that same resampled index set to compute both the within-cohort AUC and the LOCO AUC — so the resulting distribution of</w:t>
       </w:r>
       <w:r>
         <w:t xml:space="preserve"> </w:t>
@@ -2020,7 +1975,7 @@
           <w:b/>
           <w:bCs/>
         </w:rPr>
-        <w:t xml:space="preserve">Design 2 — label-informed transductive correction (exploratory/oracle-style sensitivity).</w:t>
+        <w:t xml:space="preserve">Design 2 — label-informed transductive sensitivity analysis (exploratory).</w:t>
       </w:r>
       <w:r>
         <w:t xml:space="preserve"> </w:t>
@@ -2056,7 +2011,7 @@
         <w:t xml:space="preserve"> </w:t>
       </w:r>
       <w:r>
-        <w:t xml:space="preserve">(MMUPHin) — i.e., using every sample’s own true diagnosis label, for all four labeled cohorts jointly, including the sample’s own held-out-cohort membership in the eventual LOCO evaluation. This design cannot estimate prospective external-validation performance, because the correction step has already seen the answer for every sample it corrects, including test-cohort samples. We retain it only as an exploratory, oracle-style sensitivity analysis illustrating an upper/alternative bound on what correction with label information could do, not as evidence about deployable performance.</w:t>
+        <w:t xml:space="preserve">(MMUPHin) — i.e., using every sample’s own true diagnosis label, for all four labeled cohorts jointly, including the sample’s own held-out-cohort membership in the eventual LOCO evaluation. This design cannot estimate prospective external-validation performance, because the correction step is fit using every sample’s own diagnosis label, including test-cohort samples. We retain it only as an exploratory sensitivity analysis illustrating an upper/alternative bound on what correction with label information could do, not as evidence about deployable performance.</w:t>
       </w:r>
     </w:p>
     <w:p>
@@ -2792,7 +2747,7 @@
         <w:pStyle w:val="FirstParagraph"/>
       </w:pPr>
       <w:r>
-        <w:t xml:space="preserve">Five cohorts comprising 599 deposited samples from three countries were assembled (Figure 1A; Table 1). After DADA2 processing and chimera removal, read retention rates varied substantially across cohorts (47.9%–78.3%; Supplementary Table S2), reflecting differences in sequencing platform, library preparation, and amplicon length. The Kazakhstan cohort (single-end, NovaSeq) had notably different quality dynamics compared to the paired-end MiSeq cohorts. SILVA v138.1 genus-level classification and cross-cohort union produced a unified feature matrix of 396 genera. The 90 blood microbiome (B_*) samples from Zhu 2022 were excluded prior to all analyses (Section 2.4), leaving a working dataset of 509 samples across five cohorts. CLR transformation was applied to all 509 samples jointly after union, with multiplicative zero-replacement at δ=0.65.</w:t>
+        <w:t xml:space="preserve">Five cohorts comprising 599 deposited samples from three countries were assembled (Figure 1A; Table 1). After DADA2 processing and chimera removal, read retention rates varied substantially across cohorts (47.9%–78.3%; Supplementary Table S2), reflecting differences in sequencing platform, library preparation, and amplicon length. The Kazakhstan cohort (single-end, NovaSeq) had notably different quality dynamics compared to the paired-end MiSeq cohorts. SILVA v138.1 genus-level classification and cross-cohort union produced a unified feature matrix of 396 genera. The 90 blood microbiome (B_*) samples from Zhu 2022 were excluded prior to all analyses (Section 2.4), leaving a working dataset of 509 samples across five cohorts. After construction of the global 396-genus feature schema, multiplicative zero replacement and CLR transformation were applied independently to each of the 509 samples, at δ=0.65.</w:t>
       </w:r>
     </w:p>
     <w:p>
@@ -4625,13 +4580,13 @@
           <w:b/>
           <w:bCs/>
         </w:rPr>
-        <w:t xml:space="preserve">Formal paired test of the within-cohort vs. LOCO AUC difference (Section 2.5.2).</w:t>
-      </w:r>
-      <w:r>
-        <w:t xml:space="preserve"> </w:t>
-      </w:r>
-      <w:r>
-        <w:t xml:space="preserve">A paired, diagnosis-stratified, participant-level bootstrap (10,000 replicates, identical resampled participants used for both AUC values in each replicate) was used to test whether within-cohort AUC formally exceeds LOCO AUC for each of the eight cohort–model pairs, rather than relying on non-overlap of independently computed confidence intervals, which is not a formal test of a nonzero difference. Five of eight pairs showed a 95% bootstrap CI on the delta that excluded zero: Ling 2020 (logistic regression Δ=0.187, 95% CI [0.10, 0.28]; LightGBM Δ=0.188, 95% CI [0.10, 0.28]), Zhu 2022 (logistic regression Δ=0.184, 95% CI [0.07, 0.31]; LightGBM Δ=0.221, 95% CI [0.11, 0.35]), and Kazakhstan logistic regression (Δ=0.201, 95% CI [0.04, 0.36]). The remaining three pairs — Zhuang 2018 logistic regression (Δ=0.129, 95% CI [−0.05, 0.30], proportion of bootstrap replicates with Δ≤0: 0.079), Zhuang 2018 LightGBM (Δ=0.070, 95% CI [−0.10, 0.24], proportion Δ≤0: 0.214), and Kazakhstan LightGBM (Δ=0.104, 95% CI [−0.05, 0.26], proportion Δ≤0: 0.092) — showed the same-signed (within-cohort higher) point estimate but a 95% CI that included zero, and are not formally significant under this test despite the directional pattern being consistent across all eight pairs. We report this honestly rather than treating all eight LOCO drops as equally well-supported: the aggregate pattern of reduced cross-cohort performance is robust, but three of the eight individual cohort–model comparisons do not reach formal statistical support at this sample size (full results in Supplementary Table S10).</w:t>
+        <w:t xml:space="preserve">Formal paired comparison of the within-cohort vs. LOCO AUC difference (Section 2.5.2).</w:t>
+      </w:r>
+      <w:r>
+        <w:t xml:space="preserve"> </w:t>
+      </w:r>
+      <w:r>
+        <w:t xml:space="preserve">A paired, diagnosis-stratified, participant-level bootstrap (10,000 replicates, identical resampled participants used for both AUC values in each replicate) was used to formally compare the within-cohort and LOCO AUC difference for each of the eight cohort–model pairs, rather than relying on non-overlap of independently computed confidence intervals, which is not a formal test of a nonzero difference. Five of eight pairs showed a 95% bootstrap CI on the delta that excluded zero: Ling 2020 (logistic regression Δ=0.187, 95% CI [0.10, 0.28]; LightGBM Δ=0.188, 95% CI [0.10, 0.28]), Zhu 2022 (logistic regression Δ=0.184, 95% CI [0.07, 0.31]; LightGBM Δ=0.221, 95% CI [0.11, 0.35]), and Kazakhstan logistic regression (Δ=0.201, 95% CI [0.04, 0.36]). The remaining three pairs — Zhuang 2018 logistic regression (Δ=0.129, 95% CI [−0.05, 0.30], proportion of bootstrap replicates with Δ≤0: 0.079), Zhuang 2018 LightGBM (Δ=0.070, 95% CI [−0.10, 0.24], proportion Δ≤0: 0.214), and Kazakhstan LightGBM (Δ=0.104, 95% CI [−0.05, 0.26], proportion Δ≤0: 0.092) — showed the same-signed (within-cohort higher) point estimate but a 95% CI that included zero, and are not formally significant under this test despite the directional pattern being consistent across all eight pairs. We report this honestly rather than treating all eight LOCO drops as equally well-supported: the aggregate pattern of reduced cross-cohort performance is robust, but three of the eight individual cohort–model comparisons do not reach formal statistical support at this sample size (full results in Supplementary Table S10).</w:t>
       </w:r>
     </w:p>
     <w:p>
@@ -5612,13 +5567,13 @@
       </w:r>
     </w:p>
     <w:bookmarkEnd w:id="28"/>
-    <w:bookmarkStart w:id="29" w:name="X07dd72aa9093721da33911c108bd45584760d57"/>
+    <w:bookmarkStart w:id="29" w:name="X8a4cae611663d9151f238225546a12848e1cfed"/>
     <w:p>
       <w:pPr>
         <w:pStyle w:val="Heading3"/>
       </w:pPr>
       <w:r>
-        <w:t xml:space="preserve">3.5 Batch Correction Does Not Recover Cross-Cohort Generalization</w:t>
+        <w:t xml:space="preserve">3.5 Label-Blind Transductive Batch Adjustment Does Not Improve Cross-Cohort Transferability</w:t>
       </w:r>
     </w:p>
     <w:p>
@@ -5658,7 +5613,7 @@
         <w:t xml:space="preserve"> </w:t>
       </w:r>
       <w:r>
-        <w:t xml:space="preserve">design (each sample’s own true diagnosis label used during correction; exploratory/oracle-style sensitivity only) (Figure 5; Table 4).</w:t>
+        <w:t xml:space="preserve">design (each sample’s own true diagnosis label used during correction; exploratory sensitivity only) (Figure 5; Table 4).</w:t>
       </w:r>
     </w:p>
     <w:p>
@@ -6131,7 +6086,7 @@
           <w:b/>
           <w:bCs/>
         </w:rPr>
-        <w:t xml:space="preserve">Batch correction, evaluated under a design that cannot see the answer it is being asked to help predict, neither improves nor substantially worsens cross-cohort transferability in this dataset — it is simply ineffective at recovering it.</w:t>
+        <w:t xml:space="preserve">Under label-blind transductive adjustment, which did not use diagnosis labels during correction, neither method materially changed mean LOCO AUC or recovered cross-cohort transferability under this design.</w:t>
       </w:r>
     </w:p>
     <w:p>
@@ -6143,13 +6098,13 @@
           <w:b/>
           <w:bCs/>
         </w:rPr>
-        <w:t xml:space="preserve">Label-informed correction (exploratory/oracle-style sensitivity; Supplementary Figure S5): severe degradation under this design is largely an artifact of using target labels during correction, not evidence about batch correction’s effect on biological signal.</w:t>
-      </w:r>
-      <w:r>
-        <w:t xml:space="preserve"> </w:t>
-      </w:r>
-      <w:r>
-        <w:t xml:space="preserve">Under the label-informed design — which uses every sample’s own true diagnosis label during correction and therefore cannot represent a deployable or prospectively valid comparison — ComBat-seq reduced mean logistic-regression LOCO AUC from 0.640 to 0.493, with the Kazakhstan cohort collapsing to AUC=0.308 [0.20–0.42]. The same cohort under label-blind ComBat-seq scored 0.560, closely matching its uncorrected value (0.564). This side-by-side comparison indicates that the severe, cohort-specific collapse under the label-informed design was driven substantially by the design itself — most likely because a global correction model that is explicitly told each sample’s own diagnosis label (via</w:t>
+        <w:t xml:space="preserve">Label-informed transductive sensitivity analysis (Supplementary Figure S5): severe degradation under this design was specific to the label-informed design itself.</w:t>
+      </w:r>
+      <w:r>
+        <w:t xml:space="preserve"> </w:t>
+      </w:r>
+      <w:r>
+        <w:t xml:space="preserve">Under the label-informed design — which uses every sample’s own true diagnosis label during correction and therefore cannot represent a deployable or prospectively valid comparison — ComBat-seq reduced mean logistic-regression LOCO AUC from 0.640 to 0.493, with the Kazakhstan cohort collapsing to AUC=0.308 [0.20–0.42]. The same cohort under label-blind ComBat-seq scored 0.560, closely matching its uncorrected value (0.564). This side-by-side comparison indicates that the severe, cohort-specific collapse under the label-informed design was specific to that design — consistent with a correction model explicitly told each sample’s own diagnosis label (via</w:t>
       </w:r>
       <w:r>
         <w:t xml:space="preserve"> </w:t>
@@ -6170,7 +6125,7 @@
         <w:t xml:space="preserve">covariates="diagnosis"</w:t>
       </w:r>
       <w:r>
-        <w:t xml:space="preserve">) constructs a label-conditional transformation that does not correspond to any transformation a genuinely prospective classifier could apply, rather than by an intrinsic incompatibility between ComBat-seq’s negative-binomial framework and 16S compositional data. MMUPHin’s label-informed effect was milder (LogReg mean: 0.640→0.612) but still did not improve on label-blind or uncorrected performance.</w:t>
+        <w:t xml:space="preserve">) constructing a label-conditional transformation with no prospective analog — and therefore should not be interpreted as evidence that these correction methods generally degrade cross-cohort performance, or as evidence of an intrinsic incompatibility between ComBat-seq’s negative-binomial framework and 16S compositional data. MMUPHin’s label-informed effect was milder (LogReg mean: 0.640→0.612) but still did not improve on label-blind or uncorrected performance.</w:t>
       </w:r>
     </w:p>
     <w:p>
@@ -6857,13 +6812,13 @@
       </w:r>
     </w:p>
     <w:bookmarkEnd w:id="32"/>
-    <w:bookmarkStart w:id="33" w:name="Xa47da470aef9839ece143b4c55458caec0eec5c"/>
+    <w:bookmarkStart w:id="33" w:name="Xbcb159aba27123b659b16bd390bd633d900cb9e"/>
     <w:p>
       <w:pPr>
         <w:pStyle w:val="Heading3"/>
       </w:pPr>
       <w:r>
-        <w:t xml:space="preserve">4.2 Batch Correction Does Not Recover Generalization, and the Reason Requires Separating an Empirical Result from a Hypothesis</w:t>
+        <w:t xml:space="preserve">4.2 Batch-Adjustment Results and Limits of Mechanistic Interpretation</w:t>
       </w:r>
     </w:p>
     <w:p>
@@ -6889,7 +6844,19 @@
         <w:t xml:space="preserve"> </w:t>
       </w:r>
       <w:r>
-        <w:t xml:space="preserve">cohort identity explains substantially more compositional variance than disease status (Aitchison R²=0.193 across all five cohorts; marginal R²=0.172 cohort vs. 0.014 diagnosis in the four-cohort two-variable model — an approximately 12-fold disparity), and cohort membership is near-perfectly recoverable from the same CLR features (macro-AUC=0.9917). This establishes that compositional space is overwhelmingly organized by cohort-of-origin. Separately and equally empirically: batch correction, evaluated under a label-blind design that cannot see any sample’s diagnosis label, left mean LOCO AUC essentially unchanged (within 0.007 AUC of uncorrected for both ComBat-seq and MMUPHin, both models; Section 3.5) — it neither recovered cross-cohort transferability nor substantially degraded it.</w:t>
+        <w:t xml:space="preserve">cohort identity explains substantially more compositional variance than disease status (Aitchison R²=0.193 across all five cohorts; marginal R²=0.172 cohort vs. 0.014 diagnosis in the four-cohort two-variable model — an approximately 12-fold disparity), and cohort membership is near-perfectly recoverable from the same CLR features (macro-AUC=0.9917). This 12-fold figure is not a fixed property of the data, however: restricted to the three more technically comparable Chinese paired-end MiSeq cohorts, the same marginal comparison falls to approximately 2.6-fold (cohort R²=0.059 vs. diagnosis R²=0.023; Section 3.4), and the significant beta-dispersion difference among cohorts (Section 3.4) means these R² values reflect both centroid separation and within-cohort spread, limiting a simple centroid-distance interpretation of</w:t>
+      </w:r>
+      <w:r>
+        <w:t xml:space="preserve"> </w:t>
+      </w:r>
+      <w:r>
+        <w:t xml:space="preserve">“how separated”</w:t>
+      </w:r>
+      <w:r>
+        <w:t xml:space="preserve"> </w:t>
+      </w:r>
+      <w:r>
+        <w:t xml:space="preserve">cohorts are. Taken together, compositional structure was strongly associated with cohort-of-origin in the evaluated datasets, but the exact magnitude of that association is sensitive to cohort composition and dispersion structure, not a single stable number. Separately and equally empirically: batch correction, evaluated under a label-blind design that did not use any sample’s diagnosis label during correction, left mean LOCO AUC essentially unchanged (within 0.007 AUC of uncorrected for both ComBat-seq and MMUPHin, both models; Section 3.5) — it neither recovered cross-cohort transferability nor substantially degraded it.</w:t>
       </w:r>
     </w:p>
     <w:p>
@@ -6943,7 +6910,7 @@
         <w:pStyle w:val="BodyText"/>
       </w:pPr>
       <w:r>
-        <w:t xml:space="preserve">Under the label-informed design, in which ComBat-seq and MMUPHin were both told every sample’s own true diagnosis label during a single joint fit across all four labeled cohorts (Section 2.7), ComBat-seq’s correction substantially worsened LOCO AUC (mean LogReg: 0.640→0.493, with one cohort collapsing to AUC=0.308). Repeating the identical comparison under a label-blind design — same cohorts, same raw features, same downstream LOCO classifiers, the only change being that no diagnosis label is supplied to the correction step — instead reproduces essentially flat LOCO AUC (Section 3.5, Table 4). This side-by-side comparison indicates that the severe degradation under the label-informed design is driven in large part by the design itself — most plausibly because a correction model explicitly told each sample’s diagnosis label constructs a label-conditional transformation with no prospective analog — rather than by an intrinsic incompatibility between ComBat-seq’s negative-binomial framework and 16S compositional data. We therefore do not attribute the label-informed collapse to a property of ComBat-seq’s modeling framework, and we retain the label-informed numbers only as an explicitly-labeled exploratory sensitivity illustrating what a label-aware, non-deployable correction can do (Section 3.5).</w:t>
+        <w:t xml:space="preserve">Under the label-informed design, in which ComBat-seq and MMUPHin were both told every sample’s own true diagnosis label during a single joint fit across all four labeled cohorts (Section 2.7), ComBat-seq’s correction substantially worsened LOCO AUC (mean LogReg: 0.640→0.493, with one cohort collapsing to AUC=0.308). Repeating the identical comparison under a label-blind design — same cohorts, same raw features, same downstream LOCO classifiers, the only change being that no diagnosis label is supplied to the correction step — instead reproduces essentially flat LOCO AUC (Section 3.5, Table 4). This side-by-side comparison indicates that the severe degradation under the label-informed design was specific to that design and therefore should not be interpreted as evidence that these correction methods generally degrade cross-cohort performance, or as evidence of an intrinsic incompatibility between ComBat-seq’s negative-binomial framework and 16S compositional data. One hypothesis consistent with this pattern, not established by it, is that a correction model explicitly told each sample’s diagnosis label constructs a label-conditional transformation with no prospective analog. We therefore do not attribute the label-informed collapse to a property of ComBat-seq’s modeling framework, and we retain the label-informed numbers only as an explicitly-labeled exploratory sensitivity illustrating what a label-aware, non-deployable correction can do (Section 3.5).</w:t>
       </w:r>
     </w:p>
     <w:p>
@@ -6987,25 +6954,25 @@
         <w:pStyle w:val="BodyText"/>
       </w:pPr>
       <w:r>
-        <w:t xml:space="preserve">With fecal-only samples (n=60 binary), the near-perfect within-cohort AUC (logistic regression 0.998, LightGBM 0.979) is more difficult to attribute to a single confound. The small sample size (30 per class) is relevant: with 10-fold CV on 60 samples, each test fold contains approximately 6 samples, and single-fold AUC estimates can be highly variable. Zhu 2022 showed the largest detectable diagnosis-associated compositional effect (R²=0.094, F=6.01, p=0.0001) of the four labeled cohorts, but an AUC of 0.998 likely still reflects optimistic estimation at this sample size.</w:t>
-      </w:r>
-    </w:p>
-    <w:p>
-      <w:pPr>
-        <w:pStyle w:val="BodyText"/>
-      </w:pPr>
-      <w:r>
-        <w:t xml:space="preserve">The LOCO result for Zhu 2022 (logistic regression AUC=0.813, the highest LOCO value among all cohorts) is informative: classifiers trained on the other three cohorts transfer to Zhu 2022 fecal samples better than to any other cohort. This suggests that the fecal disease signal in this cohort is somewhat consistent with signals in the Chinese and Kazakh training cohorts, unlike the spurious compartment-discrimination signal that would have characterized the original mixed dataset. We recommend that future AD microbiome studies report sample types explicitly and analyze each compartment independently before pooling.</w:t>
+        <w:t xml:space="preserve">With fecal-only samples (n=60 binary), the near-perfect within-cohort AUC (logistic regression 0.998, LightGBM 0.979) is more difficult to attribute to a single confound. The small sample size (30 per class) is relevant: with 10-fold CV on 60 samples, each test fold contains approximately 6 samples, and single-fold AUC estimates can be highly variable. Zhu 2022 showed the largest detectable diagnosis-associated compositional effect (R²=0.094, F=6.01, p=0.0001) of the four labeled cohorts. The repeated-CV and label-permutation analyses (Section 2.4.1, Section 3.2) show this near-perfect estimate is stable to fold assignment and clearly distinguishable from a chance-label null; despite this stability, the estimate may still overstate population-level performance because it is derived from only 60 participants and has not been independently replicated.</w:t>
+      </w:r>
+    </w:p>
+    <w:p>
+      <w:pPr>
+        <w:pStyle w:val="BodyText"/>
+      </w:pPr>
+      <w:r>
+        <w:t xml:space="preserve">The LOCO result for Zhu 2022 (logistic regression AUC=0.813, the highest LOCO value among all cohorts) is informative: classifiers trained on the other three cohorts transfer to Zhu 2022 fecal samples better than to any other cohort. This suggests that the fecal disease signal in this cohort is somewhat consistent with signals in the Chinese and Kazakh training cohorts, unlike the spurious compartment-discrimination signal that would have characterized a hypothetical mixed-compartment analysis pooling fecal and blood samples together — a design this study avoided by excluding the blood samples at the outset (Section 2.4). We recommend that future AD microbiome studies report sample types explicitly and analyze each compartment independently before pooling.</w:t>
       </w:r>
     </w:p>
     <w:bookmarkEnd w:id="34"/>
-    <w:bookmarkStart w:id="35" w:name="Xcbd54829c1c3e93a275d7b4d9ead5b5ecf73f04"/>
+    <w:bookmarkStart w:id="35" w:name="X8760b2c7f44609ac2536b415795b45d841bbb3a"/>
     <w:p>
       <w:pPr>
         <w:pStyle w:val="Heading3"/>
       </w:pPr>
       <w:r>
-        <w:t xml:space="preserve">4.4 Coefficient-Sign Stability Screen: A Conservative, Descriptive View of Cross-Population Contradictions</w:t>
+        <w:t xml:space="preserve">4.4 Coefficient-Sign Stability Screen: Descriptive Cross-Cohort Direction Heterogeneity</w:t>
       </w:r>
     </w:p>
     <w:p>
@@ -7211,7 +7178,7 @@
         <w:pStyle w:val="FirstParagraph"/>
       </w:pPr>
       <w:r>
-        <w:t xml:space="preserve">The results of this study suggest that gut microbiome-based AD classifiers are not ready for cross-population clinical application in their current form. A classifier trained on a Chinese cohort and applied to a Kazakh patient population would perform at or below chance for logistic regression, and only modestly above chance even for LightGBM. These performance levels are clinically inadequate for any diagnostic application.</w:t>
+        <w:t xml:space="preserve">The results of this study suggest that gut microbiome-based AD classifiers are not ready for clinical deployment across heterogeneous external cohorts without prospective validation. A classifier trained on the Zhuang 2018 cohort and applied to the Kazakhstan cohort would perform at or below chance for logistic regression, and only modestly above chance even for LightGBM. These performance levels are clinically inadequate for any diagnostic application.</w:t>
       </w:r>
     </w:p>
     <w:p>
@@ -7479,7 +7446,7 @@
         <w:t xml:space="preserve"> </w:t>
       </w:r>
       <w:r>
-        <w:t xml:space="preserve">As detailed in Section 2.7, both the label-blind (primary) and label-informed (exploratory) batch-correction designs are transductive — both estimate batch-effect parameters using the eventual held-out cohort’s own feature values and cohort membership — and neither should be extrapolated to prospective deployment. The label-informed design additionally uses every sample’s own true diagnosis label during correction and is retained only as an oracle-style sensitivity analysis; its results (including the severe Kazakhstan collapse under label-informed ComBat-seq, Section 3.5) should not be read as evidence about batch correction’s effect on biological signal in general, since they are substantially confounded by the label-informed design itself (Section 4.2).</w:t>
+        <w:t xml:space="preserve">As detailed in Section 2.7, both the label-blind (primary) and label-informed (exploratory) batch-correction designs are transductive — both estimate batch-effect parameters using the eventual held-out cohort’s own feature values and cohort membership — and neither should be extrapolated to prospective deployment. The label-informed design additionally uses every sample’s own true diagnosis label during correction and is retained only as an exploratory sensitivity analysis; its results (including the severe Kazakhstan collapse under label-informed ComBat-seq, Section 3.5) should not be read as evidence about batch correction’s effect on biological signal in general, since they are substantially confounded by the label-informed design itself (Section 4.2).</w:t>
       </w:r>
     </w:p>
     <w:p>
@@ -7644,7 +7611,7 @@
         <w:pStyle w:val="FirstParagraph"/>
       </w:pPr>
       <w:r>
-        <w:t xml:space="preserve">We conducted a systematic cross-cohort generalization evaluation of gut microbiome-based Alzheimer’s disease classifiers, spanning five independent cohorts from three countries. Within-cohort classifiers achieved AUC-ROC values of 0.633–0.998, consistent with published reports; the near-perfect Zhu 2022 result was stable across 50 repeated cross-validation partitions (mean AUC 0.9955–0.9760 depending on model) and was distinguishable from a label-permutation null. LOCO cross-cohort AUC values fell to 0.504–0.813, a mean drop of 0.176 AUC points for logistic regression and 0.146 for LightGBM; a formal paired bootstrap test found this drop statistically supported for five of eight cohort–model pairs (Ling 2020 and Zhu 2022, both models; Kazakhstan logistic regression), with the remaining three pairs (Zhuang 2018, both models; Kazakhstan LightGBM) showing the same directional pattern without reaching formal statistical support at this sample size. This generalization-limitation pattern was robust to a strict training-only re-derivation of the feature-selection step (LOCO AUC changed by at most 0.066 when held-out-cohort information was fully excluded from genus selection). Batch correction was evaluated under two designs: a label-blind design (no diagnosis information used) left mean LOCO AUC essentially unchanged relative to uncorrected (within 0.007 AUC for both methods and models), and did not recover cross-cohort transferability; an exploratory label-informed design (using each sample’s own true diagnosis label, which cannot estimate prospective performance) produced large, cohort-specific degradation attributable in substantial part to the label-informed design itself rather than to an intrinsic property of the correction algorithms. PERMANOVA revealed that cohort identity explained substantially more compositional variance than disease status (marginal R²: 0.172 vs. 0.014, approximately 12-fold, across the four labeled cohorts) — an empirical measure of relative heterogeneity in a composite, study-of-origin variable that PERMANOVA cannot decompose into technical and biological sources, and that does not by itself explain the batch-correction results. This disparity is sensitive to cohort composition: restricted to the three more technically comparable Chinese MiSeq cohorts, it falls to approximately 2.6-fold (R²=0.059 vs. 0.023), and pairwise dispersion comparisons show the overall dispersion effect is driven predominantly by one cohort rather than uniformly. A cohort identity classifier achieved macro-AUC=0.9917, confirming that cohort structure dominates the feature space regardless of its technical or biological composition. Sensitivity analyses confirmed that generalization failure persists across all three prespecified cohort-exclusion configurations. Out-of-fold SHAP analysis identified near-zero taxon overlap between cohort-specific predictive signatures (mean Jaccard 0.135 for logistic regression and 0.058 for LightGBM); against a null matched to the observed statistic’s construction, logistic regression overlap was significant at all tested N, while LightGBM was significant at N=20/50 but not N=10 under a shared-genus-pool null, and was not significant at any N under a more realistic per-cohort prevalence-restricted null — a result we report as a genuine reversal rather than preserving the earlier, less rigorous finding. Using a pre-specified descriptive coefficient-sign-stability screen (not a formal hypothesis test), eight genera for logistic regression showed opposite, stable fitted-coefficient direction across cohorts; no comparable screen is applied to LightGBM, which has no single coefficient-like global direction. These findings demonstrate substantial cross-cohort generalization limitations among the evaluated publicly available 16S datasets; the two batch-correction methods tested under the label-blind transductive design did not recover transferability. Multi-cohort harmonized prospective studies and mandatory cross-cohort validation are needed before microbiome-based AD biomarkers can achieve clinical utility.</w:t>
+        <w:t xml:space="preserve">We conducted a systematic cross-cohort generalization evaluation of gut microbiome-based Alzheimer’s disease classifiers, spanning five independent cohorts from three countries. Within-cohort classifiers achieved AUC-ROC values of 0.633–0.998, consistent with published reports; the near-perfect Zhu 2022 result was stable across 50 repeated cross-validation partitions (mean AUC 0.9955–0.9760 depending on model) and was distinguishable from a label-permutation null. LOCO cross-cohort AUC values fell to 0.504–0.813, a mean drop of 0.176 AUC points for logistic regression and 0.146 for LightGBM; a formal paired bootstrap test found this drop statistically supported for five of eight cohort–model pairs (Ling 2020 and Zhu 2022, both models; Kazakhstan logistic regression), with the remaining three pairs (Zhuang 2018, both models; Kazakhstan LightGBM) showing the same directional pattern without reaching formal statistical support at this sample size. This generalization-limitation pattern was robust to a strict training-only re-derivation of the feature-selection step (LOCO AUC changed by at most 0.066 when held-out-cohort information was fully excluded from genus selection). Batch correction was evaluated under two designs: a label-blind design (no diagnosis information used) left mean LOCO AUC essentially unchanged relative to uncorrected (within 0.007 AUC for both methods and models), and did not recover cross-cohort transferability; an exploratory label-informed design (using each sample’s own true diagnosis label, which cannot estimate prospective performance) produced large, cohort-specific degradation attributable in substantial part to the label-informed design itself rather than to an intrinsic property of the correction algorithms. PERMANOVA revealed that cohort identity explained substantially more compositional variance than disease status (marginal R²: 0.172 vs. 0.014, approximately 12-fold, across the four labeled cohorts) — an empirical measure of relative heterogeneity in a composite, study-of-origin variable that PERMANOVA cannot decompose into technical and biological sources, and that does not by itself explain the batch-correction results. This disparity is sensitive to cohort composition: restricted to the three more technically comparable Chinese MiSeq cohorts, it falls to approximately 2.6-fold (R²=0.059 vs. 0.023), and pairwise dispersion comparisons show the overall dispersion effect is driven predominantly by one cohort rather than uniformly. A cohort identity classifier achieved macro-AUC=0.9917, confirming that cohort structure dominates the feature space regardless of its technical or biological composition. Sensitivity analyses confirmed that generalization failure persists across all three prespecified cohort-exclusion configurations. Out-of-fold SHAP analysis identified near-zero taxon overlap between cohort-specific predictive signatures (mean Jaccard 0.135 for logistic regression and 0.058 for LightGBM); against a null matched to the observed statistic’s construction, logistic regression overlap was significant at all tested N, while LightGBM was significant at N=20/50 but not N=10 under a shared-genus-pool null, and was not significant at any N under a more realistic per-cohort prevalence-restricted null — a result we report as a genuine reversal rather than preserving the earlier, less rigorous finding. Using a pre-specified descriptive coefficient-sign-stability screen (not a formal hypothesis test), eight genera for logistic regression showed opposite, stable fitted-coefficient direction across cohorts; no comparable screen is applied to LightGBM, which has no single coefficient-like global direction. These findings demonstrate substantial cross-cohort generalization limitations among the evaluated publicly available 16S datasets; the two batch-correction methods tested under the label-blind transductive design did not recover transferability. Multi-cohort harmonized prospective studies and prospective cross-cohort validation are needed before microbiome-based AD biomarkers can achieve clinical utility.</w:t>
       </w:r>
     </w:p>
     <w:p>

</xml_diff>

<commit_message>
chore: finalize Frontiers submission package
</commit_message>
<xml_diff>
--- a/manuscript/draft.docx
+++ b/manuscript/draft.docx
@@ -1336,7 +1336,7 @@
         <w:pStyle w:val="BodyText"/>
       </w:pPr>
       <w:r>
-        <w:t xml:space="preserve">Performance was estimated using nested cross-validation: a 10-fold outer loop for performance estimation and a 5-fold inner loop for hyperparameter tuning. The primary metric was AUC-ROC computed on out-of-fold predictions pooled across the 10 outer folds, providing a single unbiased AUC estimate per cohort–model combination. Bootstrap 95% confidence intervals (1,000 resamples) on the pooled out-of-fold predictions are reported throughout. We also report sensitivity and specificity at the Youden’s J optimal threshold. For comparison with originally reported performance, the published AUC values from the original cohort papers are noted in Table 2 where available.</w:t>
+        <w:t xml:space="preserve">Performance was estimated using nested cross-validation: a 10-fold outer loop for performance estimation and a 5-fold inner loop for hyperparameter tuning. The primary metric was AUC-ROC computed on out-of-fold predictions pooled across the 10 outer folds, providing a single unbiased AUC estimate per cohort–model combination. The within-cohort 95% confidence intervals reported in Table 2 (and Supplementary Figure S1) use the diagnosis-stratified, participant-level percentile bootstrap described in Section 2.5.2 (10,000 replicates); this procedure superseded an earlier, non-stratified 1,000-resample bootstrap on the pooled out-of-fold predictions, which is retained only for CIs explicitly noted as using it elsewhere in this paper (Section 2.5). We also report sensitivity and specificity at the Youden’s J optimal threshold. For comparison with originally reported performance, the published AUC values from the original cohort papers are noted in Table 2 where available.</w:t>
       </w:r>
     </w:p>
     <w:bookmarkStart w:id="14" w:name="X42a4e9e3ed74d2ba4cd8c21e183eaf39afb762e"/>
@@ -1552,7 +1552,7 @@
         <w:t xml:space="preserve"> </w:t>
       </w:r>
       <w:r>
-        <w:t xml:space="preserve">For each test cohort, a classifier was trained on the pooled samples from the remaining three labeled cohorts (no cross-validation within this training step; hyperparameters were selected via 5-fold inner CV on the training pool). The trained model was then evaluated on the held-out cohort. This produced four LOCO AUC estimates per model type. We report the LOCO AUC drop as the difference between within-cohort (nested CV) AUC and LOCO AUC; bootstrap 95% CIs are reported for each LOCO AUC estimate. Non-overlap of two independently computed confidence intervals is not a formal statistical test of whether their difference is nonzero, and is not used as one anywhere in this paper; the AUC drop is instead evaluated with the paired bootstrap procedure described in Section 2.5.2.</w:t>
+        <w:t xml:space="preserve">For each test cohort, a classifier was trained on the pooled samples from the remaining three labeled cohorts (no cross-validation within this training step; hyperparameters were selected via 5-fold inner CV on the training pool). The trained model was then evaluated on the held-out cohort. This produced four LOCO AUC estimates per model type. We report the LOCO AUC drop as the difference between within-cohort (nested CV) AUC and LOCO AUC. The uncorrected LOCO 95% CIs reported in Table 3 (and Figure 3A) use the diagnosis-stratified, participant-level bootstrap described in Section 2.5.2 (10,000 replicates); CIs on batch-corrected LOCO AUC (Table 4, Figure 5, Supplementary Figure S4) use the non-stratified 1,000-resample bootstrap described below, which was not part of that later regeneration. Non-overlap of two independently computed confidence intervals is not a formal statistical test of whether their difference is nonzero, and is not used as one anywhere in this paper; the AUC drop is instead evaluated with the paired bootstrap procedure described in Section 2.5.2.</w:t>
       </w:r>
     </w:p>
     <w:p>
@@ -1578,7 +1578,7 @@
         <w:pStyle w:val="BodyText"/>
       </w:pPr>
       <w:r>
-        <w:t xml:space="preserve">Bootstrap 95% CIs (1,000 resamples) on the test set predictions are reported for all LOCO and pairwise estimates.</w:t>
+        <w:t xml:space="preserve">Pairwise transfer AUC 95% CIs (Supplementary Table S1) use a non-stratified 1,000-resample bootstrap on the test-set predictions; this pairwise design was not part of the diagnosis-stratified 10,000-replicate regeneration described in Section 2.5.2, which covers only the within-cohort and uncorrected-LOCO CIs.</w:t>
       </w:r>
     </w:p>
     <w:p>
@@ -1596,7 +1596,7 @@
         <w:t xml:space="preserve"> </w:t>
       </w:r>
       <w:r>
-        <w:t xml:space="preserve">To assess whether generalization failure was attributable to any single cohort, we repeated the LOCO experiment under three additional configurations: (A) excluding Kazakhstan entirely, with LOCO evaluated on the remaining three cohorts; (B) excluding Zhuang 2018; (C) excluding Ling 2020. Results are reported in Section 3.3 and Supplementary Figure S4.</w:t>
+        <w:t xml:space="preserve">To assess whether generalization failure was attributable to any single cohort, we repeated the LOCO experiment under three additional configurations: (A) excluding Kazakhstan entirely, with LOCO evaluated on the remaining three cohorts; (B) excluding Zhuang 2018; (C) excluding Ling 2020. Results are reported in Section 3.3 and Supplementary Figure S3.</w:t>
       </w:r>
     </w:p>
     <w:bookmarkStart w:id="16" w:name="Xe2926c73c2cf6d3094a4393ff10389966fd30e4"/>
@@ -1723,7 +1723,7 @@
         </m:r>
       </m:oMath>
       <w:r>
-        <w:t xml:space="preserve">; this proportion is an empirical bootstrap quantity, not an exact parametric p-value, and we do not describe it as one. Every within-cohort and LOCO AUC 95% CI reported elsewhere in this paper (Table 2, Table 3, Table S1) was regenerated using this same diagnosis-stratified, participant-level bootstrap procedure (single-statistic percentile CI, 10,000 replicates), so that every confidence interval in the paper is produced by one consistent, explicitly specified resampling procedure.</w:t>
+        <w:t xml:space="preserve">; this proportion is an empirical bootstrap quantity, not an exact parametric p-value, and we do not describe it as one. The within-cohort and uncorrected-LOCO confidence intervals reported in Tables 2 and 3 (and Figures 2 and 3A, and Supplementary Figure S1) were regenerated using this same diagnosis-stratified, participant-level percentile bootstrap (10,000 replicates), so that every within-cohort and uncorrected-LOCO CI in the paper is produced by one consistent, explicitly specified resampling procedure. This regeneration did not extend to the pairwise-transfer CIs (Supplementary Table S1) or to the batch-corrected LOCO CIs (Table 4, Figure 5, Supplementary Figure S4), which continue to use the original non-stratified 1,000-resample bootstrap described in Section 2.5; each table and figure in this paper states which of the two procedures its own CIs use.</w:t>
       </w:r>
     </w:p>
     <w:p>
@@ -2011,7 +2011,7 @@
         <w:t xml:space="preserve"> </w:t>
       </w:r>
       <w:r>
-        <w:t xml:space="preserve">(MMUPHin) — i.e., using every sample’s own true diagnosis label, for all four labeled cohorts jointly, including the sample’s own held-out-cohort membership in the eventual LOCO evaluation. This design cannot estimate prospective external-validation performance, because the correction step is fit using every sample’s own diagnosis label, including test-cohort samples. We retain it only as an exploratory sensitivity analysis illustrating an upper/alternative bound on what correction with label information could do, not as evidence about deployable performance.</w:t>
+        <w:t xml:space="preserve">(MMUPHin) — i.e., using every sample’s own true diagnosis label, for all four labeled cohorts jointly, including the sample’s own held-out-cohort membership in the eventual LOCO evaluation. This design cannot estimate prospective external-validation performance, because the correction step is fit using every sample’s own diagnosis label, including test-cohort samples. We retain this analysis only as an exploratory label-informed transductive sensitivity analysis. Because correction uses the true diagnosis labels of the eventual test-cohort samples, these results cannot estimate prospective external-validation performance and are not interpreted as a performance bound: access to test labels during correction can improve or worsen downstream classifier performance, so this design is not mathematically guaranteed to represent an upper or lower bound on what label-blind correction could achieve.</w:t>
       </w:r>
     </w:p>
     <w:p>
@@ -2799,7 +2799,7 @@
         <w:t xml:space="preserve"> </w:t>
       </w:r>
       <w:r>
-        <w:t xml:space="preserve">Repeating the strict training-only nested-CV partition 50 times under different pre-specified seeds gave a mean pooled-OOF AUC of 0.9955 (SD 0.0027, range 0.9889–0.9989) for logistic regression and 0.9760 (SD 0.0103, range 0.9378–0.9944) for LightGBM (Supplementary Table S8; Supplementary Figure S6) — closely matching the single-partition training-only values (0.9956 and 0.9700, respectively) and showing that the near-perfect AUC is not an artifact of one particular fold assignment. This is a fold-assignment stability check, not an independent replication of the underlying 60-participant sample, which is identical across all 50 repetitions. A complementary label-permutation test under the same strict training-only pipeline and fixed outer-fold partition (1,000 permutations; Section 2.4.1) produced a null AUC distribution centered near chance for both models (logistic regression: null mean 0.473, SD 0.102, 95% range [0.280, 0.673]; LightGBM: null mean 0.472, SD 0.109, 95% range [0.264, 0.688]) — well below the observed training-only single-partition values of 0.9956 and 0.9700 respectively (Supplementary Table S9; Supplementary Figure S6). No permutation among the 1,000 drawn reached the observed AUC for either model, giving an empirical p-value at the resolution floor for this permutation count (p = 1/1,001 ≈ 0.000999 for both models); we report this p-value at its actual resolution and do not interpret it as more precise than this floor.</w:t>
+        <w:t xml:space="preserve">Repeating the strict training-only nested-CV partition 50 times under different pre-specified seeds gave a mean pooled-OOF AUC of 0.9955 (SD 0.0027, range 0.9889–0.9989) for logistic regression and 0.9760 (SD 0.0103, range 0.9378–0.9944) for LightGBM (Supplementary Table S8; Supplementary Figure S5) — closely matching the single-partition training-only values (0.9956 and 0.9700, respectively) and showing that the near-perfect AUC is not an artifact of one particular fold assignment. This is a fold-assignment stability check, not an independent replication of the underlying 60-participant sample, which is identical across all 50 repetitions. A complementary label-permutation test under the same strict training-only pipeline and fixed outer-fold partition (1,000 permutations; Section 2.4.1) produced a null AUC distribution centered near chance for both models (logistic regression: null mean 0.473, SD 0.102, 95% range [0.280, 0.673]; LightGBM: null mean 0.472, SD 0.109, 95% range [0.264, 0.688]) — well below the observed training-only single-partition values of 0.9956 and 0.9700 respectively (Supplementary Table S9; Supplementary Figure S5). No permutation among the 1,000 drawn reached the observed AUC for either model, giving an empirical p-value at the resolution floor for this permutation count (p = 1/1,001 ≈ 0.000999 for both models); we report this p-value at its actual resolution and do not interpret it as more precise than this floor.</w:t>
       </w:r>
     </w:p>
     <w:p>
@@ -4534,7 +4534,7 @@
         <w:pStyle w:val="BodyText"/>
       </w:pPr>
       <w:r>
-        <w:t xml:space="preserve">N=60 for Zhu 2022 binary analysis (30 AD + 30 CN fecal samples; MCI and blood samples excluded). Originally reported AUC values are approximate, derived from the primary publications using the best-performing classifier reported; direct numerical comparison is limited by differences in cohort subset, model type, and validation design. All 95% CIs use the diagnosis-stratified, participant-level bootstrap described in Section 2.5.2 (10,000 replicates), applied uniformly to every AUC CI in this paper.</w:t>
+        <w:t xml:space="preserve">N=60 for Zhu 2022 binary analysis (30 AD + 30 CN fecal samples; MCI and blood samples excluded). Originally reported AUC values are approximate, derived from the primary publications using the best-performing classifier reported; direct numerical comparison is limited by differences in cohort subset, model type, and validation design. All 95% CIs in this table use the diagnosis-stratified, participant-level bootstrap described in Section 2.5.2 (10,000 replicates); see Section 2.5.2 for which other tables/figures in this paper use this same procedure versus the original 1,000-resample bootstrap.</w:t>
       </w:r>
     </w:p>
     <w:bookmarkEnd w:id="26"/>
@@ -4612,7 +4612,7 @@
         <w:t xml:space="preserve"> </w:t>
       </w:r>
       <w:r>
-        <w:t xml:space="preserve">confirmed that generalization failure was not attributable to Kazakhstan, Zhuang 2018, or Ling 2020 individually (Supplementary Figure S4). When Kazakhstan was excluded and LOCO was performed on the three remaining Chinese cohorts, Zhuang 2018 remained near chance (LogReg 0.512, LightGBM 0.567), demonstrating that the generalization failure for Zhuang 2018 is not a Kazakhstan artifact. When Zhuang 2018 was excluded, LOCO on the remaining three cohorts still showed AUC values that were substantially below within-cohort baselines for Kazakhstan (LogReg 0.599, LightGBM 0.495). When Ling 2020 was excluded, Kazakhstan LOCO LogReg was 0.604. These sensitivity results confirm the robustness of the main finding across cohort compositions.</w:t>
+        <w:t xml:space="preserve">confirmed that generalization failure was not attributable to Kazakhstan, Zhuang 2018, or Ling 2020 individually (Supplementary Figure S3). When Kazakhstan was excluded and LOCO was performed on the three remaining Chinese cohorts, Zhuang 2018 remained near chance (LogReg 0.512, LightGBM 0.567), demonstrating that the generalization failure for Zhuang 2018 is not a Kazakhstan artifact. When Zhuang 2018 was excluded, LOCO on the remaining three cohorts still showed AUC values that were substantially below within-cohort baselines for Kazakhstan (LogReg 0.599, LightGBM 0.495). When Ling 2020 was excluded, Kazakhstan LOCO LogReg was 0.604. These sensitivity results confirm the robustness of the main finding across cohort compositions.</w:t>
       </w:r>
     </w:p>
     <w:p>
@@ -6098,7 +6098,7 @@
           <w:b/>
           <w:bCs/>
         </w:rPr>
-        <w:t xml:space="preserve">Label-informed transductive sensitivity analysis (Supplementary Figure S5): severe degradation under this design was specific to the label-informed design itself.</w:t>
+        <w:t xml:space="preserve">Label-informed transductive sensitivity analysis (Supplementary Figure S4): severe degradation under this design was specific to the label-informed design itself.</w:t>
       </w:r>
       <w:r>
         <w:t xml:space="preserve"> </w:t>

</xml_diff>

<commit_message>
Address Reviewer 5 minor revision
</commit_message>
<xml_diff>
--- a/manuscript/draft.docx
+++ b/manuscript/draft.docx
@@ -2,13 +2,13 @@
 <file path=word/document.xml><?xml version="1.0" encoding="utf-8"?>
 <w:document xmlns:w="http://schemas.openxmlformats.org/wordprocessingml/2006/main" xmlns:m="http://schemas.openxmlformats.org/officeDocument/2006/math" xmlns:r="http://schemas.openxmlformats.org/officeDocument/2006/relationships" xmlns:o="urn:schemas-microsoft-com:office:office" xmlns:v="urn:schemas-microsoft-com:vml" xmlns:w10="urn:schemas-microsoft-com:office:word" xmlns:a="http://schemas.openxmlformats.org/drawingml/2006/main" xmlns:pic="http://schemas.openxmlformats.org/drawingml/2006/picture" xmlns:wp="http://schemas.openxmlformats.org/drawingml/2006/wordprocessingDrawing">
   <w:body>
-    <w:bookmarkStart w:id="49" w:name="X3f0b9e945a910e039fb180ce35c48dc311d16d2"/>
+    <w:bookmarkStart w:id="49" w:name="Xf6480aeedf7fa610e3a05b790e7de870ec22289"/>
     <w:p>
       <w:pPr>
         <w:pStyle w:val="Heading1"/>
       </w:pPr>
       <w:r>
-        <w:t xml:space="preserve">Cross-Cohort Generalization Failure in Gut Microbiome-Based Alzheimer’s Disease Classifiers: Evidence from Five Independent Cohorts with Batch Correction Analysis</w:t>
+        <w:t xml:space="preserve">Cross-Cohort Generalization Limitations in Gut Microbiome-Based Alzheimer’s Disease Classifiers: Evidence from Four Supervised Cohorts with Batch Correction Analysis</w:t>
       </w:r>
     </w:p>
     <w:p>
@@ -26,7 +26,7 @@
         <w:t xml:space="preserve"> </w:t>
       </w:r>
       <w:r>
-        <w:t xml:space="preserve">Microbiome AD classifier generalization failure</w:t>
+        <w:t xml:space="preserve">Microbiome AD classifier generalization limits</w:t>
       </w:r>
     </w:p>
     <w:p>
@@ -156,7 +156,7 @@
         <w:pStyle w:val="FirstParagraph"/>
       </w:pPr>
       <w:r>
-        <w:t xml:space="preserve">Gut microbiome dysbiosis has been proposed as an Alzheimer’s disease (AD) biomarker, but the transportability of microbiome classifiers across independent cohorts remains uncertain. We reprocessed five public 16S rRNA cohorts (509 samples; China, Kazakhstan, South Korea) with a common DADA2/genus-level pipeline and evaluated logistic regression and LightGBM classifiers using nested within-cohort cross-validation, leave-one-cohort-out (LOCO) transfer, pairwise transfer, PERMANOVA, batch adjustment, and out-of-fold SHAP analyses. Within four labeled cohorts, within-cohort AUC-ROC ranged from 0.633 to 0.998. The near-perfect Zhu 2022 result was stable across 50 repeated nested-CV partitions (mean AUC 0.9955 for logistic regression and 0.9760 for LightGBM) and exceeded a 1,000-permutation label null for both models (empirical p=0.000999). In LOCO evaluation, AUC ranged from 0.504 to 0.813, with mean decreases of 0.176 for logistic regression and 0.146 for LightGBM; paired diagnosis-stratified bootstrap intervals excluded zero for five of eight cohort-model differences. Re-deriving genus selection strictly from training data changed LOCO AUC by at most 0.066. In the four-cohort marginal PERMANOVA model, cohort-associated compositional variation exceeded diagnosis-associated variation (R²=0.172 versus 0.014), but this contrast decreased to 0.059 versus 0.023 when restricted to three more technically comparable Chinese paired-end MiSeq cohorts, and dispersion differed significantly among cohorts. Label-blind transductive ComBat-seq and MMUPHin adjustment changed mean LOCO AUC by at most 0.007 and did not recover transferability. Cross-cohort overlap of top predictive taxa was low: logistic-regression overlap remained above a prevalence-restricted random-set null, whereas LightGBM overlap did not. A descriptive coefficient-stability screen identified eight logistic-regression genera with opposite stable fitted-coefficient directions across cohorts. These findings demonstrate substantial, heterogeneous cross-cohort generalization limitations among the evaluated public 16S datasets and show that the two tested batch-adjustment methods did not restore transferability. Prospective validation in larger, geographically and technically diverse cohorts is needed before microbiome-based AD classifiers can be considered clinically actionable.</w:t>
+        <w:t xml:space="preserve">Gut microbiome dysbiosis has been proposed as an Alzheimer’s disease (AD) biomarker, but the transportability of microbiome classifiers across independent cohorts remains uncertain. We reprocessed five public 16S rRNA cohorts (509 samples; China, Kazakhstan, South Korea) with a common DADA2/genus-level pipeline and evaluated logistic regression and LightGBM classifiers using nested within-cohort cross-validation, leave-one-cohort-out (LOCO) transfer, pairwise transfer, PERMANOVA, batch adjustment, and out-of-fold SHAP analyses. Within four labeled cohorts, using strict training-only genus selection as the primary classifier-performance pipeline (Section 2.5.1), within-cohort AUC-ROC ranged from 0.611 to 0.996. The near-perfect Zhu 2022 result was stable across 50 repeated nested-CV partitions and exceeded a 1,000-permutation label null (p=0.000999), though a technical-metadata confound cannot be excluded (Section 4.3). In LOCO evaluation, AUC ranged from 0.506 to 0.812 (mean decreases of 0.170 logistic regression, 0.133 LightGBM); paired bootstrap intervals excluded zero for four of eight cohort-model differences. This pipeline agreed closely with a fixed common-universe reference retained for secondary analyses (max |Δ|=0.066), though one pairwise-transfer cell changed materially (Kazakhstan→Ling 2020, LightGBM: 0.58→0.44), reported without smoothing. In the four-cohort marginal PERMANOVA model, cohort-associated compositional variation exceeded diagnosis-associated variation (R²=0.172 vs. 0.014), decreasing to 0.059 vs. 0.023 when restricted to three more technically comparable Chinese paired-end MiSeq cohorts; dispersion differed significantly among cohorts. Label-blind transductive ComBat-seq and MMUPHin adjustment changed mean LOCO AUC by at most 0.007 and did not recover transferability. Cross-cohort overlap of top predictive taxa was low: logistic-regression overlap remained above a prevalence-restricted null, LightGBM did not. A descriptive coefficient-stability screen identified eight logistic-regression genera with opposite, stable fitted-coefficient directions across cohorts. These findings demonstrate substantial, heterogeneous cross-cohort generalization limitations among the evaluated public 16S datasets, and show the two tested batch-adjustment methods did not restore transferability. Prospective validation in larger, geographically and technically diverse cohorts is needed before microbiome-based AD classifiers can be considered clinically actionable.</w:t>
       </w:r>
     </w:p>
     <w:p>
@@ -291,7 +291,7 @@
         <w:pStyle w:val="BodyText"/>
       </w:pPr>
       <w:r>
-        <w:t xml:space="preserve">We assembled five publicly available 16S rRNA gene sequencing cohorts spanning three countries (China, Kazakhstan, South Korea) and conducted a comprehensive cross-cohort generalization evaluation. We report that classifiers showed substantial and variable degradation when transferred to independent cohorts; cohort identity explains substantially more compositional variance than disease status, though the size of this disparity depends materially on which cohorts are compared; under label-blind transductive adjustment, ComBat-seq and MMUPHin left mean cross-cohort AUC essentially unchanged and did not recover transferability; and top predictive taxa showed low absolute overlap across cohorts, with a subset showing opposite, stable fitted-coefficient directions. Together, these findings constitute a systematic quantification of cross-cohort generalization limitations among the evaluated public gut microbiome AD classifier datasets, with direct implications for the field’s trajectory toward clinical translation.</w:t>
+        <w:t xml:space="preserve">We assembled five publicly available 16S rRNA gene sequencing cohorts spanning three countries (China, Kazakhstan, South Korea): four with per-sample diagnosis labels supporting supervised classification, and a fifth (Kim/KBASE 2022) contributing only to unsupervised compositional analyses (Section 2.1). We conducted a comprehensive cross-cohort generalization evaluation across the four labeled cohorts. We report that classifiers showed substantial and variable degradation when transferred to independent cohorts; cohort identity explains substantially more compositional variance than disease status, though the size of this disparity depends materially on which cohorts are compared; under label-blind transductive adjustment, ComBat-seq and MMUPHin left mean cross-cohort AUC essentially unchanged and did not recover transferability; and top predictive taxa showed low absolute overlap across cohorts, with a subset showing opposite, stable fitted-coefficient directions. Together, these findings constitute a systematic quantification of cross-cohort generalization limitations among the evaluated public gut microbiome AD classifier datasets, with direct implications for the field’s trajectory toward clinical translation.</w:t>
       </w:r>
     </w:p>
     <w:p>
@@ -325,117 +325,15 @@
         <w:pStyle w:val="FirstParagraph"/>
       </w:pPr>
       <w:r>
-        <w:t xml:space="preserve">We performed a systematic search of NCBI SRA and ENA for publicly available 16S rRNA amplicon sequencing studies of gut microbiota in AD, MCI, or cognitively normal populations, deposited before January 2025, using the following SRA search terms: (</w:t>
-      </w:r>
-      <w:r>
-        <w:t xml:space="preserve">“Alzheimer’s disease”</w:t>
-      </w:r>
-      <w:r>
-        <w:t xml:space="preserve"> </w:t>
-      </w:r>
-      <w:r>
-        <w:t xml:space="preserve">OR</w:t>
-      </w:r>
-      <w:r>
-        <w:t xml:space="preserve"> </w:t>
-      </w:r>
-      <w:r>
-        <w:t xml:space="preserve">“Alzheimer disease”</w:t>
-      </w:r>
-      <w:r>
-        <w:t xml:space="preserve"> </w:t>
-      </w:r>
-      <w:r>
-        <w:t xml:space="preserve">OR</w:t>
-      </w:r>
-      <w:r>
-        <w:t xml:space="preserve"> </w:t>
-      </w:r>
-      <w:r>
-        <w:t xml:space="preserve">“mild cognitive impairment”</w:t>
-      </w:r>
-      <w:r>
-        <w:t xml:space="preserve"> </w:t>
-      </w:r>
-      <w:r>
-        <w:t xml:space="preserve">OR</w:t>
-      </w:r>
-      <w:r>
-        <w:t xml:space="preserve"> </w:t>
-      </w:r>
-      <w:r>
-        <w:t xml:space="preserve">“MCI”</w:t>
-      </w:r>
-      <w:r>
-        <w:t xml:space="preserve"> </w:t>
-      </w:r>
-      <w:r>
-        <w:t xml:space="preserve">OR</w:t>
-      </w:r>
-      <w:r>
-        <w:t xml:space="preserve"> </w:t>
-      </w:r>
-      <w:r>
-        <w:t xml:space="preserve">“dementia”</w:t>
-      </w:r>
-      <w:r>
-        <w:t xml:space="preserve">) AND (</w:t>
-      </w:r>
-      <w:r>
-        <w:t xml:space="preserve">“gut microbiome”</w:t>
-      </w:r>
-      <w:r>
-        <w:t xml:space="preserve"> </w:t>
-      </w:r>
-      <w:r>
-        <w:t xml:space="preserve">OR</w:t>
-      </w:r>
-      <w:r>
-        <w:t xml:space="preserve"> </w:t>
-      </w:r>
-      <w:r>
-        <w:t xml:space="preserve">“gut microbiota”</w:t>
-      </w:r>
-      <w:r>
-        <w:t xml:space="preserve"> </w:t>
-      </w:r>
-      <w:r>
-        <w:t xml:space="preserve">OR</w:t>
-      </w:r>
-      <w:r>
-        <w:t xml:space="preserve"> </w:t>
-      </w:r>
-      <w:r>
-        <w:t xml:space="preserve">“intestinal microbiome”</w:t>
-      </w:r>
-      <w:r>
-        <w:t xml:space="preserve"> </w:t>
-      </w:r>
-      <w:r>
-        <w:t xml:space="preserve">OR</w:t>
-      </w:r>
-      <w:r>
-        <w:t xml:space="preserve"> </w:t>
-      </w:r>
-      <w:r>
-        <w:t xml:space="preserve">“16S rRNA”</w:t>
-      </w:r>
-      <w:r>
-        <w:t xml:space="preserve">) AND (</w:t>
-      </w:r>
-      <w:r>
-        <w:t xml:space="preserve">“Homo sapiens”</w:t>
-      </w:r>
-      <w:r>
-        <w:t xml:space="preserve">). Studies were included if they provided (1) per-sample diagnosis labels (AD, MCI, or CN) in public metadata, (2) raw FASTQ files or quality-filtered reads in a public archive, and (3) minimum sample sizes of 40 participants per cohort. We restricted this analysis to 16S rRNA studies; shotgun metagenomic cohorts were identified but excluded to avoid the additional platform confound of mixing amplicon and whole-genome sequencing data. Cohorts were excluded if per-sample labels were IRB-restricted (for supervised analyses), data had not been publicly released at the time of analysis, or samples represented a tissue compartment other than fecal microbiome. A complete record of the search procedure, identified cohorts, and exclusion rationale is in Supplementary Note S1.</w:t>
-      </w:r>
-    </w:p>
-    <w:p>
-      <w:pPr>
-        <w:pStyle w:val="BodyText"/>
-      </w:pPr>
-      <w:r>
-        <w:t xml:space="preserve">Four cohorts met all criteria for supervised analysis. A fifth cohort, Kim/KBASE 2022 (PRJEB50447), lacked publicly available per-sample diagnosis labels and was retained only for unsupervised cohort-level analyses. The ALBION 2025 Greek cohort (PRJNA1297934) was identified but excluded because data had not yet been publicly released at the time of analysis. Group-level counts from the published paper (18 amyloid-positive preclinical AD; 60 cognitively normal) were available but insufficient for supervised classifier training or evaluation.</w:t>
+        <w:t xml:space="preserve">We systematically searched NCBI SRA and ENA for publicly available 16S rRNA amplicon-sequencing studies of gut microbiota in AD, MCI, or cognitively normal populations deposited before January 2025 (search terms and full inclusion/exclusion record: Supplementary Note S1). Inclusion required per-sample diagnosis labels, raw or quality-filtered reads in a public archive, and ≥40 participants per cohort; shotgun metagenomic studies were excluded to avoid mixing amplicon and whole-genome platforms, and cohorts were excluded for IRB-restricted labels, unreleased data, or a non-fecal tissue compartment.</w:t>
+      </w:r>
+    </w:p>
+    <w:p>
+      <w:pPr>
+        <w:pStyle w:val="BodyText"/>
+      </w:pPr>
+      <w:r>
+        <w:t xml:space="preserve">Four cohorts met all criteria for supervised analysis. A fifth, Kim/KBASE 2022 (Jung et al., 2022; PRJEB50447; 78 participants, 18 preclinical AD by amyloid-PET, 60 CN), lacked publicly available per-sample diagnosis labels and was retained only for PERMANOVA (Phase 4), excluded from all supervised classifier training and evaluation. The ALBION 2025 Greek cohort (PRJNA1297934) was identified but excluded because data had not yet been publicly released at the time of analysis.</w:t>
       </w:r>
     </w:p>
     <w:p>
@@ -507,7 +405,7 @@
         <w:t xml:space="preserve">) sample and a blood microbiome (B_</w:t>
       </w:r>
       <w:r>
-        <w:t xml:space="preserve">) sample. Only the 90 fecal samples were used in all analyses; blood samples were excluded as a distinct biological compartment that would confound within-cohort classifiers. Binary analyses used 30 AD and 30 CN fecal samples (n=60). Paired-end MiSeq 2×300 bp, V3–V4 (Zhu et al., 2022). Diagnostic ascertainment differed across cohorts: Zhuang 2018, Ling 2020, and Zhu 2022 used clinical AD diagnosis; Kazakhstan used NINCDS-ADRDA criteria (confirmed by neurologists); and Kim/KBASE 2022 used amyloid-PET positivity for preclinical AD. These differences in diagnostic ascertainment are acknowledged as a source of between-cohort biological heterogeneity.</w:t>
+        <w:t xml:space="preserve">) sample. Only the 90 fecal samples were used in all analyses; blood samples were excluded as a distinct biological compartment that would confound within-cohort classifiers. Binary analyses used 30 AD and 30 CN fecal samples (n=60). Paired-end MiSeq 2×300 bp, V3–V4 (Zhu et al., 2022). Diagnostic ascertainment differed across cohorts (Zhuang 2018/Ling 2020/Zhu 2022: clinical AD diagnosis; Kazakhstan: NINCDS-ADRDA criteria; Kim/KBASE 2022: amyloid-PET positivity); Section 4.6 discusses the implications of this heterogeneity.</w:t>
       </w:r>
     </w:p>
     <w:p>
@@ -525,15 +423,7 @@
         <w:t xml:space="preserve"> </w:t>
       </w:r>
       <w:r>
-        <w:t xml:space="preserve">84 participants (41 AD, 43 CN). Single-end NovaSeq sequencing, V3–V4 region (Kaiyrlykyzy et al., 2022) — the only single-end dataset in the study; implications for read length and taxonomic resolution are discussed in Section 2.2 and Limitations.</w:t>
-      </w:r>
-    </w:p>
-    <w:p>
-      <w:pPr>
-        <w:pStyle w:val="BodyText"/>
-      </w:pPr>
-      <w:r>
-        <w:t xml:space="preserve">The Kim/KBASE 2022 cohort (Jung et al., 2022; PRJEB50447; 78 participants; 18 preclinical AD by amyloid-PET, 60 CN) was included in PERMANOVA analyses (Phase 4) only and excluded from all supervised classifier training and evaluation.</w:t>
+        <w:t xml:space="preserve">84 participants (41 AD, 43 CN). Single-end NovaSeq sequencing, V3–V4 region (Kaiyrlykyzy et al., 2022) — the only single-end dataset in the study (Section 2.2, Limitations).</w:t>
       </w:r>
     </w:p>
     <w:p>
@@ -575,105 +465,54 @@
         <w:pStyle w:val="BodyText"/>
       </w:pPr>
       <w:r>
-        <w:t xml:space="preserve">Taxonomic assignment used the SILVA reference database v138.1. ASVs were collapsed to genus level by summing raw counts per sample. A genus was retained across the study if it reached ≥20% prevalence (nonzero count in ≥20% of samples) in at least one of the five cohorts; this threshold was computed per cohort and the union of genera passing in any cohort was taken across all five, producing a unified feature set of 396 genera. Genera absent in a given sample received a count of zero. Because this feature-selection step used all five cohorts’ raw prevalence simultaneously, the resulting 396-genus feature universe was informed, in part, by the prevalence of the eventual test cohort in every downstream leave-one-cohort-out (LOCO) and pairwise-transfer experiment (Section 2.5). This is not a leakage-free design; it is identified transparently as a global, all-cohort feature-selection step, and its effect on the paper’s conclusions is evaluated directly by a strict training-only sensitivity analysis (Section 2.5.1) rather than assumed negligible.</w:t>
-      </w:r>
-    </w:p>
-    <w:p>
-      <w:pPr>
-        <w:pStyle w:val="BodyText"/>
-      </w:pPr>
-      <w:r>
-        <w:rPr>
-          <w:b/>
-          <w:bCs/>
-        </w:rPr>
-        <w:t xml:space="preserve">Leakage status of every preprocessing step, stated explicitly.</w:t>
-      </w:r>
-      <w:r>
-        <w:t xml:space="preserve"> </w:t>
-      </w:r>
-      <w:r>
-        <w:t xml:space="preserve">(1)</w:t>
-      </w:r>
-      <w:r>
-        <w:t xml:space="preserve"> </w:t>
-      </w:r>
-      <w:r>
-        <w:rPr>
-          <w:i/>
-          <w:iCs/>
-        </w:rPr>
-        <w:t xml:space="preserve">DADA2 ASV inference and error-model estimation</w:t>
-      </w:r>
-      <w:r>
-        <w:t xml:space="preserve"> </w:t>
-      </w:r>
-      <w:r>
-        <w:t xml:space="preserve">(this section) were performed once independently within each cohort using that cohort’s full read set, with no diagnosis labels and no samples from other cohorts, and were not re-estimated within outer-CV folds. Thus, this raw-read stage does not introduce diagnosis-label leakage or cross-cohort pooling, although within-cohort performance is not fully fold-isolated at the denoising stage because error-model estimation used the cohort’s full read set. The strict training-only sensitivity below re-derives genus selection and downstream supervised preprocessing/model fitting, not DADA2. (2)</w:t>
-      </w:r>
-      <w:r>
-        <w:t xml:space="preserve"> </w:t>
-      </w:r>
-      <w:r>
-        <w:rPr>
-          <w:i/>
-          <w:iCs/>
-        </w:rPr>
-        <w:t xml:space="preserve">Global genus-level feature selection</w:t>
-      </w:r>
-      <w:r>
-        <w:t xml:space="preserve"> </w:t>
-      </w:r>
-      <w:r>
-        <w:t xml:space="preserve">(≥20% prevalence, this section) pools raw prevalence across all five cohorts, including the eventual held-out cohort in every LOCO/pairwise experiment — a genuine, acknowledged limitation bounded by the training-only sensitivity in Section 2.5.1, which re-derives the feature set from training-side samples only and finds the qualitative conclusion unchanged. (3)</w:t>
-      </w:r>
-      <w:r>
-        <w:t xml:space="preserve"> </w:t>
-      </w:r>
-      <w:r>
-        <w:rPr>
-          <w:i/>
-          <w:iCs/>
-        </w:rPr>
-        <w:t xml:space="preserve">Zero-replacement and CLR transformation</w:t>
-      </w:r>
-      <w:r>
-        <w:t xml:space="preserve"> </w:t>
-      </w:r>
-      <w:r>
-        <w:t xml:space="preserve">(Section 2.3) are deterministic functions of each sample’s own count vector, using no information from any other sample, cohort, or diagnosis label. (4)</w:t>
-      </w:r>
-      <w:r>
-        <w:t xml:space="preserve"> </w:t>
-      </w:r>
-      <w:r>
-        <w:rPr>
-          <w:i/>
-          <w:iCs/>
-        </w:rPr>
-        <w:t xml:space="preserve">Model tuning and fitting</w:t>
-      </w:r>
-      <w:r>
-        <w:t xml:space="preserve"> </w:t>
-      </w:r>
-      <w:r>
-        <w:t xml:space="preserve">(Sections 2.4–2.5) use only the training-side samples of each split, with test-side samples never used for tuning, fitting, or standardization. (5) The</w:t>
-      </w:r>
-      <w:r>
-        <w:t xml:space="preserve"> </w:t>
-      </w:r>
-      <w:r>
-        <w:rPr>
-          <w:i/>
-          <w:iCs/>
-        </w:rPr>
-        <w:t xml:space="preserve">strict training-only sensitivity</w:t>
-      </w:r>
-      <w:r>
-        <w:t xml:space="preserve"> </w:t>
-      </w:r>
-      <w:r>
-        <w:t xml:space="preserve">(Section 2.5.1) additionally re-derives genus selection from training-side samples only, closing the pathway identified in (2) for that analysis.</w:t>
+        <w:t xml:space="preserve">Taxonomic assignment used the SILVA reference database v138.1. ASVs were collapsed to genus level by summing raw counts per sample. Two genus-selection schemes are used in this paper, and every downstream result states which one it uses (Section 2.5.1 gives the full rationale). The</w:t>
+      </w:r>
+      <w:r>
+        <w:t xml:space="preserve"> </w:t>
+      </w:r>
+      <w:r>
+        <w:rPr>
+          <w:b/>
+          <w:bCs/>
+        </w:rPr>
+        <w:t xml:space="preserve">primary scheme</w:t>
+      </w:r>
+      <w:r>
+        <w:t xml:space="preserve">, used for every headline classifier-performance estimate (within-cohort, LOCO, pairwise transfer; Tables 2–3, Figures 2–3), re-derives the ≥20%-prevalence genus set independently within each train/test split, from training-side samples only, so no held-out cohort ever contributes prevalence information to its own evaluation. A</w:t>
+      </w:r>
+      <w:r>
+        <w:t xml:space="preserve"> </w:t>
+      </w:r>
+      <w:r>
+        <w:rPr>
+          <w:b/>
+          <w:bCs/>
+        </w:rPr>
+        <w:t xml:space="preserve">fixed common-universe scheme</w:t>
+      </w:r>
+      <w:r>
+        <w:t xml:space="preserve"> </w:t>
+      </w:r>
+      <w:r>
+        <w:t xml:space="preserve">— ≥20% prevalence (nonzero count in ≥20% of samples) in at least one of the five cohorts, computed once globally and pooling all five cohorts’ raw prevalence, producing a fixed 396-genus feature set — is retained only for the secondary descriptive/harmonization analyses that require one common feature space across cohorts simultaneously (batch correction, SHAP, PERMANOVA; Section 2.5.1). Genera absent in a given sample received a count of zero under either scheme.</w:t>
+      </w:r>
+    </w:p>
+    <w:p>
+      <w:pPr>
+        <w:pStyle w:val="BodyText"/>
+      </w:pPr>
+      <w:r>
+        <w:rPr>
+          <w:b/>
+          <w:bCs/>
+        </w:rPr>
+        <w:t xml:space="preserve">Leakage considerations.</w:t>
+      </w:r>
+      <w:r>
+        <w:t xml:space="preserve"> </w:t>
+      </w:r>
+      <w:r>
+        <w:t xml:space="preserve">DADA2 denoising (this section) is performed once per cohort using that cohort’s full read set, with no diagnosis labels or cross-cohort pooling, though not fully fold-isolated at the denoising stage for that reason. Zero-replacement/CLR (Section 2.3) are per-sample deterministic functions. Model tuning and fitting (Sections 2.4–2.5) use training-side samples only. The primary training-only genus-selection scheme closes the remaining pathway (feature selection informed by the test cohort’s own prevalence); the common-universe scheme does not, which is why it is not used as classifier-generalization evidence (Section 4.6).</w:t>
       </w:r>
     </w:p>
     <w:bookmarkEnd w:id="12"/>
@@ -1270,7 +1109,7 @@
         <w:pStyle w:val="FirstParagraph"/>
       </w:pPr>
       <w:r>
-        <w:t xml:space="preserve">We trained binary classifiers (AD vs. CN) independently for each of the four labeled cohorts using two model families:</w:t>
+        <w:t xml:space="preserve">We trained binary classifiers (AD vs. CN) independently for each of the four labeled cohorts using two model families; this model-fitting methodology is shared by both feature-selection schemes compared in Section 2.5.1.</w:t>
       </w:r>
     </w:p>
     <w:p>
@@ -1423,7 +1262,7 @@
         <w:t xml:space="preserve"> </w:t>
       </w:r>
       <w:r>
-        <w:t xml:space="preserve">Under the same pipeline and fixed outer-fold partition (random_state=42): for each of exactly 1,000 permutations, AD/CN labels were shuffled across the 60 participants while preserving the 30/30 class balance. Within every outer fold, all label-dependent model fitting and hyperparameter tuning were rerun using the permuted training labels. Fold-specific genus selection, zero replacement, and CLR construction depend only on fold membership and feature counts rather than diagnosis labels; these components were therefore precomputed once for the fixed partition and reused across permutations. This is an implementation optimization and does not alter the permutation null because the classifier is refit on the permuted labels in every replicate. Empirical p =</w:t>
+        <w:t xml:space="preserve">Under the same pipeline and fixed outer-fold partition (random_state=42): for each of exactly 1,000 permutations, AD/CN labels were shuffled across the 60 participants (preserving 30/30 class balance) and the classifier was refit on the permuted labels within every outer fold. Fold-specific genus selection, zero replacement, and CLR construction depend only on fold membership, not labels, so these were precomputed once and reused across permutations — an implementation optimization that does not alter the null, since the classifier itself is always refit on the permuted labels. Empirical p =</w:t>
       </w:r>
       <w:r>
         <w:t xml:space="preserve"> </w:t>
@@ -1499,7 +1338,7 @@
         </m:r>
       </m:oMath>
       <w:r>
-        <w:t xml:space="preserve">, using the training-only single-partition AUC as the observed value; the minimum attainable p at this permutation count is</w:t>
+        <w:t xml:space="preserve">; the minimum attainable p at this permutation count is</w:t>
       </w:r>
       <w:r>
         <w:t xml:space="preserve"> </w:t>
@@ -1528,7 +1367,7 @@
         </m:r>
       </m:oMath>
       <w:r>
-        <w:t xml:space="preserve">, and we do not interpret any p-value below this floor as more precise than it.</w:t>
+        <w:t xml:space="preserve">, not interpreted as more precise than that floor.</w:t>
       </w:r>
     </w:p>
     <w:bookmarkEnd w:id="14"/>
@@ -1565,7 +1404,7 @@
         <w:t xml:space="preserve"> </w:t>
       </w:r>
       <w:r>
-        <w:t xml:space="preserve">For each test cohort, a classifier was trained on the pooled samples from the remaining three labeled cohorts (no cross-validation within this training step; hyperparameters were selected via 5-fold inner CV on the training pool), then evaluated on the held-out cohort, producing four LOCO AUC estimates per model type. We report the LOCO AUC drop as the difference between within-cohort (nested CV) AUC and LOCO AUC. Uncorrected LOCO 95% CIs (Table 3, Figure 3A) use the diagnosis-stratified, participant-level bootstrap of Section 2.5.2 (10,000 replicates); CIs on batch-corrected LOCO AUC (Table 4, Figure 5, Supplementary Figure S4) use the non-stratified 1,000-resample bootstrap described below. Non-overlap of two independently computed CIs is not a formal statistical test of whether their difference is nonzero and is not used as one anywhere in this paper; the AUC drop is instead evaluated with the paired bootstrap procedure in Section 2.5.2.</w:t>
+        <w:t xml:space="preserve">For each test cohort, a classifier was trained on the pooled samples from the remaining three labeled cohorts (hyperparameters selected via 5-fold inner CV on the training pool), then evaluated on the held-out cohort, producing four LOCO AUC estimates per model. LOCO AUC drop = within-cohort minus LOCO AUC, formally evaluated by the paired bootstrap of Section 2.5.2. Uncorrected LOCO 95% CIs (Table 3, Figure 3A) use that same diagnosis-stratified, participant-level bootstrap (10,000 replicates); batch-corrected LOCO CIs (Table 4, Figure 5, Supplementary Figure S4) use the non-stratified 1,000-resample bootstrap below.</w:t>
       </w:r>
     </w:p>
     <w:p>
@@ -1583,7 +1422,7 @@
         <w:t xml:space="preserve"> </w:t>
       </w:r>
       <w:r>
-        <w:t xml:space="preserve">A classifier was trained on one cohort and tested on each of the other three individually, yielding a 4×4 matrix (diagonal excluded) of cross-cohort AUC per model type — more stringent than LOCO and able to isolate specific directional failures. Pairwise AUC 95% CIs (Supplementary Table S1) use the non-stratified 1,000-resample bootstrap on test-set predictions, not the diagnosis-stratified regeneration of Section 2.5.2, which covers only the within-cohort and uncorrected-LOCO CIs.</w:t>
+        <w:t xml:space="preserve">A classifier was trained on one cohort and tested on each other individually, yielding a 4×4 matrix (diagonal excluded) per model — more stringent than LOCO, isolating directional failures. Pairwise 95% CIs (Supplementary Table S1) use the non-stratified 1,000-resample bootstrap on test-set predictions.</w:t>
       </w:r>
     </w:p>
     <w:p>
@@ -1601,16 +1440,16 @@
         <w:t xml:space="preserve"> </w:t>
       </w:r>
       <w:r>
-        <w:t xml:space="preserve">To assess whether generalization failure was attributable to any single cohort, we repeated LOCO under three additional configurations: (A) excluding Kazakhstan entirely, LOCO evaluated on the remaining three; (B) excluding Zhuang 2018; (C) excluding Ling 2020. Results are in Section 3.3 and Supplementary Figure S3.</w:t>
-      </w:r>
-    </w:p>
-    <w:bookmarkStart w:id="16" w:name="Xe2926c73c2cf6d3094a4393ff10389966fd30e4"/>
+        <w:t xml:space="preserve">To assess whether generalization failure was attributable to any single cohort, we repeated LOCO excluding (A) Kazakhstan, (B) Zhuang 2018, and (C) Ling 2020 in turn (Section 3.3; Supplementary Figure S3).</w:t>
+      </w:r>
+    </w:p>
+    <w:bookmarkStart w:id="16" w:name="Xc27ca0dbbdaa1fe848998a85fde596aee9d4d0f"/>
     <w:p>
       <w:pPr>
         <w:pStyle w:val="Heading4"/>
       </w:pPr>
       <w:r>
-        <w:t xml:space="preserve">2.5.1 Training-Only Feature-Selection Sensitivity Analysis</w:t>
+        <w:t xml:space="preserve">2.5.1 Primary Feature Selection: Strict Training-Only, versus the Common-Universe Schema Retained for Secondary Analyses</w:t>
       </w:r>
     </w:p>
     <w:p>
@@ -1618,7 +1457,31 @@
         <w:pStyle w:val="FirstParagraph"/>
       </w:pPr>
       <w:r>
-        <w:t xml:space="preserve">Because the 396-genus feature set (Section 2.2) was selected globally using all five cohorts’ raw prevalence, every LOCO and pairwise experiment above used a feature universe partly informed by the eventual held-out cohort. To test whether this affected the generalization-failure conclusion, we repeated the within-cohort, LOCO, and pairwise-transfer analyses with genus selection re-derived independently inside every split, using only that split’s training-side samples: for each outer fold (within-cohort), held-out cohort (LOCO), and train cohort (pairwise), the ≥20%-prevalence filter was recomputed from training-side AD/CN-labeled samples only, and test/held-out samples were projected onto the training-derived genus set (absent genera zero-filled) before per-sample zero-replacement and CLR transformation. Model families, hyperparameter grids, random state, fold counts, and bootstrap CI procedure matched the main analyses (Sections 2.4–2.5). This yields a strictly train-only feature universe per split, at the cost of a smaller, split-specific genus count (e.g., 150 genera when Kazakhstan is excluded during its own LOCO hold-out, versus 396 globally).</w:t>
+        <w:t xml:space="preserve">The global 396-genus set (Section 2.2) gave every LOCO/pairwise experiment a feature universe partly informed by the held-out cohort’s own prevalence. To close this pathway,</w:t>
+      </w:r>
+      <w:r>
+        <w:t xml:space="preserve"> </w:t>
+      </w:r>
+      <w:r>
+        <w:rPr>
+          <w:b/>
+          <w:bCs/>
+        </w:rPr>
+        <w:t xml:space="preserve">every headline within-cohort, LOCO, and pairwise-transfer AUC in this paper (Table 2, Table 3, Figure 2, Figure 3A–C) instead uses genus selection re-derived independently inside every split, from that split’s training-side samples only</w:t>
+      </w:r>
+      <w:r>
+        <w:t xml:space="preserve"> </w:t>
+      </w:r>
+      <w:r>
+        <w:t xml:space="preserve">— this strict training-only scheme is the primary classifier-performance pipeline. For each outer fold/held-out cohort/train cohort, the ≥20%-prevalence filter was recomputed from training-side samples, and test/held-out samples projected onto the training-derived genus set (absent genera zero-filled) before zero-replacement and CLR. Model families, hyperparameter grids, random state, fold counts, and bootstrap procedure are otherwise identical to Sections 2.4–2.5.2. Retained genus count varies by split (e.g., 150 vs. 396 when Kazakhstan is excluded during its own LOCO hold-out); no headline classifier-generalization claim depends on held-out-cohort prevalence information.</w:t>
+      </w:r>
+    </w:p>
+    <w:p>
+      <w:pPr>
+        <w:pStyle w:val="BodyText"/>
+      </w:pPr>
+      <w:r>
+        <w:t xml:space="preserve">The fixed common 396-genus universe is retained only for the secondary descriptive/harmonization analyses that require one common feature space across all cohorts simultaneously — batch correction (Section 2.7), SHAP/coefficient-stability/Jaccard-overlap (Section 2.8), and PERMANOVA (Section 2.6) — labeled as such at each occurrence and not used as classifier-generalization evidence. Both pipelines were computed side by side to confirm the choice of primary pipeline does not materially change conclusions (Section 3.3; Supplementary Tables S1, S4).</w:t>
       </w:r>
     </w:p>
     <w:bookmarkEnd w:id="16"/>
@@ -1636,7 +1499,7 @@
         <w:pStyle w:val="FirstParagraph"/>
       </w:pPr>
       <w:r>
-        <w:t xml:space="preserve">Non-overlapping bootstrap CIs are a heuristic, not a formal statistical comparison. To formally evaluate the within-cohort-versus-LOCO AUC difference for each of the eight cohort–model combinations, we performed a paired, diagnosis-stratified, participant-level bootstrap: for each pair, the within-cohort and LOCO predictions refer to the same participants, and each of 10,000 replicates resampled participants with replacement (separately within AD and CN) and used that same resampled index set for both AUC values — so the resulting distribution of</w:t>
+        <w:t xml:space="preserve">Non-overlapping bootstrap CIs are a heuristic, not a formal comparison. To formally evaluate the within-cohort-versus-LOCO AUC difference for each of the eight cohort–model combinations, we performed a paired, diagnosis-stratified, participant-level bootstrap: each of 10,000 replicates resampled participants with replacement (separately within AD and CN) and used that same resampled index set for both AUC values, so the resulting</w:t>
       </w:r>
       <w:r>
         <w:t xml:space="preserve"> </w:t>
@@ -1705,7 +1568,7 @@
         <w:t xml:space="preserve"> </w:t>
       </w:r>
       <w:r>
-        <w:t xml:space="preserve">is a genuine paired comparison, not the difference of two independently resampled statistics. We report the observed delta, bootstrap mean delta, 95% percentile CI, and the proportion of replicates with</w:t>
+        <w:t xml:space="preserve">distribution is a genuine paired comparison. We report the observed delta, bootstrap mean delta, 95% percentile CI, and proportion of replicates with</w:t>
       </w:r>
       <w:r>
         <w:t xml:space="preserve"> </w:t>
@@ -1728,18 +1591,7 @@
         </m:r>
       </m:oMath>
       <w:r>
-        <w:t xml:space="preserve"> </w:t>
-      </w:r>
-      <w:r>
-        <w:t xml:space="preserve">(an empirical bootstrap quantity, not an exact p-value). Within-cohort and uncorrected-LOCO CIs in Tables 2 and 3 (Figures 2 and 3A, Supplementary Figure S1) were regenerated with this same procedure, so every within-cohort and uncorrected-LOCO CI in the paper uses one consistent resampling method; this did not extend to the pairwise-transfer CIs (Supplementary Table S1) or batch-corrected LOCO CIs (Table 4, Figure 5, Supplementary Figure S4), which retain the original non-stratified 1,000-resample bootstrap of Section 2.5 — each table/figure states which procedure its CIs use.</w:t>
-      </w:r>
-    </w:p>
-    <w:p>
-      <w:pPr>
-        <w:pStyle w:val="BodyText"/>
-      </w:pPr>
-      <w:r>
-        <w:t xml:space="preserve">Within-cohort out-of-fold prediction files lack an explicit participant identifier; identity was recovered by replicating the exact data-loading/filtering sequence and verified, before use, by an exact-match assertion against the file’s own saved outcome column, for every cohort–model combination.</w:t>
+        <w:t xml:space="preserve">. This same procedure regenerated the within-cohort and uncorrected-LOCO CIs in Tables 2–3; pairwise-transfer CIs (Table S1) and batch-corrected LOCO CIs (Table 4, Figure 5, Figure S4) retain the original non-stratified 1,000-resample bootstrap of Section 2.5 — each table/figure states which procedure its CIs use.</w:t>
       </w:r>
     </w:p>
     <w:bookmarkEnd w:id="17"/>
@@ -1758,7 +1610,7 @@
         <w:pStyle w:val="FirstParagraph"/>
       </w:pPr>
       <w:r>
-        <w:t xml:space="preserve">To quantify the relative contribution of cohort identity and disease status to total compositional variance, we conducted PERMANOVA using the adonis2 function in the R package vegan v2.6 (Oksanen et al., 2024), with two distance matrices:</w:t>
+        <w:t xml:space="preserve">This section and Sections 2.7–2.8 use the fixed common 396-genus universe (Section 2.2), not the training-only primary pipeline, because each requires one common feature space across cohorts (Section 2.5.1). We conducted PERMANOVA using adonis2 (R package vegan v2.6; Oksanen et al., 2024) on</w:t>
       </w:r>
       <w:r>
         <w:t xml:space="preserve"> </w:t>
@@ -1774,7 +1626,7 @@
         <w:t xml:space="preserve"> </w:t>
       </w:r>
       <w:r>
-        <w:t xml:space="preserve">(Euclidean distance on CLR values), the compositionally appropriate distance that does not distort due to the simplex constraint, and</w:t>
+        <w:t xml:space="preserve">(Euclidean distance on CLR values, compositionally appropriate) and</w:t>
       </w:r>
       <w:r>
         <w:t xml:space="preserve"> </w:t>
@@ -1790,7 +1642,7 @@
         <w:t xml:space="preserve"> </w:t>
       </w:r>
       <w:r>
-        <w:t xml:space="preserve">(on relative abundances), included for comparability with the broader microbiome literature.</w:t>
+        <w:t xml:space="preserve">(relative abundances, for comparability with the broader literature).</w:t>
       </w:r>
     </w:p>
     <w:p>
@@ -1820,32 +1672,13 @@
         <w:pStyle w:val="BodyText"/>
       </w:pPr>
       <w:r>
-        <w:rPr>
-          <w:b/>
-          <w:bCs/>
-        </w:rPr>
-        <w:t xml:space="preserve">Cohort is a composite variable; PERMANOVA cannot decompose it into technical and biological sources.</w:t>
-      </w:r>
-      <w:r>
-        <w:t xml:space="preserve"> </w:t>
-      </w:r>
-      <w:r>
         <w:t xml:space="preserve">“Cohort”</w:t>
       </w:r>
       <w:r>
         <w:t xml:space="preserve"> </w:t>
       </w:r>
       <w:r>
-        <w:t xml:space="preserve">in this study bundles sequencing platform, library preparation, recruitment site and country, clinical diagnostic ascertainment, and unmeasured dietary and lifestyle differences into a single categorical variable. A PERMANOVA or betadisper term for cohort therefore estimates the total compositional variance associated with study-of-origin, not a technical-batch-effect estimate specifically; no method here decomposes that total into technical and biological components. To assess how sensitive the cohort-versus-diagnosis variance disparity (Section 3.4) is to this composite structure, we repeated the marginal PERMANOVA and betadisper analyses on a subset restricted to three more technically comparable cohorts — Zhuang 2018, Ling 2020, and Zhu 2022, all Chinese, paired-end MiSeq 2×300bp, V3–V4 studies — while still differing in recruitment site, exact diagnostic procedure, and other unmeasured factors, so this subset is more comparable, not identical. This sensitivity used the same marginal (</w:t>
-      </w:r>
-      <w:r>
-        <w:rPr>
-          <w:rStyle w:val="VerbatimChar"/>
-        </w:rPr>
-        <w:t xml:space="preserve">by="margin"</w:t>
-      </w:r>
-      <w:r>
-        <w:t xml:space="preserve">) two-variable PERMANOVA specification and 9,999 permutations as the main four-cohort model, restricted to binary AD/CN samples from the three cohorts (n=317), with betadisper/permutest and pairwise post-hoc comparisons on the same subset.</w:t>
+        <w:t xml:space="preserve">is a composite study-of-origin variable that PERMANOVA/betadisper cannot decompose into technical and biological sources (Section 4.6). To test how sensitive the cohort-versus-diagnosis disparity (Section 3.4) is to this, we repeated the same marginal two-variable PERMANOVA/betadisper specification (9,999 permutations, with pairwise post-hoc comparisons) on a subset of three more technically comparable cohorts — Zhuang 2018, Ling 2020, Zhu 2022, all Chinese paired-end MiSeq 2×300bp V3–V4 — restricted to binary AD/CN samples (n=317).</w:t>
       </w:r>
     </w:p>
     <w:p>
@@ -1871,7 +1704,7 @@
         <w:pStyle w:val="FirstParagraph"/>
       </w:pPr>
       <w:r>
-        <w:t xml:space="preserve">We evaluated one count-based batch-correction method (ComBat-seq) and one microbiome-specific meta-analysis framework (MMUPHin), each with cohort identity as the batch variable, under two designs differing in whether diagnosis information is supplied during correction. Both designs are</w:t>
+        <w:t xml:space="preserve">We evaluated one count-based batch-correction method (ComBat-seq) and one microbiome-specific meta-analysis framework (MMUPHin), each with cohort identity as the batch variable, under two designs differing in whether diagnosis information is supplied. Both are</w:t>
       </w:r>
       <w:r>
         <w:t xml:space="preserve"> </w:t>
@@ -1884,7 +1717,7 @@
         <w:t xml:space="preserve">transductive</w:t>
       </w:r>
       <w:r>
-        <w:t xml:space="preserve">: both methods estimate batch-effect parameters jointly across every sample being corrected — including, in the downstream LOCO evaluation, the eventual held-out test cohort’s own feature values and cohort membership. Neither is prospective or inductive (neither defines a transformation applicable to a genuinely new, unseen patient without refitting); they differ only in whether the target cohort’s diagnosis labels are additionally used.</w:t>
+        <w:t xml:space="preserve">: both estimate batch-effect parameters jointly across every corrected sample, including the eventual held-out test cohort’s own feature values and cohort membership in the downstream LOCO evaluation, and neither defines a transformation applicable to a genuinely new patient without refitting.</w:t>
       </w:r>
     </w:p>
     <w:p>
@@ -2624,7 +2457,7 @@
         <w:pStyle w:val="FirstParagraph"/>
       </w:pPr>
       <w:r>
-        <w:t xml:space="preserve">DADA2 preprocessing (Section 2.2) was run using DADA2 v1.28 in R v4.3 and was not rerun for any analysis in this paper. The initial classifier, PERMANOVA, batch-correction, and SHAP analyses (Sections 2.4–2.8, excluding the peer-review additions below) used scikit-learn v1.5, lightgbm v4, shap v0.51, pandas v2.x, and numpy v1.x (Python 3.11), and vegan v2.6, sva v3.50 (ComBat-seq), and MMUPHin v1.15 in R v4.3. Analyses added in response to peer review — training-only feature-selection sensitivity, label-blind batch correction, SHAP coefficient-stability screen, matched-statistic Jaccard null (Sections 2.5.1, 2.7, 2.8), Zhu 2022 repeated-CV/permutation robustness (Section 2.4.1), paired within-cohort-vs-LOCO AUC-difference bootstrap (Section 2.5.2), pairwise beta-dispersion and Chinese-MiSeq PERMANOVA sensitivity (Section 2.6), and prevalence-restricted Jaccard null (Section 2.8) — were executed in Python 3.11.15 (scikit-learn 1.5.2, lightgbm 4.6.0, shap 0.51.0, matching the original package versions) and R 4.5.1 (vegan 2.7.1, sva 3.58.0, MMUPHin 1.24.0, newer than the initial R environment, reflecting routine system updates). This mixed provenance — original DADA2/R4.3 preprocessing feeding downstream analysis combining an unchanged Python environment with an updated R4.5.1 environment — is disclosed rather than described as uniform. Figures were generated with matplotlib v3.8 or v3.11 at 300 DPI.</w:t>
+        <w:t xml:space="preserve">DADA2 preprocessing (Section 2.2) was run using DADA2 v1.28 in R v4.3 and was not rerun for any analysis in this paper. The initial classifier, PERMANOVA, batch-correction, and SHAP analyses (Sections 2.4–2.8, excluding the subsequent additions below) used scikit-learn v1.5, lightgbm v4, shap v0.51, pandas v2.x, and numpy v1.x (Python 3.11), and vegan v2.6, sva v3.50 (ComBat-seq), and MMUPHin v1.15 in R v4.3. Subsequent robustness and sensitivity analyses (Sections 2.4.1, 2.5.1, 2.5.2, 2.6–2.8 sensitivity/robustness components) were executed in Python 3.11.15 (scikit-learn 1.5.2, lightgbm 4.6.0, shap 0.51.0, matching the original package versions) and R 4.5.1 (vegan 2.7.1, sva 3.58.0, MMUPHin 1.24.0, newer than the initial R environment, reflecting routine system updates); this mixed provenance is disclosed rather than described as uniform. Figures were generated with matplotlib v3.8 or v3.11 at 300 DPI.</w:t>
       </w:r>
     </w:p>
     <w:bookmarkEnd w:id="23"/>
@@ -2703,15 +2536,15 @@
         <w:pStyle w:val="FirstParagraph"/>
       </w:pPr>
       <w:r>
-        <w:t xml:space="preserve">Within-cohort nested cross-validation yielded AUC-ROC values broadly consistent with the original publications (Figure 2; Table 2). Logistic regression achieved AUC-ROC of 0.633 [95% CI: 0.51–0.75] for Zhuang 2018, 0.865 [0.81–0.92] for Ling 2020, 0.998 [0.99–1.00] for Zhu 2022, and 0.766 [0.66–0.86] for Kazakhstan. LightGBM yielded similar values: 0.635 [0.52–0.75], 0.862 [0.80–0.91], 0.979 [0.94–1.00], and 0.694 [0.57–0.80] respectively.</w:t>
-      </w:r>
-    </w:p>
-    <w:p>
-      <w:pPr>
-        <w:pStyle w:val="BodyText"/>
-      </w:pPr>
-      <w:r>
-        <w:t xml:space="preserve">The near-perfect within-cohort AUC for Zhu 2022 fecal samples (logistic regression 0.998; LightGBM 0.979; n=60 binary) is notable given the small sample size (30 per class): with 10-fold CV on 60 samples, each test fold contains ~6 samples, so fold-level AUC estimates can be unstable. PERMANOVA (Section 3.4) shows diagnosis explains R²=0.094 of within-cohort compositional variance (F=6.01, p=0.0001), a statistically detectable diagnosis-associated difference in this cohort. The high AUC should nonetheless be interpreted cautiously; the LOCO experiment (Section 3.3) provides a more informative assessment of transferability.</w:t>
+        <w:t xml:space="preserve">Within-cohort nested cross-validation, under strict training-only genus selection (primary analysis; Section 2.5.1), yielded AUC-ROC values broadly consistent with the original publications (Figure 2; Table 2). Logistic regression achieved AUC-ROC of 0.665 [95% CI: 0.55–0.78] for Zhuang 2018, 0.890 [0.84–0.93] for Ling 2020, 0.996 [0.98–1.00] for Zhu 2022, and 0.737 [0.62–0.84] for Kazakhstan. LightGBM yielded similar values: 0.673 [0.56–0.78], 0.842 [0.78–0.90], 0.970 [0.93–1.00], and 0.611 [0.49–0.73] respectively. Matched common-universe values (Supplementary Table S4) agree closely (|Δ|≤0.083 for every pair).</w:t>
+      </w:r>
+    </w:p>
+    <w:p>
+      <w:pPr>
+        <w:pStyle w:val="BodyText"/>
+      </w:pPr>
+      <w:r>
+        <w:t xml:space="preserve">The near-perfect within-cohort AUC for Zhu 2022 fecal samples (logistic regression 0.996; LightGBM 0.970; n=60 binary) is notable given the small sample size (30 per class): with 10-fold CV on 60 samples, each test fold contains ~6 samples, so fold-level AUC estimates can be unstable. PERMANOVA (Section 3.4) shows diagnosis explains R²=0.094 of within-cohort compositional variance (F=6.01, p=0.0001), a statistically detectable diagnosis-associated difference in this cohort. A technical-metadata assessment of this cohort’s near-perfect AUC is reported in Section 4.3; the high AUC should be interpreted cautiously for that reason in addition to sample size, and the LOCO experiment (Section 3.3) provides a more informative assessment of transferability.</w:t>
       </w:r>
     </w:p>
     <w:p>
@@ -2729,7 +2562,20 @@
         <w:t xml:space="preserve"> </w:t>
       </w:r>
       <w:r>
-        <w:t xml:space="preserve">Repeating the strict training-only nested-CV partition 50 times under different pre-specified seeds gave a mean pooled-OOF AUC of 0.9955 (SD 0.0027, range 0.9889–0.9989) for logistic regression and 0.9760 (SD 0.0103, range 0.9378–0.9944) for LightGBM (Supplementary Table S8; Supplementary Figure S5), closely matching the single-partition training-only values (0.9956 and 0.9700) and showing the near-perfect AUC is not an artifact of one fold assignment — a fold-assignment stability check, not independent replication, since the underlying 60 participants are identical across all 50 repetitions. A complementary label-permutation test under the same pipeline and fixed outer-fold partition (1,000 permutations) produced a null AUC distribution centered near chance for both models (logistic regression: mean 0.473, SD 0.102, 95% range [0.280, 0.673]; LightGBM: mean 0.472, SD 0.109, 95% range [0.264, 0.688]) — well below the observed values of 0.9956 and 0.9700 (Supplementary Table S9; Supplementary Figure S5). No permutation among the 1,000 reached the observed AUC for either model, giving an empirical p-value at the resolution floor for this permutation count (p = 1/1,001 ≈ 0.000999 for both), which we do not interpret as more precise than this floor.</w:t>
+        <w:t xml:space="preserve">Repeating the training-only nested-CV partition 50 times under different pre-specified seeds gave a mean pooled-OOF AUC of 0.9955 (SD 0.0027, range 0.9889–0.9989) for logistic regression and 0.9760 (SD 0.0103, range 0.9378–0.9944) for LightGBM (Supplementary Table S8; Supplementary Figure S5), closely matching the single-partition primary values in Table 2 (0.996 and 0.970) and showing the near-perfect AUC is not an artifact of one fold assignment — a fold-assignment stability check, not independent replication, since the underlying 60 participants are identical across all 50 repetitions. A complementary label-permutation test under the same pipeline and fixed outer-fold partition (1,000 permutations) produced a null AUC distribution centered near chance for both models (logistic regression: mean 0.473, SD 0.102, 95% range [0.280, 0.673]; LightGBM: mean 0.472, SD 0.109, 95% range [0.264, 0.688]) — well below the observed values (Supplementary Table S9; Supplementary Figure S5). No permutation among the 1,000 reached the observed AUC for either model, giving an empirical p-value at the resolution floor for this permutation count (p = 1/1,001 ≈ 0.000999 for both), which we do not interpret as more precise than this floor.</w:t>
+      </w:r>
+      <w:r>
+        <w:t xml:space="preserve"> </w:t>
+      </w:r>
+      <w:r>
+        <w:rPr>
+          <w:b/>
+          <w:bCs/>
+        </w:rPr>
+        <w:t xml:space="preserve">Neither check distinguishes biological signal from a reproducible technical confound</w:t>
+      </w:r>
+      <w:r>
+        <w:t xml:space="preserve">, which would pass both equally well (Section 4.3).</w:t>
       </w:r>
     </w:p>
     <w:p>
@@ -2745,7 +2591,7 @@
         <w:pStyle w:val="BodyText"/>
       </w:pPr>
       <w:r>
-        <w:t xml:space="preserve">For Zhuang 2018, within-cohort AUC values (0.633–0.635) were modest, consistent with the small sample size and weak within-cohort diagnosis effect observed in PERMANOVA (R²=0.017, p=0.066; Section 3.4).</w:t>
+        <w:t xml:space="preserve">For Zhuang 2018, within-cohort AUC values (0.665–0.673) were modest, consistent with the small sample size and weak within-cohort diagnosis effect observed in PERMANOVA (R²=0.017, p=0.066; Section 3.4).</w:t>
       </w:r>
     </w:p>
     <w:bookmarkEnd w:id="27"/>
@@ -2763,15 +2609,15 @@
         <w:pStyle w:val="FirstParagraph"/>
       </w:pPr>
       <w:r>
-        <w:t xml:space="preserve">LOCO cross-cohort AUC-ROC values revealed substantial and variable degradation across all cohorts and model types (Figure 3A; Table 3). Mean LOCO AUC across the four cohorts was 0.640 for logistic regression and 0.647 for LightGBM — mean drops of 0.176 and 0.146 respectively from within-cohort performance. One of eight model–cohort combinations produced LOCO AUC near chance: Zhuang 2018 with logistic regression (AUC=0.504 [0.38–0.63]).</w:t>
-      </w:r>
-    </w:p>
-    <w:p>
-      <w:pPr>
-        <w:pStyle w:val="BodyText"/>
-      </w:pPr>
-      <w:r>
-        <w:t xml:space="preserve">The largest absolute logistic regression AUC drop was Kazakhstan (0.766 → 0.564, Δ=0.202). Zhu 2022 showed the largest LightGBM drop (0.979 → 0.758, Δ=0.221); its logistic regression drop was also substantial (0.998 → 0.813, Δ=0.185). These results are consistent with LOCO models relying on predictive patterns learned from training cohorts that do not transfer fully to the held-out cohort, where cohort-specific compositional structure may contribute to within-cohort performance. Ling 2020 also experienced substantial LOCO collapse: logistic regression 0.865 → 0.678 (Δ=0.187); LightGBM 0.862 → 0.674 (Δ=0.188).</w:t>
+        <w:t xml:space="preserve">LOCO cross-cohort AUC-ROC values, under strict training-only genus selection (primary analysis; Section 2.5.1), revealed substantial and variable degradation across all cohorts and model types (Figure 3A; Table 3). Mean LOCO AUC across the four cohorts was 0.652 for logistic regression and 0.641 for LightGBM — mean drops of 0.170 and 0.133 respectively from within-cohort performance. One of eight model–cohort combinations produced LOCO AUC near chance: Zhuang 2018 with logistic regression (AUC=0.506 [0.38–0.63]); Kazakhstan LightGBM (AUC=0.525 [0.40–0.65]) was modestly, but not substantially, above chance.</w:t>
+      </w:r>
+    </w:p>
+    <w:p>
+      <w:pPr>
+        <w:pStyle w:val="BodyText"/>
+      </w:pPr>
+      <w:r>
+        <w:t xml:space="preserve">Under this primary pipeline, the largest absolute AUC drop for both models was Ling 2020 (logistic regression 0.890 → 0.679, Δ=0.210; LightGBM 0.842 → 0.653, Δ=0.188). Zhu 2022 showed the next-largest drops for both models (logistic regression 0.996 → 0.812, Δ=0.183; LightGBM 0.970 → 0.788, Δ=0.182). These results are consistent with LOCO models relying on predictive patterns learned from training cohorts that do not transfer fully to the held-out cohort, where cohort-specific compositional structure may contribute to within-cohort performance. Kazakhstan and Zhuang 2018 showed smaller, though still substantial, drops (Table 3).</w:t>
       </w:r>
     </w:p>
     <w:p>
@@ -2789,15 +2635,31 @@
         <w:t xml:space="preserve"> </w:t>
       </w:r>
       <w:r>
-        <w:t xml:space="preserve">A paired, diagnosis-stratified, participant-level bootstrap (10,000 replicates, identical resampled participants used for both AUC values in each replicate) formally compared the within-cohort and LOCO AUC difference for each of the eight cohort–model pairs, rather than relying on non-overlap of independently computed CIs, which is not a formal test of a nonzero difference. Five of eight pairs showed a 95% bootstrap CI on the delta excluding zero: Ling 2020 (logistic regression Δ=0.187, 95% CI [0.10, 0.28]; LightGBM Δ=0.188, 95% CI [0.10, 0.28]), Zhu 2022 (logistic regression Δ=0.184, 95% CI [0.07, 0.31]; LightGBM Δ=0.221, 95% CI [0.11, 0.35]), and Kazakhstan logistic regression (Δ=0.201, 95% CI [0.04, 0.36]). The remaining three — Zhuang 2018 logistic regression (Δ=0.129, 95% CI [−0.05, 0.30], proportion Δ≤0: 0.079), Zhuang 2018 LightGBM (Δ=0.070, 95% CI [−0.10, 0.24], proportion Δ≤0: 0.214), and Kazakhstan LightGBM (Δ=0.104, 95% CI [−0.05, 0.26], proportion Δ≤0: 0.092) — showed the same-signed (within-cohort higher) point estimate but a CI including zero, not formally significant despite the consistent direction across all eight pairs. The aggregate pattern of reduced cross-cohort performance is robust, but three of eight individual comparisons do not reach formal statistical support at this sample size (full results in Supplementary Table S10).</w:t>
-      </w:r>
-    </w:p>
-    <w:p>
-      <w:pPr>
-        <w:pStyle w:val="BodyText"/>
-      </w:pPr>
-      <w:r>
-        <w:t xml:space="preserve">LOCO performance was heterogeneous across cohorts: Zhu 2022 achieved the highest LOCO AUC (logistic regression 0.813), while Zhuang 2018 collapsed to near chance. Only one of eight main model–cohort combinations fell to near chance, and five of eight exceeded 0.55, so the results demonstrate substantial and variable degradation rather than uniform failure.</w:t>
+        <w:t xml:space="preserve">A paired, diagnosis-stratified, participant-level bootstrap (10,000 replicates, identical resampled participants used for both AUC values in each replicate), applied to these training-only out-of-fold predictions, formally compared the within-cohort and LOCO AUC difference for each of the eight cohort–model pairs, rather than relying on non-overlap of independently computed CIs, which is not a formal test of a nonzero difference.</w:t>
+      </w:r>
+      <w:r>
+        <w:t xml:space="preserve"> </w:t>
+      </w:r>
+      <w:r>
+        <w:rPr>
+          <w:b/>
+          <w:bCs/>
+        </w:rPr>
+        <w:t xml:space="preserve">Four of eight pairs</w:t>
+      </w:r>
+      <w:r>
+        <w:t xml:space="preserve"> </w:t>
+      </w:r>
+      <w:r>
+        <w:t xml:space="preserve">showed a 95% bootstrap CI on the delta excluding zero: Ling 2020 (logistic regression Δ=0.210, 95% CI [0.12, 0.30]; LightGBM Δ=0.188, 95% CI [0.09, 0.28]) and Zhu 2022 (logistic regression Δ=0.183, 95% CI [0.07, 0.31]; LightGBM Δ=0.182, 95% CI [0.07, 0.31]). The remaining four — Zhuang 2018 logistic regression (Δ=0.159, 95% CI [−0.02, 0.33], proportion Δ≤0: 0.038), Zhuang 2018 LightGBM (Δ=0.077, 95% CI [−0.10, 0.25], proportion Δ≤0: 0.191), Kazakhstan logistic regression (Δ=0.128, 95% CI [−0.03, 0.28], proportion Δ≤0: 0.056), and Kazakhstan LightGBM (Δ=0.086, 95% CI [−0.09, 0.27], proportion Δ≤0: 0.179) — showed the same-signed (within-cohort higher) point estimate but a CI including zero, not formally significant despite the consistent direction across all eight pairs. The common-universe reference analysis yields five of eight intervals excluding zero, whereas four of eight do so under the primary training-only pipeline, because the Kazakhstan logistic-regression interval includes zero under training-only selection. The aggregate pattern of reduced cross-cohort performance remains robust, but half of the eight individual comparisons do not reach formal statistical support at this sample size (full results in Supplementary Table S10).</w:t>
+      </w:r>
+    </w:p>
+    <w:p>
+      <w:pPr>
+        <w:pStyle w:val="BodyText"/>
+      </w:pPr>
+      <w:r>
+        <w:t xml:space="preserve">LOCO performance was heterogeneous across cohorts: Zhu 2022 achieved the highest LOCO AUC (logistic regression 0.812), while Zhuang 2018 logistic regression and Kazakhstan LightGBM fell closest to chance. Six of eight main model–cohort combinations exceeded 0.55, so the results demonstrate substantial and variable degradation rather than uniform failure.</w:t>
       </w:r>
     </w:p>
     <w:p>
@@ -2815,33 +2677,36 @@
         <w:t xml:space="preserve"> </w:t>
       </w:r>
       <w:r>
-        <w:t xml:space="preserve">confirmed generalization failure was not attributable to Kazakhstan, Zhuang 2018, or Ling 2020 individually (Supplementary Figure S3). Excluding Kazakhstan and running LOCO on the three remaining Chinese cohorts, Zhuang 2018 remained near chance (LogReg 0.512, LightGBM 0.567), showing its generalization failure is not a Kazakhstan artifact. Excluding Zhuang 2018, LOCO on the remaining three still showed AUC substantially below within-cohort baseline for Kazakhstan (LogReg 0.599, LightGBM 0.495). Excluding Ling 2020, Kazakhstan LOCO LogReg was 0.604. These results confirm the robustness of the main finding across cohort compositions.</w:t>
-      </w:r>
-    </w:p>
-    <w:p>
-      <w:pPr>
-        <w:pStyle w:val="BodyText"/>
-      </w:pPr>
-      <w:r>
-        <w:rPr>
-          <w:b/>
-          <w:bCs/>
-        </w:rPr>
-        <w:t xml:space="preserve">Training-only feature-selection sensitivity</w:t>
-      </w:r>
-      <w:r>
-        <w:t xml:space="preserve"> </w:t>
-      </w:r>
-      <w:r>
-        <w:t xml:space="preserve">(Section 2.5.1) confirmed this LOCO generalization-failure pattern is not an artifact of the global, all-cohort genus-selection step (Section 2.2). Re-deriving the retained genus set independently within each split — using only that split’s training-side samples, with the held-out cohort contributing zero information — changed LOCO AUC by at most 0.066 in either direction (largest: Kazakhstan LightGBM 0.591→0.525, Δ=−0.066; Kazakhstan LogReg 0.564→0.609, Δ=+0.045; all others ≤0.031). Retained genus count under strict training-only selection ranged from 150 (Kazakhstan, a comparatively high-prevalence cohort for many genera, excluded from feature selection during its own hold-out) to 373, versus 396 under the global rule, yet no cohort–model combination changed its qualitative classification. Within-cohort nested-CV AUC under training-only selection likewise moved by −0.083 to +0.038 (Supplementary Table S4). The global feature-selection design, while a genuine methodological limitation in principle, did not materially inflate or deflate the magnitude of the reported cross-cohort generalization failure.</w:t>
-      </w:r>
-    </w:p>
-    <w:p>
-      <w:pPr>
-        <w:pStyle w:val="BodyText"/>
-      </w:pPr>
-      <w:r>
-        <w:t xml:space="preserve">Pairwise single-cohort transfer AUC values (Figure 3B–C; Supplementary Table S1) ranged from 0.54 to 0.88 for logistic regression. The highest was Ling 2020 → Zhu 2022 (AUC=0.88), reflecting transfer between two large Chinese fecal cohorts with overlapping compositional structure; Kazakhstan → Ling 2020 also transferred reasonably (AUC=0.74). Most other pairwise AUCs clustered between 0.54 and 0.70, consistent with limited cross-cohort transferability overall.</w:t>
+        <w:t xml:space="preserve">confirmed generalization failure was not attributable to Kazakhstan, Zhuang 2018, or Ling 2020 individually (Supplementary Figure S3; this cohort-exclusion check uses the fixed common-universe schema, Section 2.5.1, since it addresses cohort-composition robustness rather than feature-selection leakage). Excluding Kazakhstan, Zhuang 2018 remained near chance (LogReg 0.512, LightGBM 0.567); excluding Zhuang 2018, Kazakhstan LOCO remained substantially below its within-cohort baseline (LogReg 0.599, LightGBM 0.495); excluding Ling 2020, Kazakhstan LOCO LogReg was 0.604 — confirming robustness across cohort compositions.</w:t>
+      </w:r>
+    </w:p>
+    <w:p>
+      <w:pPr>
+        <w:pStyle w:val="BodyText"/>
+      </w:pPr>
+      <w:r>
+        <w:t xml:space="preserve">This pattern is not an artifact of the choice of pipeline: the common-universe reference values (Supplementary Table S4) differ by at most 0.066 for every within-cohort/LOCO pair, with no qualitative-classification change — the one material disagreement is a single pairwise-transfer cell, below.</w:t>
+      </w:r>
+    </w:p>
+    <w:p>
+      <w:pPr>
+        <w:pStyle w:val="BodyText"/>
+      </w:pPr>
+      <w:r>
+        <w:t xml:space="preserve">Pairwise single-cohort transfer AUC under training-only selection (Figure 3B–C; Supplementary Table S1) ranged 0.43–0.86. One cell changed materially and is reported without smoothing:</w:t>
+      </w:r>
+      <w:r>
+        <w:t xml:space="preserve"> </w:t>
+      </w:r>
+      <w:r>
+        <w:rPr>
+          <w:b/>
+          <w:bCs/>
+        </w:rPr>
+        <w:t xml:space="preserve">Kazakhstan → Ling 2020 (LightGBM) fell from 0.58 (common-universe) to 0.44 (training-only, Δ=−0.144)</w:t>
+      </w:r>
+      <w:r>
+        <w:t xml:space="preserve">, moving that cell from weak positive transfer to below chance — the largest shift in this comparison (full matrix and common-universe comparison: Table S1). This does not change the overall heterogeneous/limited-transferability conclusion.</w:t>
       </w:r>
     </w:p>
     <w:bookmarkEnd w:id="28"/>
@@ -2984,6 +2849,34 @@
       </w:r>
       <w:r>
         <w:t xml:space="preserve">design (each sample’s own true diagnosis label used; exploratory sensitivity only) (Figure 5; Table 4).</w:t>
+      </w:r>
+      <w:r>
+        <w:t xml:space="preserve"> </w:t>
+      </w:r>
+      <w:r>
+        <w:rPr>
+          <w:b/>
+          <w:bCs/>
+        </w:rPr>
+        <w:t xml:space="preserve">This entire experiment, including its uncorrected baseline, uses the fixed common 396-genus universe</w:t>
+      </w:r>
+      <w:r>
+        <w:t xml:space="preserve"> </w:t>
+      </w:r>
+      <w:r>
+        <w:t xml:space="preserve">(Section 2.2), not the training-only pipeline primary to Table 2/3 (Section 2.5.1), since ComBat-seq/MMUPHin require one shared feature matrix — so Table 4’s</w:t>
+      </w:r>
+      <w:r>
+        <w:t xml:space="preserve"> </w:t>
+      </w:r>
+      <w:r>
+        <w:t xml:space="preserve">“Uncorrected”</w:t>
+      </w:r>
+      <w:r>
+        <w:t xml:space="preserve"> </w:t>
+      </w:r>
+      <w:r>
+        <w:t xml:space="preserve">row is this experiment’s own matched baseline, not the Table 2/3 numbers, keeping uncorrected-vs-corrected apples-to-apples within this experiment.</w:t>
       </w:r>
     </w:p>
     <w:p>
@@ -3633,7 +3526,7 @@
         <w:pStyle w:val="FirstParagraph"/>
       </w:pPr>
       <w:r>
-        <w:t xml:space="preserve">This study provides a systematic, quantitative analysis of cross-cohort generalization limitations in gut microbiome-based AD classifiers. Across four labeled cohorts, two model types, two cross-cohort evaluation designs, and two batch correction methods, we consistently observe the same result: classifiers trained within one cohort do not transfer reliably to another. The mean LOCO AUC drop of 0.176 for logistic regression and 0.146 for LightGBM, with one of eight model–cohort combinations near chance, demonstrates that within-cohort performance figures — from the original publications or from this study’s own nested-CV estimates — cannot be taken as evidence of a generalizable diagnostic signal. A formal paired bootstrap test (Section 3.3) supports this drop for five of eight cohort–model pairs at conventional significance; the remaining three show the same directional pattern without reaching formal significance at this sample size, a distinction we report rather than treat all eight as equally well-supported.</w:t>
+        <w:t xml:space="preserve">This study provides a systematic, quantitative analysis of cross-cohort generalization limitations in gut microbiome-based AD classifiers. Across four labeled cohorts, two model types, two cross-cohort evaluation designs, and two batch correction methods, we consistently observe the same result: classifiers trained within one cohort do not transfer reliably to another. The mean LOCO AUC drop of 0.170 for logistic regression and 0.133 for LightGBM (strict training-only pipeline, primary; Section 2.5.1), with one of eight model–cohort combinations near chance, demonstrates that within-cohort performance figures — from the original publications or from this study’s own nested-CV estimates — cannot be taken as evidence of a generalizable diagnostic signal. A formal paired bootstrap test (Section 3.3) supports this drop for four of eight cohort–model pairs at conventional significance; the remaining four show the same directional pattern without reaching formal significance at this sample size, a distinction we report rather than treat all eight as equally well-supported.</w:t>
       </w:r>
     </w:p>
     <w:p>
@@ -3795,15 +3688,57 @@
         <w:pStyle w:val="BodyText"/>
       </w:pPr>
       <w:r>
-        <w:t xml:space="preserve">With fecal-only samples (n=60 binary), the near-perfect within-cohort AUC (logistic regression 0.998, LightGBM 0.979) is harder to attribute to a single confound. The small sample size (30 per class) is relevant — each 10-fold CV test fold contains ~6 samples, so single-fold AUC estimates can be highly variable — and Zhu 2022 showed the largest detectable diagnosis-associated compositional effect (R²=0.094, F=6.01, p=0.0001) of the four labeled cohorts. The repeated-CV and label-permutation analyses (Section 2.4.1, Section 3.2) show this estimate is stable to fold assignment and clearly distinguishable from a chance-label null; it may nonetheless overstate population-level performance, being derived from only 60 participants without independent replication.</w:t>
-      </w:r>
-    </w:p>
-    <w:p>
-      <w:pPr>
-        <w:pStyle w:val="BodyText"/>
-      </w:pPr>
-      <w:r>
-        <w:t xml:space="preserve">The LOCO result for Zhu 2022 (logistic regression AUC=0.813, the highest LOCO value among all cohorts) is informative: classifiers trained on the other three cohorts transfer to Zhu 2022 fecal samples better than to any other cohort, suggesting the classification pattern learned here is somewhat consistent with the Chinese and Kazakh training cohorts, unlike a spurious compartment-discrimination signal that mixed-compartment pooling would have produced — a design this study avoided by excluding blood samples at the outset (Section 2.4). We recommend future AD microbiome studies report sample types explicitly and analyze each compartment independently before pooling.</w:t>
+        <w:t xml:space="preserve">With fecal-only samples (n=60 binary), the near-perfect within-cohort AUC (logistic regression 0.996, LightGBM 0.970; primary training-only pipeline, Table 2) is harder to attribute to a single confound. The small sample size (30 per class) is relevant — each 10-fold CV test fold contains ~6 samples, so single-fold AUC estimates can be highly variable — and Zhu 2022 showed the largest detectable diagnosis-associated compositional effect (R²=0.094, F=6.01, p=0.0001) of the four labeled cohorts. The repeated-CV and label-permutation analyses (Section 2.4.1, Section 3.2) show this estimate is stable to fold assignment and clearly distinguishable from a chance-label null; it may nonetheless overstate population-level performance, being derived from only 60 participants without independent replication.</w:t>
+      </w:r>
+    </w:p>
+    <w:p>
+      <w:pPr>
+        <w:pStyle w:val="BodyText"/>
+      </w:pPr>
+      <w:r>
+        <w:rPr>
+          <w:b/>
+          <w:bCs/>
+        </w:rPr>
+        <w:t xml:space="preserve">Technical-metadata assessment of sequencing-batch/diagnosis confounding.</w:t>
+      </w:r>
+      <w:r>
+        <w:t xml:space="preserve"> </w:t>
+      </w:r>
+      <w:r>
+        <w:t xml:space="preserve">To assess potential sequencing-batch/diagnosis confounding in Zhu 2022, we examined this cohort’s SRA technical metadata (full field-by-field results: Supplementary Table S14, Note S4). Mean read length (</w:t>
+      </w:r>
+      <w:r>
+        <w:rPr>
+          <w:rStyle w:val="VerbatimChar"/>
+        </w:rPr>
+        <w:t xml:space="preserve">avgLength</w:t>
+      </w:r>
+      <w:r>
+        <w:t xml:space="preserve">) is exactly associated with diagnosis (all 30 AD runs = 600 bp, all 30 CN runs = 602 bp); other technical fields (release timestamp, accession order) show a concordant but non-exact pattern, and no lane/plate/extraction-batch/run identifier is deposited, so a physical batch cannot be identified directly. Our DADA2 pipeline truncates all reads in this cohort to one fixed length regardless of raw read length, so this 2 bp difference cannot itself survive into the genus table as a length artifact — but its exact collinearity with diagnosis is consistent with a correlated technical grouping whose other consequences could still affect composition estimates. Because diagnosis and</w:t>
+      </w:r>
+      <w:r>
+        <w:t xml:space="preserve"> </w:t>
+      </w:r>
+      <w:r>
+        <w:rPr>
+          <w:rStyle w:val="VerbatimChar"/>
+        </w:rPr>
+        <w:t xml:space="preserve">avgLength</w:t>
+      </w:r>
+      <w:r>
+        <w:t xml:space="preserve"> </w:t>
+      </w:r>
+      <w:r>
+        <w:t xml:space="preserve">are exactly collinear, no adjustment can separate a technical from a biological explanation, and we do not attempt to; we report this as a disclosed, unresolved limitation, not a demonstrated artifact. Critically, the repeated-CV and label-permutation results above establish fold-stability and non-chance significance, not a biological origin — a reproducible technical confound would pass both checks equally well.</w:t>
+      </w:r>
+    </w:p>
+    <w:p>
+      <w:pPr>
+        <w:pStyle w:val="BodyText"/>
+      </w:pPr>
+      <w:r>
+        <w:t xml:space="preserve">The LOCO result for Zhu 2022 (logistic regression AUC=0.812, the highest LOCO value among all cohorts) is informative: classifiers trained on the other three cohorts transfer to Zhu 2022 fecal samples better than to any other cohort, suggesting the classification pattern learned here is somewhat consistent with the Chinese and Kazakh training cohorts, unlike a spurious compartment-discrimination signal that mixed-compartment pooling would have produced. This LOCO result does not, however, resolve the within-cohort confounding question above, since it concerns classifiers trained on other cohorts. We recommend future AD microbiome studies report sample types explicitly and deposit lane/plate/extraction-batch metadata to permit exactly this kind of check.</w:t>
       </w:r>
     </w:p>
     <w:bookmarkEnd w:id="35"/>
@@ -4101,7 +4036,23 @@
         <w:t xml:space="preserve"> </w:t>
       </w:r>
       <w:r>
-        <w:t xml:space="preserve">The search strategy (Section 2.1, Supplementary Note S1) identified five publicly available cohorts — not exhaustive of all existing AD microbiome studies, and additional non-Asian cohorts would strengthen the conclusions. Diagnostic-criteria comparability (clinical AD diagnosis vs. amyloid-PET positivity) adds biological heterogeneity not fully disentangled from technical batch effects.</w:t>
+        <w:t xml:space="preserve">The search strategy (Section 2.1, Supplementary Note S1) identified five publicly available cohorts — not exhaustive of all existing AD microbiome studies, and additional non-Asian cohorts would strengthen the conclusions.</w:t>
+      </w:r>
+      <w:r>
+        <w:t xml:space="preserve"> </w:t>
+      </w:r>
+      <w:r>
+        <w:rPr>
+          <w:b/>
+          <w:bCs/>
+        </w:rPr>
+        <w:t xml:space="preserve">Diagnostic ascertainment is not equivalent across the source studies.</w:t>
+      </w:r>
+      <w:r>
+        <w:t xml:space="preserve"> </w:t>
+      </w:r>
+      <w:r>
+        <w:t xml:space="preserve">The four labeled cohorts used a clinical AD diagnosis, per each study’s own protocol (Section 2.1), while Kim/KBASE 2022 (PERMANOVA-only) used amyloid-PET positivity in cognitively normal preclinical participants — a fundamentally different case definition (Note S1) — and even the four labeled cohorts do not share identical diagnostic instruments or thresholds. This heterogeneity can itself contribute to cross-cohort transportability differences independently of microbiome biology, and is not fully separable from technical batch effects here; we do not assume the four cohorts are diagnostically interchangeable.</w:t>
       </w:r>
     </w:p>
     <w:p>
@@ -4119,25 +4070,7 @@
         <w:t xml:space="preserve"> </w:t>
       </w:r>
       <w:r>
-        <w:t xml:space="preserve">Kazakhstan used single-end NovaSeq reads while all other cohorts used paired-end MiSeq 2×300 bp. Single-end reads yield lower taxonomic resolution at equivalent read length due to the absence of overlap-based error correction in DADA2, and different error models were fitted per cohort — a technical asymmetry that cannot be disentangled from biological population differences here.</w:t>
-      </w:r>
-    </w:p>
-    <w:p>
-      <w:pPr>
-        <w:pStyle w:val="BodyText"/>
-      </w:pPr>
-      <w:r>
-        <w:rPr>
-          <w:b/>
-          <w:bCs/>
-        </w:rPr>
-        <w:t xml:space="preserve">Kim/KBASE 2022 excluded from supervised analyses:</w:t>
-      </w:r>
-      <w:r>
-        <w:t xml:space="preserve"> </w:t>
-      </w:r>
-      <w:r>
-        <w:t xml:space="preserve">Per-sample amyloid-PET diagnosis labels are IRB-restricted. This cohort (78 participants; 18 amyloid-positive preclinical AD, 60 CN) contributed only to PERMANOVA variance decomposition.</w:t>
+        <w:t xml:space="preserve">Kazakhstan used single-end NovaSeq reads while all other cohorts used paired-end MiSeq 2×300 bp, yielding lower taxonomic resolution and different fitted error models — a technical asymmetry not disentangled from biological population differences here.</w:t>
       </w:r>
     </w:p>
     <w:p>
@@ -4155,7 +4088,7 @@
         <w:t xml:space="preserve"> </w:t>
       </w:r>
       <w:r>
-        <w:t xml:space="preserve">Three of the four labeled cohorts are Chinese, so the cross-cohort experiment is primarily a China-internal transfer (Zhuang ↔ Ling ↔ Zhu 2022) plus transfer to/from a single Central Asian cohort. A more geographically balanced design — North American, European, African populations — would be needed to generalize the conclusions further.</w:t>
+        <w:t xml:space="preserve">Three of the four labeled cohorts are Chinese, so the cross-cohort experiment is primarily a China-internal transfer (Zhuang ↔ Ling ↔ Zhu 2022) plus transfer to/from a single Central Asian cohort. A more geographically balanced design would be needed to generalize the conclusions further.</w:t>
       </w:r>
     </w:p>
     <w:p>
@@ -4185,13 +4118,238 @@
           <w:b/>
           <w:bCs/>
         </w:rPr>
-        <w:t xml:space="preserve">Global genus-selection feature universe:</w:t>
-      </w:r>
-      <w:r>
-        <w:t xml:space="preserve"> </w:t>
-      </w:r>
-      <w:r>
-        <w:t xml:space="preserve">The 396-genus feature set (Section 2.2) was selected using ≥20% prevalence pooled across all five cohorts, so the eventual held-out cohort in every LOCO/pairwise experiment contributed prevalence information. A training-only sensitivity analysis (Section 2.5.1, Section 3.3), run under the same prespecified</w:t>
+        <w:t xml:space="preserve">Zhu 2022’s near-perfect within-cohort AUC cannot be attributed to biology over a technical confound.</w:t>
+      </w:r>
+      <w:r>
+        <w:t xml:space="preserve"> </w:t>
+      </w:r>
+      <w:r>
+        <w:t xml:space="preserve">A sequencing-metadata field is exactly collinear with diagnosis in this cohort, statistically unresolvable from the available data (Section 4.3; Supplementary Table S14, Note S4); this does not extend to the LOCO or pairwise-transfer results, which involve classifiers trained on other cohorts.</w:t>
+      </w:r>
+    </w:p>
+    <w:p>
+      <w:pPr>
+        <w:pStyle w:val="BodyText"/>
+      </w:pPr>
+      <w:r>
+        <w:rPr>
+          <w:b/>
+          <w:bCs/>
+        </w:rPr>
+        <w:t xml:space="preserve">Modest per-cohort sample sizes limit precision.</w:t>
+      </w:r>
+      <w:r>
+        <w:t xml:space="preserve"> </w:t>
+      </w:r>
+      <w:r>
+        <w:t xml:space="preserve">Cohorts range from n=60 (Zhu 2022) to n=171 (Ling 2020), reflected in wide 95% CIs throughout (Tables 2–3, Supplementary Table S1) and in four of eight within-cohort-vs-LOCO differences not reaching formal significance despite a consistent direction. We report confidence intervals rather than a retrospective observed-power calculation, which would add no information beyond them; a non-significant comparison should be read as imprecise, not as evidence of no true difference.</w:t>
+      </w:r>
+    </w:p>
+    <w:p>
+      <w:pPr>
+        <w:pStyle w:val="BodyText"/>
+      </w:pPr>
+      <w:r>
+        <w:rPr>
+          <w:b/>
+          <w:bCs/>
+        </w:rPr>
+        <w:t xml:space="preserve">Common (fixed) genus universe retained for secondary descriptive/harmonization analyses.</w:t>
+      </w:r>
+      <w:r>
+        <w:t xml:space="preserve"> </w:t>
+      </w:r>
+      <w:r>
+        <w:t xml:space="preserve">Batch correction, SHAP/coefficient-stability, and PERMANOVA use the fixed 396-genus schema rather than the primary training-only pipeline (Section 2.5.1), because those analyses require one common feature space across cohorts; they should be interpreted only for their own descriptive/harmonization question, not as generalization estimates. The two pipelines agree closely for within-cohort/LOCO AUC (Supplementary Table S4) but disagree materially for one pairwise-transfer cell (Supplementary Table S1), disclosed rather than smoothed over (Section 3.3).</w:t>
+      </w:r>
+    </w:p>
+    <w:p>
+      <w:pPr>
+        <w:pStyle w:val="BodyText"/>
+      </w:pPr>
+      <w:r>
+        <w:rPr>
+          <w:b/>
+          <w:bCs/>
+        </w:rPr>
+        <w:t xml:space="preserve">PERMANOVA cannot decompose cohort into technical and biological sources, and the cohort-versus-diagnosis disparity is sensitive to which cohorts are compared.</w:t>
+      </w:r>
+      <w:r>
+        <w:t xml:space="preserve"> </w:t>
+      </w:r>
+      <w:r>
+        <w:t xml:space="preserve">“Cohort”</w:t>
+      </w:r>
+      <w:r>
+        <w:t xml:space="preserve"> </w:t>
+      </w:r>
+      <w:r>
+        <w:t xml:space="preserve">here is a composite variable bundling sequencing platform, library preparation, recruitment site, diagnostic ascertainment, and unmeasured dietary/lifestyle differences that PERMANOVA and betadisper cannot separate (Section 2.6). As shown in Section 3.4, the ~12-fold disparity across all four labeled cohorts fell to ~2.6-fold when restricted to the three more technically comparable Chinese paired-end MiSeq cohorts, so this ratio depends substantially on which cohorts are compared; readers should not extrapolate the ~12-fold figure elsewhere.</w:t>
+      </w:r>
+    </w:p>
+    <w:p>
+      <w:pPr>
+        <w:pStyle w:val="BodyText"/>
+      </w:pPr>
+      <w:r>
+        <w:rPr>
+          <w:b/>
+          <w:bCs/>
+        </w:rPr>
+        <w:t xml:space="preserve">Multiple comparisons are handled differently across analyses, by design.</w:t>
+      </w:r>
+      <w:r>
+        <w:t xml:space="preserve"> </w:t>
+      </w:r>
+      <w:r>
+        <w:t xml:space="preserve">We distinguish, and do not apply one blanket correction across, three categories: (1)</w:t>
+      </w:r>
+      <w:r>
+        <w:t xml:space="preserve"> </w:t>
+      </w:r>
+      <w:r>
+        <w:rPr>
+          <w:b/>
+          <w:bCs/>
+        </w:rPr>
+        <w:t xml:space="preserve">explicit multiplicity-corrected tests</w:t>
+      </w:r>
+      <w:r>
+        <w:t xml:space="preserve"> </w:t>
+      </w:r>
+      <w:r>
+        <w:t xml:space="preserve">— the 10 pairwise beta-dispersion comparisons (Holm/BH; Section 2.6, Table S12); (2)</w:t>
+      </w:r>
+      <w:r>
+        <w:t xml:space="preserve"> </w:t>
+      </w:r>
+      <w:r>
+        <w:rPr>
+          <w:b/>
+          <w:bCs/>
+        </w:rPr>
+        <w:t xml:space="preserve">empirical-null significance tests</w:t>
+      </w:r>
+      <w:r>
+        <w:t xml:space="preserve">, each a single pre-specified comparison against a purpose-built permutation null (Jaccard overlap, Section 2.8, Tables S7/S13; Zhu 2022 label permutation, Section 2.4.1, Table S9), not a multiple-comparisons family; and (3)</w:t>
+      </w:r>
+      <w:r>
+        <w:t xml:space="preserve"> </w:t>
+      </w:r>
+      <w:r>
+        <w:rPr>
+          <w:b/>
+          <w:bCs/>
+        </w:rPr>
+        <w:t xml:space="preserve">descriptive, non-inferential screens</w:t>
+      </w:r>
+      <w:r>
+        <w:t xml:space="preserve"> </w:t>
+      </w:r>
+      <w:r>
+        <w:t xml:space="preserve">— the coefficient-sign-stability screen (Section 2.8, Section 4.4), which receives no p-value or multiplicity correction because its 10 outer-CV folds are not independent replications. A blanket correction across all three would be inapplicable to category 3 and would not change any category-2 conclusion; we instead state which category each result belongs to.</w:t>
+      </w:r>
+    </w:p>
+    <w:p>
+      <w:pPr>
+        <w:pStyle w:val="BodyText"/>
+      </w:pPr>
+      <w:r>
+        <w:rPr>
+          <w:b/>
+          <w:bCs/>
+        </w:rPr>
+        <w:t xml:space="preserve">Jaccard overlap significance depends on the null model chosen, and one finding reverses.</w:t>
+      </w:r>
+      <w:r>
+        <w:t xml:space="preserve"> </w:t>
+      </w:r>
+      <w:r>
+        <w:t xml:space="preserve">LightGBM’s cross-cohort top-predictor overlap was significant under a shared-genus-pool null but not under a per-cohort prevalence-restricted null (Section 3.6); we report both rather than the more favorable one. Logistic regression’s overlap was significant under both nulls and is the more robust finding.</w:t>
+      </w:r>
+    </w:p>
+    <w:p>
+      <w:pPr>
+        <w:pStyle w:val="BodyText"/>
+      </w:pPr>
+      <w:r>
+        <w:rPr>
+          <w:b/>
+          <w:bCs/>
+        </w:rPr>
+        <w:t xml:space="preserve">Batch correction: two designs, both transductive, neither prospective.</w:t>
+      </w:r>
+      <w:r>
+        <w:t xml:space="preserve"> </w:t>
+      </w:r>
+      <w:r>
+        <w:t xml:space="preserve">Both the label-blind (primary) and label-informed (exploratory) designs (Section 2.7) estimate batch-effect parameters using the eventual held-out cohort’s own feature values, and neither should be extrapolated to prospective deployment. The label-informed design’s results (including the severe Kazakhstan collapse under label-informed ComBat-seq, Section 3.5) should not be read as evidence about batch correction’s effect on biological signal in general, being substantially confounded by the design itself (Section 4.2).</w:t>
+      </w:r>
+    </w:p>
+    <w:p>
+      <w:pPr>
+        <w:pStyle w:val="BodyText"/>
+      </w:pPr>
+      <w:r>
+        <w:rPr>
+          <w:b/>
+          <w:bCs/>
+        </w:rPr>
+        <w:t xml:space="preserve">Repeated cross-validation is a fold-stability check, not independent replication</w:t>
+      </w:r>
+      <w:r>
+        <w:t xml:space="preserve"> </w:t>
+      </w:r>
+      <w:r>
+        <w:t xml:space="preserve">(Section 2.4.1; see the technical-confounding bullet above for what it cannot establish). Separately, the formal paired bootstrap (Section 2.5.2, Section 3.3) found four of eight cohort–model pairs (Zhuang 2018 and Kazakhstan, both models) did not reach a 95% CI excluding zero despite all eight showing the same-signed drop — one more non-significant pair than under the common-universe pipeline (Supplementary Table S10).</w:t>
+      </w:r>
+    </w:p>
+    <w:p>
+      <w:pPr>
+        <w:pStyle w:val="BodyText"/>
+      </w:pPr>
+      <w:r>
+        <w:rPr>
+          <w:b/>
+          <w:bCs/>
+        </w:rPr>
+        <w:t xml:space="preserve">Cross-sectional design:</w:t>
+      </w:r>
+      <w:r>
+        <w:t xml:space="preserve"> </w:t>
+      </w:r>
+      <w:r>
+        <w:t xml:space="preserve">causal inference about microbiome–AD relationships is not supported; all language refers to associations and predictive performance.</w:t>
+      </w:r>
+    </w:p>
+    <w:p>
+      <w:pPr>
+        <w:pStyle w:val="BodyText"/>
+      </w:pPr>
+      <w:r>
+        <w:rPr>
+          <w:b/>
+          <w:bCs/>
+        </w:rPr>
+        <w:t xml:space="preserve">SHAP and coefficient-direction interpretability:</w:t>
+      </w:r>
+      <w:r>
+        <w:t xml:space="preserve"> </w:t>
+      </w:r>
+      <w:r>
+        <w:t xml:space="preserve">Logistic-regression direction is defined from the fitted coefficient sign, not mean signed SHAP, and is conditional on L2 regularization (below) and CLR-feature collinearity — the eight genera meeting the stability screen are empirical patterns for follow-up, not confirmed mechanistic findings (Sections 2.8, 4.4). LightGBM has no coefficient-like direction and receives no screen; LOCO SHAP values remain importance rankings only, with no assigned direction.</w:t>
+      </w:r>
+    </w:p>
+    <w:p>
+      <w:pPr>
+        <w:pStyle w:val="BodyText"/>
+      </w:pPr>
+      <w:r>
+        <w:rPr>
+          <w:b/>
+          <w:bCs/>
+        </w:rPr>
+        <w:t xml:space="preserve">Logistic regression models use L2 (ridge), not elastic-net, regularization:</w:t>
       </w:r>
       <w:r>
         <w:t xml:space="preserve"> </w:t>
@@ -4200,154 +4358,25 @@
         <w:rPr>
           <w:rStyle w:val="VerbatimChar"/>
         </w:rPr>
-        <w:t xml:space="preserve">random_state=42</w:t>
-      </w:r>
-      <w:r>
-        <w:t xml:space="preserve"> </w:t>
-      </w:r>
-      <w:r>
-        <w:t xml:space="preserve">partition used throughout, re-derived genus selection independently within every split and found LOCO AUC changed by at most 0.066 — the generalization-failure conclusion is not an artifact of this design — but global selection remains a methodological limitation in principle, and we recommend training-only feature selection as the default for future cross-cohort microbiome classifier studies. Repeated cross-validation with multiple seeds was not performed for this sensitivity analysis, so 0.066 is a single-partition estimate, not one adjusted for fold-assignment variability.</w:t>
-      </w:r>
-    </w:p>
-    <w:p>
-      <w:pPr>
-        <w:pStyle w:val="BodyText"/>
-      </w:pPr>
-      <w:r>
-        <w:rPr>
-          <w:b/>
-          <w:bCs/>
-        </w:rPr>
-        <w:t xml:space="preserve">PERMANOVA cannot decompose cohort into technical and biological sources, and the cohort-versus-diagnosis disparity is sensitive to which cohorts are compared.</w:t>
-      </w:r>
-      <w:r>
-        <w:t xml:space="preserve"> </w:t>
-      </w:r>
-      <w:r>
-        <w:t xml:space="preserve">“Cohort”</w:t>
-      </w:r>
-      <w:r>
-        <w:t xml:space="preserve"> </w:t>
-      </w:r>
-      <w:r>
-        <w:t xml:space="preserve">here is a composite variable bundling sequencing platform, library preparation, recruitment site, diagnostic ascertainment, and unmeasured dietary/lifestyle differences that PERMANOVA and betadisper cannot separate (Section 2.6). As shown in Section 3.4, the ~12-fold disparity across all four labeled cohorts fell to ~2.6-fold when restricted to the three more technically comparable Chinese paired-end MiSeq cohorts, so this ratio depends substantially on which cohorts are compared; readers should not extrapolate the ~12-fold figure elsewhere.</w:t>
-      </w:r>
-    </w:p>
-    <w:p>
-      <w:pPr>
-        <w:pStyle w:val="BodyText"/>
-      </w:pPr>
-      <w:r>
-        <w:rPr>
-          <w:b/>
-          <w:bCs/>
-        </w:rPr>
-        <w:t xml:space="preserve">Jaccard overlap significance depends on the null model chosen, and one finding reverses.</w:t>
-      </w:r>
-      <w:r>
-        <w:t xml:space="preserve"> </w:t>
-      </w:r>
-      <w:r>
-        <w:t xml:space="preserve">As shown in Section 3.6, LightGBM’s cross-cohort top-predictor overlap was significant at N=20/50 (not N=10) under a shared-genus-pool null but not significant at any tested N under a per-cohort prevalence-restricted null; we report both rather than selecting whichever supports a stronger claim. Logistic regression’s overlap was significant under both nulls at all tested N and is the more robust finding.</w:t>
-      </w:r>
-    </w:p>
-    <w:p>
-      <w:pPr>
-        <w:pStyle w:val="BodyText"/>
-      </w:pPr>
-      <w:r>
-        <w:rPr>
-          <w:b/>
-          <w:bCs/>
-        </w:rPr>
-        <w:t xml:space="preserve">Batch correction: two designs, both transductive, neither prospective.</w:t>
-      </w:r>
-      <w:r>
-        <w:t xml:space="preserve"> </w:t>
-      </w:r>
-      <w:r>
-        <w:t xml:space="preserve">As detailed in Section 2.7, both the label-blind (primary) and label-informed (exploratory) designs estimate batch-effect parameters using the eventual held-out cohort’s own feature values and cohort membership, and neither should be extrapolated to prospective deployment. The label-informed design additionally uses every sample’s true diagnosis label and is retained only as an exploratory sensitivity; its results (including the severe Kazakhstan collapse under label-informed ComBat-seq, Section 3.5) should not be read as evidence about batch correction’s effect on biological signal in general, being substantially confounded by the design itself (Section 4.2).</w:t>
-      </w:r>
-    </w:p>
-    <w:p>
-      <w:pPr>
-        <w:pStyle w:val="BodyText"/>
-      </w:pPr>
-      <w:r>
-        <w:rPr>
-          <w:b/>
-          <w:bCs/>
-        </w:rPr>
-        <w:t xml:space="preserve">Repeated cross-validation is a fold-stability check, not independent replication; three of eight within-cohort-vs-LOCO comparisons are not formally significant.</w:t>
-      </w:r>
-      <w:r>
-        <w:t xml:space="preserve"> </w:t>
-      </w:r>
-      <w:r>
-        <w:t xml:space="preserve">The 50-repetition repeated nested-CV analysis for Zhu 2022 (Section 2.4.1, Section 3.2) uses the same 60 participants every repetition, quantifying sensitivity to fold assignment, not sampling variability across independent samples; the label-permutation test in that section formally tests whether observed AUC exceeds chance. Separately, the formal paired bootstrap test of within-cohort-vs-LOCO differences (Section 2.5.2, Section 3.3) found three of eight cohort–model pairs (Zhuang 2018, both models; Kazakhstan LightGBM) did not reach a 95% CI excluding zero, despite all eight showing the same-signed drop — we report this rather than treating the aggregate mean drop as equally well-supported for every pair.</w:t>
-      </w:r>
-    </w:p>
-    <w:p>
-      <w:pPr>
-        <w:pStyle w:val="BodyText"/>
-      </w:pPr>
-      <w:r>
-        <w:rPr>
-          <w:b/>
-          <w:bCs/>
-        </w:rPr>
-        <w:t xml:space="preserve">Cross-sectional design and observational data:</w:t>
-      </w:r>
-      <w:r>
-        <w:t xml:space="preserve"> </w:t>
-      </w:r>
-      <w:r>
-        <w:t xml:space="preserve">All cohorts used cross-sectional sampling; causal inference about microbiome–AD relationships is not supported, and all language throughout refers to associations and predictive performance, not causal effects.</w:t>
-      </w:r>
-    </w:p>
-    <w:p>
-      <w:pPr>
-        <w:pStyle w:val="BodyText"/>
-      </w:pPr>
-      <w:r>
-        <w:rPr>
-          <w:b/>
-          <w:bCs/>
-        </w:rPr>
-        <w:t xml:space="preserve">SHAP and coefficient-direction interpretability limitations:</w:t>
-      </w:r>
-      <w:r>
-        <w:t xml:space="preserve"> </w:t>
-      </w:r>
-      <w:r>
-        <w:t xml:space="preserve">As detailed in Sections 2.8 and 4.4, logistic-regression direction is defined from the fitted coefficient sign, not mean signed SHAP, and is conditional on L2 regularization (see below) and CLR-feature collinearity, not a direct estimate of biological association, significance, or causal direction. The ≥8/10-fold coefficient-sign-stability screen remains descriptive rather than a formal hypothesis test — the 10 outer-CV folds are not independent replications, and we apply no multiplicity correction or per-taxon p-value — so the eight genera meeting it should be treated as empirical patterns for targeted, covariate-adjusted, independently-replicated follow-up, not confirmed mechanistic findings. LightGBM has no coefficient-like global direction and receives no directional screen. All LOCO SHAP values (either model) remain feature-importance rankings only, with no assigned cross-cohort direction, since the LOCO SHAP background and evaluation set come from systematically different populations, confounding sign with raw cross-cohort compositional differences.</w:t>
-      </w:r>
-    </w:p>
-    <w:p>
-      <w:pPr>
-        <w:pStyle w:val="BodyText"/>
-      </w:pPr>
-      <w:r>
-        <w:rPr>
-          <w:b/>
-          <w:bCs/>
-        </w:rPr>
-        <w:t xml:space="preserve">Logistic regression models use L2 (ridge), not elastic-net, regularization:</w:t>
-      </w:r>
-      <w:r>
-        <w:t xml:space="preserve"> </w:t>
-      </w:r>
-      <w:r>
-        <w:t xml:space="preserve">The logistic-regression models throughout (</w:t>
+        <w:t xml:space="preserve">solver="saga"</w:t>
+      </w:r>
+      <w:r>
+        <w:t xml:space="preserve"> </w:t>
+      </w:r>
+      <w:r>
+        <w:t xml:space="preserve">uses</w:t>
+      </w:r>
+      <w:r>
+        <w:t xml:space="preserve"> </w:t>
       </w:r>
       <w:r>
         <w:rPr>
           <w:rStyle w:val="VerbatimChar"/>
         </w:rPr>
-        <w:t xml:space="preserve">solver="saga"</w:t>
-      </w:r>
-      <w:r>
-        <w:t xml:space="preserve">) use</w:t>
+        <w:t xml:space="preserve">penalty="l2"</w:t>
+      </w:r>
+      <w:r>
+        <w:t xml:space="preserve">; the configured</w:t>
       </w:r>
       <w:r>
         <w:t xml:space="preserve"> </w:t>
@@ -4356,37 +4385,13 @@
         <w:rPr>
           <w:rStyle w:val="VerbatimChar"/>
         </w:rPr>
-        <w:t xml:space="preserve">penalty="l2"</w:t>
-      </w:r>
-      <w:r>
-        <w:t xml:space="preserve">, not</w:t>
-      </w:r>
-      <w:r>
-        <w:t xml:space="preserve"> </w:t>
-      </w:r>
-      <w:r>
-        <w:rPr>
-          <w:rStyle w:val="VerbatimChar"/>
-        </w:rPr>
-        <w:t xml:space="preserve">"elasticnet"</w:t>
-      </w:r>
-      <w:r>
-        <w:t xml:space="preserve">; an</w:t>
-      </w:r>
-      <w:r>
-        <w:t xml:space="preserve"> </w:t>
-      </w:r>
-      <w:r>
-        <w:rPr>
-          <w:rStyle w:val="VerbatimChar"/>
-        </w:rPr>
         <w:t xml:space="preserve">l1_ratio</w:t>
       </w:r>
       <w:r>
         <w:t xml:space="preserve"> </w:t>
       </w:r>
       <w:r>
-        <w:t xml:space="preserve">parameter is present in the estimator configuration but silently ignored by scikit-learn under the L2 penalty. Consequently, essentially no fitted coefficient is exactly zero in the coefficient-stability analysis (Section 2.8), since L2 regularization does not perform the sparse variable selection that elastic-net or L1 penalties would.</w:t>
+        <w:t xml:space="preserve">has no effect under L2. Essentially no fitted coefficient is exactly zero in the coefficient-stability analysis (Section 2.8), since L2 does not perform the sparse selection elastic-net or L1 would.</w:t>
       </w:r>
     </w:p>
     <w:p>
@@ -4412,7 +4417,7 @@
         <w:pStyle w:val="FirstParagraph"/>
       </w:pPr>
       <w:r>
-        <w:t xml:space="preserve">We conducted a systematic cross-cohort generalization evaluation of gut microbiome-based Alzheimer’s disease classifiers spanning five independent cohorts from three countries. Within-cohort classifiers achieved AUC-ROC of 0.633–0.998, consistent with published reports; the near-perfect Zhu 2022 result was stable across 50 repeated cross-validation partitions (mean AUC=0.9955 logistic regression, 0.9760 LightGBM) and distinguishable from a label-permutation null. LOCO AUC fell to 0.504–0.813 — a mean drop of 0.176 (logistic regression) and 0.146 (LightGBM); a formal paired bootstrap supported this drop for five of eight cohort–model pairs, with the remaining three showing the same direction without reaching formal significance at this sample size (Section 3.3). This pattern was robust to a strict training-only re-derivation of feature selection (LOCO AUC changed by at most 0.066). Batch correction under a label-blind design left mean LOCO AUC essentially unchanged (within 0.007 AUC for both methods/models) without recovering transferability; an exploratory label-informed design (which cannot estimate prospective performance) produced large, cohort-specific degradation attributable substantially to the design itself rather than the correction algorithms. PERMANOVA showed cohort identity explained substantially more compositional variance than disease status (marginal R²: 0.172 vs. 0.014, ~12-fold, across the four labeled cohorts) — not decomposable by PERMANOVA into technical and biological sources, and not by itself explaining the batch-correction results — falling to ~2.6-fold (R²=0.059 vs. 0.023) restricted to three more technically comparable cohorts, with pairwise dispersion driven predominantly by one cohort. A cohort-identity classifier achieved macro-AUC=0.9917, indicating strong cohort structure in the feature space, and generalization failure persisted across all three prespecified cohort-exclusion sensitivity configurations. Out-of-fold SHAP analysis found low taxon overlap between cohort-specific predictive signatures (mean Jaccard 0.135 logistic regression, 0.058 LightGBM); logistic regression overlap remained significant under both a matched-statistic and a prevalence-restricted null, while LightGBM was significant only under the shared-pool null — a genuine reversal, reported as such. Using a pre-specified descriptive coefficient-sign-stability screen, eight genera showed opposite, stable fitted-coefficient direction across cohorts for logistic regression; no comparable screen applies to LightGBM. These findings demonstrate substantial cross-cohort generalization limitations among the evaluated 16S datasets, and the two batch-correction methods tested under label-blind design did not recover transferability. Multi-cohort harmonized prospective studies and prospective cross-cohort validation are needed before microbiome-based AD biomarkers can achieve clinical utility.</w:t>
+        <w:t xml:space="preserve">We conducted a systematic cross-cohort generalization evaluation of gut microbiome-based Alzheimer’s disease classifiers spanning four labeled cohorts, with a fifth (Kim/KBASE 2022) contributing only to unsupervised compositional analyses. Using strict training-only genus selection as the primary classifier-performance pipeline (Section 2.5.1), within-cohort classifiers achieved AUC-ROC of 0.611–0.996; the near-perfect Zhu 2022 result withstood fold-stability and label-permutation checks, though a technical-metadata confound cannot be excluded (Section 4.3). LOCO AUC fell to 0.506–0.812 (mean drop 0.170 logistic regression, 0.133 LightGBM), formally supported for four of eight cohort–model pairs (Section 3.3), and was closely consistent with a fixed common-universe reference retained for secondary analyses, with one pairwise-transfer exception disclosed rather than smoothed over (Kazakhstan→Ling 2020, LightGBM: 0.58→0.44). Batch correction under a label-blind design left mean LOCO AUC essentially unchanged (within 0.007 AUC) without recovering transferability; an exploratory label-informed design, which cannot estimate prospective performance, produced large, cohort-specific degradation attributable substantially to the design itself. PERMANOVA showed cohort identity explained substantially more compositional variance than disease status (marginal R²: 0.172 vs. 0.014, ~12-fold), falling to ~2.6-fold restricted to three more technically comparable cohorts — not decomposable into technical and biological sources, and not by itself explaining the batch-correction results. A cohort-identity classifier achieved macro-AUC=0.9917, and generalization failure persisted across all cohort-exclusion sensitivity configurations. SHAP analysis found low cross-cohort taxon overlap (mean Jaccard 0.135 logistic regression, 0.058 LightGBM), significant for logistic regression under both null models but for LightGBM only under the less conservative one — a reversal reported as such. A pre-specified coefficient-sign-stability screen identified eight logistic-regression genera with opposite, stable direction across cohorts; no comparable screen applies to LightGBM. These findings demonstrate substantial cross-cohort generalization limitations among the evaluated 16S datasets, and that the two batch-correction methods tested under label-blind design did not recover transferability. Multi-cohort harmonized and prospective cross-cohort validation studies are needed before microbiome-based AD biomarkers can achieve clinical utility.</w:t>
       </w:r>
     </w:p>
     <w:p>
@@ -5971,7 +5976,7 @@
         <w:t xml:space="preserve"> </w:t>
       </w:r>
       <w:r>
-        <w:t xml:space="preserve">Within-cohort nested cross-validation performance (10-fold outer, 5-fold inner CV).</w:t>
+        <w:t xml:space="preserve">Within-cohort nested cross-validation performance under strict training-only genus selection (10-fold outer, 5-fold inner CV; primary analysis, Section 2.5.1).</w:t>
       </w:r>
     </w:p>
     <w:tbl>
@@ -5982,14 +5987,15 @@
         <w:tblLook w:firstRow="1" w:lastRow="0" w:firstColumn="0" w:lastColumn="0" w:noHBand="0" w:noVBand="0" w:val="0020"/>
       </w:tblPr>
       <w:tblGrid>
-        <w:gridCol w:w="990"/>
-        <w:gridCol w:w="990"/>
-        <w:gridCol w:w="990"/>
-        <w:gridCol w:w="990"/>
-        <w:gridCol w:w="990"/>
-        <w:gridCol w:w="990"/>
-        <w:gridCol w:w="990"/>
-        <w:gridCol w:w="990"/>
+        <w:gridCol w:w="879"/>
+        <w:gridCol w:w="879"/>
+        <w:gridCol w:w="879"/>
+        <w:gridCol w:w="879"/>
+        <w:gridCol w:w="879"/>
+        <w:gridCol w:w="879"/>
+        <w:gridCol w:w="879"/>
+        <w:gridCol w:w="879"/>
+        <w:gridCol w:w="879"/>
       </w:tblGrid>
       <w:tr>
         <w:trPr>
@@ -6079,6 +6085,17 @@
               <w:pStyle w:val="Compact"/>
             </w:pPr>
             <w:r>
+              <w:t xml:space="preserve">N Genera (Range)</w:t>
+            </w:r>
+          </w:p>
+        </w:tc>
+        <w:tc>
+          <w:tcPr/>
+          <w:p>
+            <w:pPr>
+              <w:pStyle w:val="Compact"/>
+            </w:pPr>
+            <w:r>
               <w:t xml:space="preserve">Originally Reported AUC</w:t>
             </w:r>
           </w:p>
@@ -6125,40 +6142,51 @@
               <w:pStyle w:val="Compact"/>
             </w:pPr>
             <w:r>
-              <w:t xml:space="preserve">0.633</w:t>
-            </w:r>
-          </w:p>
-        </w:tc>
-        <w:tc>
-          <w:tcPr/>
-          <w:p>
-            <w:pPr>
-              <w:pStyle w:val="Compact"/>
-            </w:pPr>
-            <w:r>
-              <w:t xml:space="preserve">[0.51–0.75]</w:t>
-            </w:r>
-          </w:p>
-        </w:tc>
-        <w:tc>
-          <w:tcPr/>
-          <w:p>
-            <w:pPr>
-              <w:pStyle w:val="Compact"/>
-            </w:pPr>
-            <w:r>
-              <w:t xml:space="preserve">0.814</w:t>
-            </w:r>
-          </w:p>
-        </w:tc>
-        <w:tc>
-          <w:tcPr/>
-          <w:p>
-            <w:pPr>
-              <w:pStyle w:val="Compact"/>
-            </w:pPr>
-            <w:r>
-              <w:t xml:space="preserve">0.512</w:t>
+              <w:t xml:space="preserve">0.665</w:t>
+            </w:r>
+          </w:p>
+        </w:tc>
+        <w:tc>
+          <w:tcPr/>
+          <w:p>
+            <w:pPr>
+              <w:pStyle w:val="Compact"/>
+            </w:pPr>
+            <w:r>
+              <w:t xml:space="preserve">[0.55–0.78]</w:t>
+            </w:r>
+          </w:p>
+        </w:tc>
+        <w:tc>
+          <w:tcPr/>
+          <w:p>
+            <w:pPr>
+              <w:pStyle w:val="Compact"/>
+            </w:pPr>
+            <w:r>
+              <w:t xml:space="preserve">0.767</w:t>
+            </w:r>
+          </w:p>
+        </w:tc>
+        <w:tc>
+          <w:tcPr/>
+          <w:p>
+            <w:pPr>
+              <w:pStyle w:val="Compact"/>
+            </w:pPr>
+            <w:r>
+              <w:t xml:space="preserve">0.581</w:t>
+            </w:r>
+          </w:p>
+        </w:tc>
+        <w:tc>
+          <w:tcPr/>
+          <w:p>
+            <w:pPr>
+              <w:pStyle w:val="Compact"/>
+            </w:pPr>
+            <w:r>
+              <w:t xml:space="preserve">129–132</w:t>
             </w:r>
           </w:p>
         </w:tc>
@@ -6215,40 +6243,51 @@
               <w:pStyle w:val="Compact"/>
             </w:pPr>
             <w:r>
-              <w:t xml:space="preserve">0.635</w:t>
-            </w:r>
-          </w:p>
-        </w:tc>
-        <w:tc>
-          <w:tcPr/>
-          <w:p>
-            <w:pPr>
-              <w:pStyle w:val="Compact"/>
-            </w:pPr>
-            <w:r>
-              <w:t xml:space="preserve">[0.52–0.75]</w:t>
-            </w:r>
-          </w:p>
-        </w:tc>
-        <w:tc>
-          <w:tcPr/>
-          <w:p>
-            <w:pPr>
-              <w:pStyle w:val="Compact"/>
-            </w:pPr>
-            <w:r>
-              <w:t xml:space="preserve">0.884</w:t>
-            </w:r>
-          </w:p>
-        </w:tc>
-        <w:tc>
-          <w:tcPr/>
-          <w:p>
-            <w:pPr>
-              <w:pStyle w:val="Compact"/>
-            </w:pPr>
-            <w:r>
-              <w:t xml:space="preserve">0.442</w:t>
+              <w:t xml:space="preserve">0.673</w:t>
+            </w:r>
+          </w:p>
+        </w:tc>
+        <w:tc>
+          <w:tcPr/>
+          <w:p>
+            <w:pPr>
+              <w:pStyle w:val="Compact"/>
+            </w:pPr>
+            <w:r>
+              <w:t xml:space="preserve">[0.56–0.78]</w:t>
+            </w:r>
+          </w:p>
+        </w:tc>
+        <w:tc>
+          <w:tcPr/>
+          <w:p>
+            <w:pPr>
+              <w:pStyle w:val="Compact"/>
+            </w:pPr>
+            <w:r>
+              <w:t xml:space="preserve">0.721</w:t>
+            </w:r>
+          </w:p>
+        </w:tc>
+        <w:tc>
+          <w:tcPr/>
+          <w:p>
+            <w:pPr>
+              <w:pStyle w:val="Compact"/>
+            </w:pPr>
+            <w:r>
+              <w:t xml:space="preserve">0.628</w:t>
+            </w:r>
+          </w:p>
+        </w:tc>
+        <w:tc>
+          <w:tcPr/>
+          <w:p>
+            <w:pPr>
+              <w:pStyle w:val="Compact"/>
+            </w:pPr>
+            <w:r>
+              <w:t xml:space="preserve">129–132</w:t>
             </w:r>
           </w:p>
         </w:tc>
@@ -6305,40 +6344,51 @@
               <w:pStyle w:val="Compact"/>
             </w:pPr>
             <w:r>
-              <w:t xml:space="preserve">0.865</w:t>
-            </w:r>
-          </w:p>
-        </w:tc>
-        <w:tc>
-          <w:tcPr/>
-          <w:p>
-            <w:pPr>
-              <w:pStyle w:val="Compact"/>
-            </w:pPr>
-            <w:r>
-              <w:t xml:space="preserve">[0.81–0.92]</w:t>
-            </w:r>
-          </w:p>
-        </w:tc>
-        <w:tc>
-          <w:tcPr/>
-          <w:p>
-            <w:pPr>
-              <w:pStyle w:val="Compact"/>
-            </w:pPr>
-            <w:r>
-              <w:t xml:space="preserve">0.780</w:t>
-            </w:r>
-          </w:p>
-        </w:tc>
-        <w:tc>
-          <w:tcPr/>
-          <w:p>
-            <w:pPr>
-              <w:pStyle w:val="Compact"/>
-            </w:pPr>
-            <w:r>
-              <w:t xml:space="preserve">0.859</w:t>
+              <w:t xml:space="preserve">0.890</w:t>
+            </w:r>
+          </w:p>
+        </w:tc>
+        <w:tc>
+          <w:tcPr/>
+          <w:p>
+            <w:pPr>
+              <w:pStyle w:val="Compact"/>
+            </w:pPr>
+            <w:r>
+              <w:t xml:space="preserve">[0.84–0.93]</w:t>
+            </w:r>
+          </w:p>
+        </w:tc>
+        <w:tc>
+          <w:tcPr/>
+          <w:p>
+            <w:pPr>
+              <w:pStyle w:val="Compact"/>
+            </w:pPr>
+            <w:r>
+              <w:t xml:space="preserve">0.750</w:t>
+            </w:r>
+          </w:p>
+        </w:tc>
+        <w:tc>
+          <w:tcPr/>
+          <w:p>
+            <w:pPr>
+              <w:pStyle w:val="Compact"/>
+            </w:pPr>
+            <w:r>
+              <w:t xml:space="preserve">0.944</w:t>
+            </w:r>
+          </w:p>
+        </w:tc>
+        <w:tc>
+          <w:tcPr/>
+          <w:p>
+            <w:pPr>
+              <w:pStyle w:val="Compact"/>
+            </w:pPr>
+            <w:r>
+              <w:t xml:space="preserve">125–129</w:t>
             </w:r>
           </w:p>
         </w:tc>
@@ -6395,40 +6445,51 @@
               <w:pStyle w:val="Compact"/>
             </w:pPr>
             <w:r>
-              <w:t xml:space="preserve">0.862</w:t>
-            </w:r>
-          </w:p>
-        </w:tc>
-        <w:tc>
-          <w:tcPr/>
-          <w:p>
-            <w:pPr>
-              <w:pStyle w:val="Compact"/>
-            </w:pPr>
-            <w:r>
-              <w:t xml:space="preserve">[0.80–0.91]</w:t>
-            </w:r>
-          </w:p>
-        </w:tc>
-        <w:tc>
-          <w:tcPr/>
-          <w:p>
-            <w:pPr>
-              <w:pStyle w:val="Compact"/>
-            </w:pPr>
-            <w:r>
-              <w:t xml:space="preserve">0.740</w:t>
-            </w:r>
-          </w:p>
-        </w:tc>
-        <w:tc>
-          <w:tcPr/>
-          <w:p>
-            <w:pPr>
-              <w:pStyle w:val="Compact"/>
-            </w:pPr>
-            <w:r>
-              <w:t xml:space="preserve">0.887</w:t>
+              <w:t xml:space="preserve">0.842</w:t>
+            </w:r>
+          </w:p>
+        </w:tc>
+        <w:tc>
+          <w:tcPr/>
+          <w:p>
+            <w:pPr>
+              <w:pStyle w:val="Compact"/>
+            </w:pPr>
+            <w:r>
+              <w:t xml:space="preserve">[0.78–0.90]</w:t>
+            </w:r>
+          </w:p>
+        </w:tc>
+        <w:tc>
+          <w:tcPr/>
+          <w:p>
+            <w:pPr>
+              <w:pStyle w:val="Compact"/>
+            </w:pPr>
+            <w:r>
+              <w:t xml:space="preserve">0.720</w:t>
+            </w:r>
+          </w:p>
+        </w:tc>
+        <w:tc>
+          <w:tcPr/>
+          <w:p>
+            <w:pPr>
+              <w:pStyle w:val="Compact"/>
+            </w:pPr>
+            <w:r>
+              <w:t xml:space="preserve">0.930</w:t>
+            </w:r>
+          </w:p>
+        </w:tc>
+        <w:tc>
+          <w:tcPr/>
+          <w:p>
+            <w:pPr>
+              <w:pStyle w:val="Compact"/>
+            </w:pPr>
+            <w:r>
+              <w:t xml:space="preserve">125–129</w:t>
             </w:r>
           </w:p>
         </w:tc>
@@ -6485,29 +6546,29 @@
               <w:pStyle w:val="Compact"/>
             </w:pPr>
             <w:r>
-              <w:t xml:space="preserve">0.998</w:t>
-            </w:r>
-          </w:p>
-        </w:tc>
-        <w:tc>
-          <w:tcPr/>
-          <w:p>
-            <w:pPr>
-              <w:pStyle w:val="Compact"/>
-            </w:pPr>
-            <w:r>
-              <w:t xml:space="preserve">[0.99–1.00]</w:t>
-            </w:r>
-          </w:p>
-        </w:tc>
-        <w:tc>
-          <w:tcPr/>
-          <w:p>
-            <w:pPr>
-              <w:pStyle w:val="Compact"/>
-            </w:pPr>
-            <w:r>
-              <w:t xml:space="preserve">0.967</w:t>
+              <w:t xml:space="preserve">0.996</w:t>
+            </w:r>
+          </w:p>
+        </w:tc>
+        <w:tc>
+          <w:tcPr/>
+          <w:p>
+            <w:pPr>
+              <w:pStyle w:val="Compact"/>
+            </w:pPr>
+            <w:r>
+              <w:t xml:space="preserve">[0.98–1.00]</w:t>
+            </w:r>
+          </w:p>
+        </w:tc>
+        <w:tc>
+          <w:tcPr/>
+          <w:p>
+            <w:pPr>
+              <w:pStyle w:val="Compact"/>
+            </w:pPr>
+            <w:r>
+              <w:t xml:space="preserve">0.933</w:t>
             </w:r>
           </w:p>
         </w:tc>
@@ -6519,6 +6580,17 @@
             </w:pPr>
             <w:r>
               <w:t xml:space="preserve">1.000</w:t>
+            </w:r>
+          </w:p>
+        </w:tc>
+        <w:tc>
+          <w:tcPr/>
+          <w:p>
+            <w:pPr>
+              <w:pStyle w:val="Compact"/>
+            </w:pPr>
+            <w:r>
+              <w:t xml:space="preserve">112–119</w:t>
             </w:r>
           </w:p>
         </w:tc>
@@ -6575,40 +6647,51 @@
               <w:pStyle w:val="Compact"/>
             </w:pPr>
             <w:r>
-              <w:t xml:space="preserve">0.979</w:t>
-            </w:r>
-          </w:p>
-        </w:tc>
-        <w:tc>
-          <w:tcPr/>
-          <w:p>
-            <w:pPr>
-              <w:pStyle w:val="Compact"/>
-            </w:pPr>
-            <w:r>
-              <w:t xml:space="preserve">[0.94–1.00]</w:t>
-            </w:r>
-          </w:p>
-        </w:tc>
-        <w:tc>
-          <w:tcPr/>
-          <w:p>
-            <w:pPr>
-              <w:pStyle w:val="Compact"/>
-            </w:pPr>
-            <w:r>
-              <w:t xml:space="preserve">0.900</w:t>
-            </w:r>
-          </w:p>
-        </w:tc>
-        <w:tc>
-          <w:tcPr/>
-          <w:p>
-            <w:pPr>
-              <w:pStyle w:val="Compact"/>
-            </w:pPr>
-            <w:r>
-              <w:t xml:space="preserve">1.000</w:t>
+              <w:t xml:space="preserve">0.970</w:t>
+            </w:r>
+          </w:p>
+        </w:tc>
+        <w:tc>
+          <w:tcPr/>
+          <w:p>
+            <w:pPr>
+              <w:pStyle w:val="Compact"/>
+            </w:pPr>
+            <w:r>
+              <w:t xml:space="preserve">[0.93–1.00]</w:t>
+            </w:r>
+          </w:p>
+        </w:tc>
+        <w:tc>
+          <w:tcPr/>
+          <w:p>
+            <w:pPr>
+              <w:pStyle w:val="Compact"/>
+            </w:pPr>
+            <w:r>
+              <w:t xml:space="preserve">0.933</w:t>
+            </w:r>
+          </w:p>
+        </w:tc>
+        <w:tc>
+          <w:tcPr/>
+          <w:p>
+            <w:pPr>
+              <w:pStyle w:val="Compact"/>
+            </w:pPr>
+            <w:r>
+              <w:t xml:space="preserve">0.933</w:t>
+            </w:r>
+          </w:p>
+        </w:tc>
+        <w:tc>
+          <w:tcPr/>
+          <w:p>
+            <w:pPr>
+              <w:pStyle w:val="Compact"/>
+            </w:pPr>
+            <w:r>
+              <w:t xml:space="preserve">112–119</w:t>
             </w:r>
           </w:p>
         </w:tc>
@@ -6665,40 +6748,51 @@
               <w:pStyle w:val="Compact"/>
             </w:pPr>
             <w:r>
-              <w:t xml:space="preserve">0.766</w:t>
-            </w:r>
-          </w:p>
-        </w:tc>
-        <w:tc>
-          <w:tcPr/>
-          <w:p>
-            <w:pPr>
-              <w:pStyle w:val="Compact"/>
-            </w:pPr>
-            <w:r>
-              <w:t xml:space="preserve">[0.66–0.86]</w:t>
-            </w:r>
-          </w:p>
-        </w:tc>
-        <w:tc>
-          <w:tcPr/>
-          <w:p>
-            <w:pPr>
-              <w:pStyle w:val="Compact"/>
-            </w:pPr>
-            <w:r>
-              <w:t xml:space="preserve">0.829</w:t>
-            </w:r>
-          </w:p>
-        </w:tc>
-        <w:tc>
-          <w:tcPr/>
-          <w:p>
-            <w:pPr>
-              <w:pStyle w:val="Compact"/>
-            </w:pPr>
-            <w:r>
-              <w:t xml:space="preserve">0.605</w:t>
+              <w:t xml:space="preserve">0.737</w:t>
+            </w:r>
+          </w:p>
+        </w:tc>
+        <w:tc>
+          <w:tcPr/>
+          <w:p>
+            <w:pPr>
+              <w:pStyle w:val="Compact"/>
+            </w:pPr>
+            <w:r>
+              <w:t xml:space="preserve">[0.62–0.84]</w:t>
+            </w:r>
+          </w:p>
+        </w:tc>
+        <w:tc>
+          <w:tcPr/>
+          <w:p>
+            <w:pPr>
+              <w:pStyle w:val="Compact"/>
+            </w:pPr>
+            <w:r>
+              <w:t xml:space="preserve">0.732</w:t>
+            </w:r>
+          </w:p>
+        </w:tc>
+        <w:tc>
+          <w:tcPr/>
+          <w:p>
+            <w:pPr>
+              <w:pStyle w:val="Compact"/>
+            </w:pPr>
+            <w:r>
+              <w:t xml:space="preserve">0.744</w:t>
+            </w:r>
+          </w:p>
+        </w:tc>
+        <w:tc>
+          <w:tcPr/>
+          <w:p>
+            <w:pPr>
+              <w:pStyle w:val="Compact"/>
+            </w:pPr>
+            <w:r>
+              <w:t xml:space="preserve">342–361</w:t>
             </w:r>
           </w:p>
         </w:tc>
@@ -6755,40 +6849,51 @@
               <w:pStyle w:val="Compact"/>
             </w:pPr>
             <w:r>
-              <w:t xml:space="preserve">0.694</w:t>
-            </w:r>
-          </w:p>
-        </w:tc>
-        <w:tc>
-          <w:tcPr/>
-          <w:p>
-            <w:pPr>
-              <w:pStyle w:val="Compact"/>
-            </w:pPr>
-            <w:r>
-              <w:t xml:space="preserve">[0.57–0.80]</w:t>
-            </w:r>
-          </w:p>
-        </w:tc>
-        <w:tc>
-          <w:tcPr/>
-          <w:p>
-            <w:pPr>
-              <w:pStyle w:val="Compact"/>
-            </w:pPr>
-            <w:r>
-              <w:t xml:space="preserve">0.610</w:t>
-            </w:r>
-          </w:p>
-        </w:tc>
-        <w:tc>
-          <w:tcPr/>
-          <w:p>
-            <w:pPr>
-              <w:pStyle w:val="Compact"/>
-            </w:pPr>
-            <w:r>
-              <w:t xml:space="preserve">0.767</w:t>
+              <w:t xml:space="preserve">0.611</w:t>
+            </w:r>
+          </w:p>
+        </w:tc>
+        <w:tc>
+          <w:tcPr/>
+          <w:p>
+            <w:pPr>
+              <w:pStyle w:val="Compact"/>
+            </w:pPr>
+            <w:r>
+              <w:t xml:space="preserve">[0.49–0.73]</w:t>
+            </w:r>
+          </w:p>
+        </w:tc>
+        <w:tc>
+          <w:tcPr/>
+          <w:p>
+            <w:pPr>
+              <w:pStyle w:val="Compact"/>
+            </w:pPr>
+            <w:r>
+              <w:t xml:space="preserve">0.415</w:t>
+            </w:r>
+          </w:p>
+        </w:tc>
+        <w:tc>
+          <w:tcPr/>
+          <w:p>
+            <w:pPr>
+              <w:pStyle w:val="Compact"/>
+            </w:pPr>
+            <w:r>
+              <w:t xml:space="preserve">0.814</w:t>
+            </w:r>
+          </w:p>
+        </w:tc>
+        <w:tc>
+          <w:tcPr/>
+          <w:p>
+            <w:pPr>
+              <w:pStyle w:val="Compact"/>
+            </w:pPr>
+            <w:r>
+              <w:t xml:space="preserve">342–361</w:t>
             </w:r>
           </w:p>
         </w:tc>
@@ -6810,7 +6915,19 @@
         <w:pStyle w:val="BodyText"/>
       </w:pPr>
       <w:r>
-        <w:t xml:space="preserve">N=60 for Zhu 2022 binary analysis (30 AD + 30 CN fecal samples; MCI and blood samples excluded). Originally reported AUC values are approximate, derived from the primary publications using the best-performing classifier reported; direct numerical comparison is limited by differences in cohort subset, model type, and validation design. All 95% CIs in this table use the diagnosis-stratified, participant-level bootstrap of Section 2.5.2 (10,000 replicates), which states which other tables/figures use this procedure versus the original 1,000-resample bootstrap.</w:t>
+        <w:t xml:space="preserve">N=60 for Zhu 2022 binary analysis (30 AD + 30 CN fecal samples; MCI and blood samples excluded). Genus selection was re-derived independently within every one of the 10 outer folds, using only that fold’s training-side samples (Section 2.5.1);</w:t>
+      </w:r>
+      <w:r>
+        <w:t xml:space="preserve"> </w:t>
+      </w:r>
+      <w:r>
+        <w:t xml:space="preserve">“N Genera (Range)”</w:t>
+      </w:r>
+      <w:r>
+        <w:t xml:space="preserve"> </w:t>
+      </w:r>
+      <w:r>
+        <w:t xml:space="preserve">gives the min–max retained-genus count across those 10 folds, versus 396 under the fixed common-universe schema (Table S4). Originally reported AUC values are approximate, derived from the primary publications using the best-performing classifier reported; direct numerical comparison is limited by differences in cohort subset, model type, and validation design. All 95% CIs in this table use the diagnosis-stratified, participant-level paired bootstrap of Section 2.5.2 (10,000 replicates), applied to these training-only out-of-fold predictions. The corresponding common-universe (fixed 396-genus) reference values are given in Supplementary Table S4.</w:t>
       </w:r>
     </w:p>
     <w:p>
@@ -6828,7 +6945,7 @@
         <w:t xml:space="preserve"> </w:t>
       </w:r>
       <w:r>
-        <w:t xml:space="preserve">LOCO cross-cohort AUC-ROC versus within-cohort nested CV baseline.</w:t>
+        <w:t xml:space="preserve">LOCO cross-cohort AUC-ROC versus within-cohort nested CV baseline, both under strict training-only genus selection (primary analysis, Section 2.5.1).</w:t>
       </w:r>
     </w:p>
     <w:tbl>
@@ -6947,18 +7064,18 @@
               <w:pStyle w:val="Compact"/>
             </w:pPr>
             <w:r>
-              <w:t xml:space="preserve">0.633</w:t>
-            </w:r>
-          </w:p>
-        </w:tc>
-        <w:tc>
-          <w:tcPr/>
-          <w:p>
-            <w:pPr>
-              <w:pStyle w:val="Compact"/>
-            </w:pPr>
-            <w:r>
-              <w:t xml:space="preserve">0.504</w:t>
+              <w:t xml:space="preserve">0.665</w:t>
+            </w:r>
+          </w:p>
+        </w:tc>
+        <w:tc>
+          <w:tcPr/>
+          <w:p>
+            <w:pPr>
+              <w:pStyle w:val="Compact"/>
+            </w:pPr>
+            <w:r>
+              <w:t xml:space="preserve">0.506</w:t>
             </w:r>
           </w:p>
         </w:tc>
@@ -6980,7 +7097,7 @@
               <w:pStyle w:val="Compact"/>
             </w:pPr>
             <w:r>
-              <w:t xml:space="preserve">0.129</w:t>
+              <w:t xml:space="preserve">0.159</w:t>
             </w:r>
           </w:p>
         </w:tc>
@@ -7015,40 +7132,40 @@
               <w:pStyle w:val="Compact"/>
             </w:pPr>
             <w:r>
-              <w:t xml:space="preserve">0.635</w:t>
-            </w:r>
-          </w:p>
-        </w:tc>
-        <w:tc>
-          <w:tcPr/>
-          <w:p>
-            <w:pPr>
-              <w:pStyle w:val="Compact"/>
-            </w:pPr>
-            <w:r>
-              <w:t xml:space="preserve">0.565</w:t>
-            </w:r>
-          </w:p>
-        </w:tc>
-        <w:tc>
-          <w:tcPr/>
-          <w:p>
-            <w:pPr>
-              <w:pStyle w:val="Compact"/>
-            </w:pPr>
-            <w:r>
-              <w:t xml:space="preserve">[0.44–0.69]</w:t>
-            </w:r>
-          </w:p>
-        </w:tc>
-        <w:tc>
-          <w:tcPr/>
-          <w:p>
-            <w:pPr>
-              <w:pStyle w:val="Compact"/>
-            </w:pPr>
-            <w:r>
-              <w:t xml:space="preserve">0.070</w:t>
+              <w:t xml:space="preserve">0.673</w:t>
+            </w:r>
+          </w:p>
+        </w:tc>
+        <w:tc>
+          <w:tcPr/>
+          <w:p>
+            <w:pPr>
+              <w:pStyle w:val="Compact"/>
+            </w:pPr>
+            <w:r>
+              <w:t xml:space="preserve">0.596</w:t>
+            </w:r>
+          </w:p>
+        </w:tc>
+        <w:tc>
+          <w:tcPr/>
+          <w:p>
+            <w:pPr>
+              <w:pStyle w:val="Compact"/>
+            </w:pPr>
+            <w:r>
+              <w:t xml:space="preserve">[0.47–0.72]</w:t>
+            </w:r>
+          </w:p>
+        </w:tc>
+        <w:tc>
+          <w:tcPr/>
+          <w:p>
+            <w:pPr>
+              <w:pStyle w:val="Compact"/>
+            </w:pPr>
+            <w:r>
+              <w:t xml:space="preserve">0.077</w:t>
             </w:r>
           </w:p>
         </w:tc>
@@ -7083,40 +7200,40 @@
               <w:pStyle w:val="Compact"/>
             </w:pPr>
             <w:r>
-              <w:t xml:space="preserve">0.865</w:t>
-            </w:r>
-          </w:p>
-        </w:tc>
-        <w:tc>
-          <w:tcPr/>
-          <w:p>
-            <w:pPr>
-              <w:pStyle w:val="Compact"/>
-            </w:pPr>
-            <w:r>
-              <w:t xml:space="preserve">0.678</w:t>
-            </w:r>
-          </w:p>
-        </w:tc>
-        <w:tc>
-          <w:tcPr/>
-          <w:p>
-            <w:pPr>
-              <w:pStyle w:val="Compact"/>
-            </w:pPr>
-            <w:r>
-              <w:t xml:space="preserve">[0.59–0.75]</w:t>
-            </w:r>
-          </w:p>
-        </w:tc>
-        <w:tc>
-          <w:tcPr/>
-          <w:p>
-            <w:pPr>
-              <w:pStyle w:val="Compact"/>
-            </w:pPr>
-            <w:r>
-              <w:t xml:space="preserve">0.187</w:t>
+              <w:t xml:space="preserve">0.890</w:t>
+            </w:r>
+          </w:p>
+        </w:tc>
+        <w:tc>
+          <w:tcPr/>
+          <w:p>
+            <w:pPr>
+              <w:pStyle w:val="Compact"/>
+            </w:pPr>
+            <w:r>
+              <w:t xml:space="preserve">0.679</w:t>
+            </w:r>
+          </w:p>
+        </w:tc>
+        <w:tc>
+          <w:tcPr/>
+          <w:p>
+            <w:pPr>
+              <w:pStyle w:val="Compact"/>
+            </w:pPr>
+            <w:r>
+              <w:t xml:space="preserve">[0.60–0.76]</w:t>
+            </w:r>
+          </w:p>
+        </w:tc>
+        <w:tc>
+          <w:tcPr/>
+          <w:p>
+            <w:pPr>
+              <w:pStyle w:val="Compact"/>
+            </w:pPr>
+            <w:r>
+              <w:t xml:space="preserve">0.210</w:t>
             </w:r>
           </w:p>
         </w:tc>
@@ -7151,29 +7268,29 @@
               <w:pStyle w:val="Compact"/>
             </w:pPr>
             <w:r>
-              <w:t xml:space="preserve">0.862</w:t>
-            </w:r>
-          </w:p>
-        </w:tc>
-        <w:tc>
-          <w:tcPr/>
-          <w:p>
-            <w:pPr>
-              <w:pStyle w:val="Compact"/>
-            </w:pPr>
-            <w:r>
-              <w:t xml:space="preserve">0.674</w:t>
-            </w:r>
-          </w:p>
-        </w:tc>
-        <w:tc>
-          <w:tcPr/>
-          <w:p>
-            <w:pPr>
-              <w:pStyle w:val="Compact"/>
-            </w:pPr>
-            <w:r>
-              <w:t xml:space="preserve">[0.59–0.75]</w:t>
+              <w:t xml:space="preserve">0.842</w:t>
+            </w:r>
+          </w:p>
+        </w:tc>
+        <w:tc>
+          <w:tcPr/>
+          <w:p>
+            <w:pPr>
+              <w:pStyle w:val="Compact"/>
+            </w:pPr>
+            <w:r>
+              <w:t xml:space="preserve">0.653</w:t>
+            </w:r>
+          </w:p>
+        </w:tc>
+        <w:tc>
+          <w:tcPr/>
+          <w:p>
+            <w:pPr>
+              <w:pStyle w:val="Compact"/>
+            </w:pPr>
+            <w:r>
+              <w:t xml:space="preserve">[0.57–0.73]</w:t>
             </w:r>
           </w:p>
         </w:tc>
@@ -7219,18 +7336,18 @@
               <w:pStyle w:val="Compact"/>
             </w:pPr>
             <w:r>
-              <w:t xml:space="preserve">0.998</w:t>
-            </w:r>
-          </w:p>
-        </w:tc>
-        <w:tc>
-          <w:tcPr/>
-          <w:p>
-            <w:pPr>
-              <w:pStyle w:val="Compact"/>
-            </w:pPr>
-            <w:r>
-              <w:t xml:space="preserve">0.813</w:t>
+              <w:t xml:space="preserve">0.996</w:t>
+            </w:r>
+          </w:p>
+        </w:tc>
+        <w:tc>
+          <w:tcPr/>
+          <w:p>
+            <w:pPr>
+              <w:pStyle w:val="Compact"/>
+            </w:pPr>
+            <w:r>
+              <w:t xml:space="preserve">0.812</w:t>
             </w:r>
           </w:p>
         </w:tc>
@@ -7252,7 +7369,7 @@
               <w:pStyle w:val="Compact"/>
             </w:pPr>
             <w:r>
-              <w:t xml:space="preserve">0.185</w:t>
+              <w:t xml:space="preserve">0.183</w:t>
             </w:r>
           </w:p>
         </w:tc>
@@ -7287,40 +7404,40 @@
               <w:pStyle w:val="Compact"/>
             </w:pPr>
             <w:r>
-              <w:t xml:space="preserve">0.979</w:t>
-            </w:r>
-          </w:p>
-        </w:tc>
-        <w:tc>
-          <w:tcPr/>
-          <w:p>
-            <w:pPr>
-              <w:pStyle w:val="Compact"/>
-            </w:pPr>
-            <w:r>
-              <w:t xml:space="preserve">0.758</w:t>
-            </w:r>
-          </w:p>
-        </w:tc>
-        <w:tc>
-          <w:tcPr/>
-          <w:p>
-            <w:pPr>
-              <w:pStyle w:val="Compact"/>
-            </w:pPr>
-            <w:r>
-              <w:t xml:space="preserve">[0.63–0.87]</w:t>
-            </w:r>
-          </w:p>
-        </w:tc>
-        <w:tc>
-          <w:tcPr/>
-          <w:p>
-            <w:pPr>
-              <w:pStyle w:val="Compact"/>
-            </w:pPr>
-            <w:r>
-              <w:t xml:space="preserve">0.221</w:t>
+              <w:t xml:space="preserve">0.970</w:t>
+            </w:r>
+          </w:p>
+        </w:tc>
+        <w:tc>
+          <w:tcPr/>
+          <w:p>
+            <w:pPr>
+              <w:pStyle w:val="Compact"/>
+            </w:pPr>
+            <w:r>
+              <w:t xml:space="preserve">0.788</w:t>
+            </w:r>
+          </w:p>
+        </w:tc>
+        <w:tc>
+          <w:tcPr/>
+          <w:p>
+            <w:pPr>
+              <w:pStyle w:val="Compact"/>
+            </w:pPr>
+            <w:r>
+              <w:t xml:space="preserve">[0.66–0.89]</w:t>
+            </w:r>
+          </w:p>
+        </w:tc>
+        <w:tc>
+          <w:tcPr/>
+          <w:p>
+            <w:pPr>
+              <w:pStyle w:val="Compact"/>
+            </w:pPr>
+            <w:r>
+              <w:t xml:space="preserve">0.182</w:t>
             </w:r>
           </w:p>
         </w:tc>
@@ -7355,40 +7472,40 @@
               <w:pStyle w:val="Compact"/>
             </w:pPr>
             <w:r>
-              <w:t xml:space="preserve">0.766</w:t>
-            </w:r>
-          </w:p>
-        </w:tc>
-        <w:tc>
-          <w:tcPr/>
-          <w:p>
-            <w:pPr>
-              <w:pStyle w:val="Compact"/>
-            </w:pPr>
-            <w:r>
-              <w:t xml:space="preserve">0.564</w:t>
-            </w:r>
-          </w:p>
-        </w:tc>
-        <w:tc>
-          <w:tcPr/>
-          <w:p>
-            <w:pPr>
-              <w:pStyle w:val="Compact"/>
-            </w:pPr>
-            <w:r>
-              <w:t xml:space="preserve">[0.44–0.69]</w:t>
-            </w:r>
-          </w:p>
-        </w:tc>
-        <w:tc>
-          <w:tcPr/>
-          <w:p>
-            <w:pPr>
-              <w:pStyle w:val="Compact"/>
-            </w:pPr>
-            <w:r>
-              <w:t xml:space="preserve">0.202</w:t>
+              <w:t xml:space="preserve">0.737</w:t>
+            </w:r>
+          </w:p>
+        </w:tc>
+        <w:tc>
+          <w:tcPr/>
+          <w:p>
+            <w:pPr>
+              <w:pStyle w:val="Compact"/>
+            </w:pPr>
+            <w:r>
+              <w:t xml:space="preserve">0.609</w:t>
+            </w:r>
+          </w:p>
+        </w:tc>
+        <w:tc>
+          <w:tcPr/>
+          <w:p>
+            <w:pPr>
+              <w:pStyle w:val="Compact"/>
+            </w:pPr>
+            <w:r>
+              <w:t xml:space="preserve">[0.49–0.73]</w:t>
+            </w:r>
+          </w:p>
+        </w:tc>
+        <w:tc>
+          <w:tcPr/>
+          <w:p>
+            <w:pPr>
+              <w:pStyle w:val="Compact"/>
+            </w:pPr>
+            <w:r>
+              <w:t xml:space="preserve">0.128</w:t>
             </w:r>
           </w:p>
         </w:tc>
@@ -7423,40 +7540,40 @@
               <w:pStyle w:val="Compact"/>
             </w:pPr>
             <w:r>
-              <w:t xml:space="preserve">0.694</w:t>
-            </w:r>
-          </w:p>
-        </w:tc>
-        <w:tc>
-          <w:tcPr/>
-          <w:p>
-            <w:pPr>
-              <w:pStyle w:val="Compact"/>
-            </w:pPr>
-            <w:r>
-              <w:t xml:space="preserve">0.591</w:t>
-            </w:r>
-          </w:p>
-        </w:tc>
-        <w:tc>
-          <w:tcPr/>
-          <w:p>
-            <w:pPr>
-              <w:pStyle w:val="Compact"/>
-            </w:pPr>
-            <w:r>
-              <w:t xml:space="preserve">[0.47–0.71]</w:t>
-            </w:r>
-          </w:p>
-        </w:tc>
-        <w:tc>
-          <w:tcPr/>
-          <w:p>
-            <w:pPr>
-              <w:pStyle w:val="Compact"/>
-            </w:pPr>
-            <w:r>
-              <w:t xml:space="preserve">0.103</w:t>
+              <w:t xml:space="preserve">0.611</w:t>
+            </w:r>
+          </w:p>
+        </w:tc>
+        <w:tc>
+          <w:tcPr/>
+          <w:p>
+            <w:pPr>
+              <w:pStyle w:val="Compact"/>
+            </w:pPr>
+            <w:r>
+              <w:t xml:space="preserve">0.525</w:t>
+            </w:r>
+          </w:p>
+        </w:tc>
+        <w:tc>
+          <w:tcPr/>
+          <w:p>
+            <w:pPr>
+              <w:pStyle w:val="Compact"/>
+            </w:pPr>
+            <w:r>
+              <w:t xml:space="preserve">[0.40–0.65]</w:t>
+            </w:r>
+          </w:p>
+        </w:tc>
+        <w:tc>
+          <w:tcPr/>
+          <w:p>
+            <w:pPr>
+              <w:pStyle w:val="Compact"/>
+            </w:pPr>
+            <w:r>
+              <w:t xml:space="preserve">0.086</w:t>
             </w:r>
           </w:p>
         </w:tc>
@@ -7503,7 +7620,7 @@
                 <w:b/>
                 <w:bCs/>
               </w:rPr>
-              <w:t xml:space="preserve">0.816</w:t>
+              <w:t xml:space="preserve">0.822</w:t>
             </w:r>
           </w:p>
         </w:tc>
@@ -7518,7 +7635,7 @@
                 <w:b/>
                 <w:bCs/>
               </w:rPr>
-              <w:t xml:space="preserve">0.640</w:t>
+              <w:t xml:space="preserve">0.652</w:t>
             </w:r>
           </w:p>
         </w:tc>
@@ -7544,7 +7661,7 @@
                 <w:b/>
                 <w:bCs/>
               </w:rPr>
-              <w:t xml:space="preserve">0.176</w:t>
+              <w:t xml:space="preserve">0.170</w:t>
             </w:r>
           </w:p>
         </w:tc>
@@ -7591,7 +7708,7 @@
                 <w:b/>
                 <w:bCs/>
               </w:rPr>
-              <w:t xml:space="preserve">0.793</w:t>
+              <w:t xml:space="preserve">0.774</w:t>
             </w:r>
           </w:p>
         </w:tc>
@@ -7606,7 +7723,7 @@
                 <w:b/>
                 <w:bCs/>
               </w:rPr>
-              <w:t xml:space="preserve">0.647</w:t>
+              <w:t xml:space="preserve">0.641</w:t>
             </w:r>
           </w:p>
         </w:tc>
@@ -7632,7 +7749,7 @@
                 <w:b/>
                 <w:bCs/>
               </w:rPr>
-              <w:t xml:space="preserve">0.146</w:t>
+              <w:t xml:space="preserve">0.133</w:t>
             </w:r>
           </w:p>
         </w:tc>
@@ -7643,7 +7760,23 @@
         <w:pStyle w:val="BodyText"/>
       </w:pPr>
       <w:r>
-        <w:t xml:space="preserve">Paired-bootstrap significance for the AUC drop (Section 2.5.2; Supplementary Table S10) matches the pattern above: significant for Ling 2020 and Zhu 2022 (both models) and Kazakhstan LogReg; not significant for Zhuang 2018 (both models) or Kazakhstan LGBM.</w:t>
+        <w:t xml:space="preserve">Paired-bootstrap significance for the AUC drop (Section 2.5.2; Supplementary Table S10) gives</w:t>
+      </w:r>
+      <w:r>
+        <w:t xml:space="preserve"> </w:t>
+      </w:r>
+      <w:r>
+        <w:rPr>
+          <w:b/>
+          <w:bCs/>
+        </w:rPr>
+        <w:t xml:space="preserve">4 of 8</w:t>
+      </w:r>
+      <w:r>
+        <w:t xml:space="preserve"> </w:t>
+      </w:r>
+      <w:r>
+        <w:t xml:space="preserve">cohort–model pairs a 95% CI excluding zero (Ling 2020 and Zhu 2022, both models). The common-universe reference analysis gives five of eight, differing only in Kazakhstan LogReg: its delta excludes zero under the common-universe schema (0.201, 95% CI [0.04, 0.36]) but not under training-only selection (0.128, 95% CI [−0.03, 0.28]); full per-pair numbers in Table S10.</w:t>
       </w:r>
     </w:p>
     <w:p>
@@ -7661,7 +7794,7 @@
         <w:t xml:space="preserve"> </w:t>
       </w:r>
       <w:r>
-        <w:t xml:space="preserve">Mean LOCO AUC across four cohorts, by correction design and model.</w:t>
+        <w:t xml:space="preserve">Mean LOCO AUC across four cohorts, by correction design and model (fixed common-universe schema throughout; not the Table 2/3 training-only primary pipeline).</w:t>
       </w:r>
     </w:p>
     <w:tbl>
@@ -8133,7 +8266,7 @@
         <w:t xml:space="preserve">A</w:t>
       </w:r>
       <w:r>
-        <w:t xml:space="preserve">) Overview of the five 16S rRNA amplicon sequencing cohorts assembled for this study, including country of origin, sample size, sequencing mode, 16S variable region, diagnosis label availability, and analytic phases in which each cohort participates. (</w:t>
+        <w:t xml:space="preserve">) Overview of the five 16S rRNA amplicon sequencing cohorts assembled for this study: four with per-sample diagnosis labels supporting supervised classification (Phases 2–3, 5–6) and a fifth (Kim/KBASE 2022) contributing only to unsupervised compositional analysis (Phase 4). Columns give country of origin, sample size, sequencing mode, 16S variable region, diagnosis label availability, and analytic phases in which each cohort participates. (</w:t>
       </w:r>
       <w:r>
         <w:rPr>
@@ -8143,7 +8276,7 @@
         <w:t xml:space="preserve">B</w:t>
       </w:r>
       <w:r>
-        <w:t xml:space="preserve">) Summary of the six-phase analysis pipeline, from DADA2 processing through SHAP feature-importance and logistic-regression coefficient-stability analyses.</w:t>
+        <w:t xml:space="preserve">) Summary of the six-phase analysis pipeline, from DADA2 processing through SHAP feature-importance and logistic-regression coefficient-stability analyses. Phases 2–3 (within-cohort baseline and cross-cohort generalization) use strict training-only genus selection, re-derived independently within every split, as the primary classifier-performance pipeline (Section 2.5.1); Phases 4–6 use the fixed common 396-genus universe (Section 2.2), which those specific analyses require as a single, shared feature space across cohorts.</w:t>
       </w:r>
     </w:p>
     <w:p>
@@ -8161,7 +8294,7 @@
         <w:t xml:space="preserve"> </w:t>
       </w:r>
       <w:r>
-        <w:t xml:space="preserve">Within-cohort classification performance under nested cross-validation (10-fold outer / 5-fold inner CV). Bars show out-of-fold AUC-ROC; error bars represent 95% CIs from the diagnosis-stratified, participant-level bootstrap (10,000 replicates; Section 2.5.2), matching Table 2. Dashed line = chance (AUC = 0.50). LogReg = L2-regularized logistic regression; LGBM = LightGBM.</w:t>
+        <w:t xml:space="preserve">Within-cohort classification performance under nested cross-validation (10-fold outer / 5-fold inner CV), using strict training-only genus selection as the primary classifier-performance pipeline (Section 2.5.1). Bars show out-of-fold AUC-ROC; error bars represent 95% CIs from the diagnosis-stratified, participant-level bootstrap (10,000 replicates; Section 2.5.2), matching Table 2. Dashed line = chance (AUC = 0.50). LogReg = L2-regularized logistic regression; LGBM = LightGBM. Matched values under the fixed common-universe (396-genus) schema are given in Supplementary Table S4.</w:t>
       </w:r>
     </w:p>
     <w:p>
@@ -8179,7 +8312,7 @@
         <w:t xml:space="preserve"> </w:t>
       </w:r>
       <w:r>
-        <w:t xml:space="preserve">Cross-cohort generalization failure. (</w:t>
+        <w:t xml:space="preserve">Cross-cohort generalization limitations, using strict training-only genus selection as the primary classifier-performance pipeline (Section 2.5.1). (</w:t>
       </w:r>
       <w:r>
         <w:rPr>
@@ -8212,7 +8345,7 @@
         <w:t xml:space="preserve">C</w:t>
       </w:r>
       <w:r>
-        <w:t xml:space="preserve">) Pairwise single-cohort-train / single-cohort-test AUC heatmaps for logistic regression and LightGBM respectively. Diagonal (within-cohort) values are omitted; colour scale: red = lower AUC, green = higher AUC.</w:t>
+        <w:t xml:space="preserve">) Pairwise single-cohort-train / single-cohort-test AUC heatmaps for logistic regression and LightGBM respectively. Diagonal (within-cohort) values are omitted; colour scale: red = lower AUC, green = higher AUC. Matched values under the fixed common-universe (396-genus) schema are given in Supplementary Table S1; one cell (Kazakhstan→Ling 2020, LightGBM) differs materially between the two pipelines (0.58 vs. 0.44) and is discussed in Section 3.3.</w:t>
       </w:r>
     </w:p>
     <w:p>

</xml_diff>

<commit_message>
Finalize Reviewer 5 submission wording
</commit_message>
<xml_diff>
--- a/manuscript/draft.docx
+++ b/manuscript/draft.docx
@@ -156,7 +156,7 @@
         <w:pStyle w:val="FirstParagraph"/>
       </w:pPr>
       <w:r>
-        <w:t xml:space="preserve">Gut microbiome dysbiosis has been proposed as an Alzheimer’s disease (AD) biomarker, but the transportability of microbiome classifiers across independent cohorts remains uncertain. We reprocessed five public 16S rRNA cohorts (509 samples; China, Kazakhstan, South Korea) with a common DADA2/genus-level pipeline and evaluated logistic regression and LightGBM classifiers using nested within-cohort cross-validation, leave-one-cohort-out (LOCO) transfer, pairwise transfer, PERMANOVA, batch adjustment, and out-of-fold SHAP analyses. Within four labeled cohorts, using strict training-only genus selection as the primary classifier-performance pipeline (Section 2.5.1), within-cohort AUC-ROC ranged from 0.611 to 0.996. The near-perfect Zhu 2022 result was stable across 50 repeated nested-CV partitions and exceeded a 1,000-permutation label null (p=0.000999), though a technical-metadata confound cannot be excluded (Section 4.3). In LOCO evaluation, AUC ranged from 0.506 to 0.812 (mean decreases of 0.170 logistic regression, 0.133 LightGBM); paired bootstrap intervals excluded zero for four of eight cohort-model differences. This pipeline agreed closely with a fixed common-universe reference retained for secondary analyses (max |Δ|=0.066), though one pairwise-transfer cell changed materially (Kazakhstan→Ling 2020, LightGBM: 0.58→0.44), reported without smoothing. In the four-cohort marginal PERMANOVA model, cohort-associated compositional variation exceeded diagnosis-associated variation (R²=0.172 vs. 0.014), decreasing to 0.059 vs. 0.023 when restricted to three more technically comparable Chinese paired-end MiSeq cohorts; dispersion differed significantly among cohorts. Label-blind transductive ComBat-seq and MMUPHin adjustment changed mean LOCO AUC by at most 0.007 and did not recover transferability. Cross-cohort overlap of top predictive taxa was low: logistic-regression overlap remained above a prevalence-restricted null, LightGBM did not. A descriptive coefficient-stability screen identified eight logistic-regression genera with opposite, stable fitted-coefficient directions across cohorts. These findings demonstrate substantial, heterogeneous cross-cohort generalization limitations among the evaluated public 16S datasets, and show the two tested batch-adjustment methods did not restore transferability. Prospective validation in larger, geographically and technically diverse cohorts is needed before microbiome-based AD classifiers can be considered clinically actionable.</w:t>
+        <w:t xml:space="preserve">Gut microbiome dysbiosis has been proposed as an Alzheimer’s disease (AD) biomarker, but the transportability of microbiome classifiers across independent cohorts remains uncertain. We reprocessed five public 16S rRNA cohorts (509 samples; China, Kazakhstan, South Korea) with a common DADA2/genus-level pipeline and evaluated logistic regression and LightGBM classifiers using nested within-cohort cross-validation, leave-one-cohort-out (LOCO) transfer, pairwise transfer, PERMANOVA, batch adjustment, and out-of-fold SHAP analyses. Within four labeled cohorts, using strict training-only genus selection as the primary classifier-performance pipeline (Section 2.5.1), within-cohort AUC-ROC ranged from 0.611 to 0.996. The near-perfect Zhu 2022 result was stable across 50 repeated nested-CV partitions and exceeded a 1,000-permutation label null (p=0.000999), though a technical-metadata confound cannot be excluded (Section 4.3). In LOCO evaluation, AUC ranged from 0.506 to 0.812 (mean decreases of 0.170 logistic regression, 0.133 LightGBM); paired bootstrap intervals excluded zero for four of eight cohort-model differences. LOCO estimates agreed closely with a fixed common-universe reference retained for secondary analyses (max |Δ|=0.066), though one pairwise-transfer cell changed materially (Kazakhstan→Ling 2020, LightGBM: 0.58→0.44), reported without smoothing. In the four-cohort marginal PERMANOVA model, cohort-associated compositional variation exceeded diagnosis-associated variation (R²=0.172 vs. 0.014), decreasing to 0.059 vs. 0.023 when restricted to three more technically comparable Chinese paired-end MiSeq cohorts; dispersion differed significantly among cohorts. Label-blind transductive ComBat-seq and MMUPHin adjustment changed mean LOCO AUC by at most 0.007 and did not recover transferability. Cross-cohort overlap of top predictive taxa was low: logistic-regression overlap remained above a prevalence-restricted null, LightGBM did not. A descriptive coefficient-stability screen identified eight logistic-regression genera with opposite, stable fitted-coefficient directions across cohorts. These findings demonstrate substantial, heterogeneous cross-cohort generalization limitations among the evaluated public 16S datasets, and show that, under the tested label-blind transductive design, the two batch-adjustment methods did not restore transferability. Prospective validation in larger, geographically and technically diverse cohorts is needed before microbiome-based AD classifiers can be considered clinically actionable.</w:t>
       </w:r>
     </w:p>
     <w:p>
@@ -4417,7 +4417,7 @@
         <w:pStyle w:val="FirstParagraph"/>
       </w:pPr>
       <w:r>
-        <w:t xml:space="preserve">We conducted a systematic cross-cohort generalization evaluation of gut microbiome-based Alzheimer’s disease classifiers spanning four labeled cohorts, with a fifth (Kim/KBASE 2022) contributing only to unsupervised compositional analyses. Using strict training-only genus selection as the primary classifier-performance pipeline (Section 2.5.1), within-cohort classifiers achieved AUC-ROC of 0.611–0.996; the near-perfect Zhu 2022 result withstood fold-stability and label-permutation checks, though a technical-metadata confound cannot be excluded (Section 4.3). LOCO AUC fell to 0.506–0.812 (mean drop 0.170 logistic regression, 0.133 LightGBM), formally supported for four of eight cohort–model pairs (Section 3.3), and was closely consistent with a fixed common-universe reference retained for secondary analyses, with one pairwise-transfer exception disclosed rather than smoothed over (Kazakhstan→Ling 2020, LightGBM: 0.58→0.44). Batch correction under a label-blind design left mean LOCO AUC essentially unchanged (within 0.007 AUC) without recovering transferability; an exploratory label-informed design, which cannot estimate prospective performance, produced large, cohort-specific degradation attributable substantially to the design itself. PERMANOVA showed cohort identity explained substantially more compositional variance than disease status (marginal R²: 0.172 vs. 0.014, ~12-fold), falling to ~2.6-fold restricted to three more technically comparable cohorts — not decomposable into technical and biological sources, and not by itself explaining the batch-correction results. A cohort-identity classifier achieved macro-AUC=0.9917, and generalization failure persisted across all cohort-exclusion sensitivity configurations. SHAP analysis found low cross-cohort taxon overlap (mean Jaccard 0.135 logistic regression, 0.058 LightGBM), significant for logistic regression under both null models but for LightGBM only under the less conservative one — a reversal reported as such. A pre-specified coefficient-sign-stability screen identified eight logistic-regression genera with opposite, stable direction across cohorts; no comparable screen applies to LightGBM. These findings demonstrate substantial cross-cohort generalization limitations among the evaluated 16S datasets, and that the two batch-correction methods tested under label-blind design did not recover transferability. Multi-cohort harmonized and prospective cross-cohort validation studies are needed before microbiome-based AD biomarkers can achieve clinical utility.</w:t>
+        <w:t xml:space="preserve">We conducted a systematic cross-cohort generalization evaluation of gut microbiome-based Alzheimer’s disease classifiers spanning four labeled cohorts, with a fifth (Kim/KBASE 2022) contributing only to unsupervised compositional analyses. Using strict training-only genus selection as the primary classifier-performance pipeline (Section 2.5.1), within-cohort classifiers achieved AUC-ROC of 0.611–0.996; the near-perfect Zhu 2022 result withstood fold-stability and label-permutation checks, though a technical-metadata confound cannot be excluded (Section 4.3). LOCO AUC fell to 0.506–0.812 (mean drop 0.170 logistic regression, 0.133 LightGBM), formally supported for four of eight cohort–model pairs (Section 3.3), and was closely consistent with a fixed common-universe reference retained for secondary analyses, with one pairwise-transfer exception disclosed rather than smoothed over (Kazakhstan→Ling 2020, LightGBM: 0.58→0.44). Batch correction under a label-blind design left mean LOCO AUC essentially unchanged (within 0.007 AUC) without recovering transferability; an exploratory label-informed design, which cannot estimate prospective performance, produced large, cohort-specific degradation attributable substantially to the design itself. PERMANOVA showed cohort identity explained substantially more compositional variance than disease status (marginal R²: 0.172 vs. 0.014, ~12-fold), falling to ~2.6-fold restricted to three more technically comparable cohorts — not decomposable into technical and biological sources, and not by itself explaining the batch-correction results. A cohort-identity classifier achieved macro-AUC=0.9917, and generalization failure persisted across all cohort-exclusion sensitivity configurations. SHAP analysis found low cross-cohort taxon overlap (mean Jaccard 0.135 logistic regression, 0.058 LightGBM), significant for logistic regression under both null models but for LightGBM only under the less conservative one — a reversal reported as such. A pre-specified coefficient-sign-stability screen identified eight logistic-regression genera with opposite, stable direction across cohorts; no comparable screen applies to LightGBM. These findings demonstrate substantial cross-cohort generalization limitations among the evaluated 16S datasets, and that the two batch-correction methods tested under the label-blind transductive design did not recover transferability. Multi-cohort harmonized and prospective cross-cohort validation studies are needed before microbiome-based AD biomarkers can achieve clinical utility.</w:t>
       </w:r>
     </w:p>
     <w:p>

</xml_diff>